<commit_message>
Ajustes en los documentos de manual tanto de usuario como de desarrollador
</commit_message>
<xml_diff>
--- a/docs/capitulos_tt2/13_anexo_b_manual_tecnico.docx
+++ b/docs/capitulos_tt2/13_anexo_b_manual_tecnico.docx
@@ -1,21 +1,21 @@
 
 <file path=word/document.xml><?xml version="1.0" encoding="utf-8"?>
-<w:document xmlns:w="http://schemas.openxmlformats.org/wordprocessingml/2006/main" xmlns:r="http://schemas.openxmlformats.org/officeDocument/2006/relationships">
+<w:document xmlns:wpc="http://schemas.microsoft.com/office/word/2010/wordprocessingCanvas" xmlns:cx="http://schemas.microsoft.com/office/drawing/2014/chartex" xmlns:cx1="http://schemas.microsoft.com/office/drawing/2015/9/8/chartex" xmlns:cx2="http://schemas.microsoft.com/office/drawing/2015/10/21/chartex" xmlns:cx3="http://schemas.microsoft.com/office/drawing/2016/5/9/chartex" xmlns:cx4="http://schemas.microsoft.com/office/drawing/2016/5/10/chartex" xmlns:cx5="http://schemas.microsoft.com/office/drawing/2016/5/11/chartex" xmlns:cx6="http://schemas.microsoft.com/office/drawing/2016/5/12/chartex" xmlns:cx7="http://schemas.microsoft.com/office/drawing/2016/5/13/chartex" xmlns:cx8="http://schemas.microsoft.com/office/drawing/2016/5/14/chartex" xmlns:mc="http://schemas.openxmlformats.org/markup-compatibility/2006" xmlns:aink="http://schemas.microsoft.com/office/drawing/2016/ink" xmlns:am3d="http://schemas.microsoft.com/office/drawing/2017/model3d" xmlns:o="urn:schemas-microsoft-com:office:office" xmlns:oel="http://schemas.microsoft.com/office/2019/extlst" xmlns:r="http://schemas.openxmlformats.org/officeDocument/2006/relationships" xmlns:m="http://schemas.openxmlformats.org/officeDocument/2006/math" xmlns:v="urn:schemas-microsoft-com:vml" xmlns:wp14="http://schemas.microsoft.com/office/word/2010/wordprocessingDrawing" xmlns:wp="http://schemas.openxmlformats.org/drawingml/2006/wordprocessingDrawing" xmlns:w10="urn:schemas-microsoft-com:office:word" xmlns:w="http://schemas.openxmlformats.org/wordprocessingml/2006/main" xmlns:w14="http://schemas.microsoft.com/office/word/2010/wordml" xmlns:w15="http://schemas.microsoft.com/office/word/2012/wordml" xmlns:w16cex="http://schemas.microsoft.com/office/word/2018/wordml/cex" xmlns:w16cid="http://schemas.microsoft.com/office/word/2016/wordml/cid" xmlns:w16="http://schemas.microsoft.com/office/word/2018/wordml" xmlns:w16du="http://schemas.microsoft.com/office/word/2023/wordml/word16du" xmlns:w16sdtdh="http://schemas.microsoft.com/office/word/2020/wordml/sdtdatahash" xmlns:w16sdtfl="http://schemas.microsoft.com/office/word/2024/wordml/sdtformatlock" xmlns:w16se="http://schemas.microsoft.com/office/word/2015/wordml/symex" xmlns:wpg="http://schemas.microsoft.com/office/word/2010/wordprocessingGroup" xmlns:wpi="http://schemas.microsoft.com/office/word/2010/wordprocessingInk" xmlns:wne="http://schemas.microsoft.com/office/word/2006/wordml" xmlns:wps="http://schemas.microsoft.com/office/word/2010/wordprocessingShape" mc:Ignorable="w14 w15 w16se w16cid w16 w16cex w16sdtdh w16sdtfl w16du wp14">
   <w:body>
     <w:p>
       <w:pPr>
         <w:pStyle w:val="Heading1"/>
       </w:pPr>
       <w:r>
-        <w:t xml:space="preserve">Anexo B. Manual técnico</w:t>
-      </w:r>
-    </w:p>
-    <w:p>
-      <w:pPr>
-        <w:jc w:val="both"/>
-      </w:pPr>
-      <w:r>
-        <w:t xml:space="preserve">Este manual es para quien tenga que instalar, configurar, actualizar o dar mantenimiento a marIA: los dos autores, los profesores que lo revisen o la persona que lo lleve a un servidor. Complementa al capítulo 7, que explica cómo está organizado el código, y al capítulo 9, que habla del despliegue; aquí se concentran los comandos y la configuración que hacen falta para tener el sistema funcionando.</w:t>
+        <w:t>Anexo B. Manual técnico</w:t>
+      </w:r>
+    </w:p>
+    <w:p>
+      <w:pPr>
+        <w:jc w:val="both"/>
+      </w:pPr>
+      <w:r>
+        <w:t>Este manual es para quien tenga que instalar, configurar, actualizar o dar mantenimiento a marIA: los dos autores, los profesores que lo revisen o la persona que lo lleve a un servidor. Complementa al capítulo 7, que explica cómo está organizado el código, y al capítulo 9, que habla del despliegue; aquí se concentran los comandos y la configuración que hacen falta para tener el sistema funcionando.</w:t>
       </w:r>
     </w:p>
     <w:p>
@@ -23,15 +23,15 @@
         <w:pStyle w:val="Heading2"/>
       </w:pPr>
       <w:r>
-        <w:t xml:space="preserve">B.1 Requisitos</w:t>
-      </w:r>
-    </w:p>
-    <w:p>
-      <w:pPr>
-        <w:jc w:val="both"/>
-      </w:pPr>
-      <w:r>
-        <w:t xml:space="preserve">El sistema está hecho con Django, así que necesita Python 3.12 o posterior y la herramienta pip para instalar sus bibliotecas. Con eso basta para ejecutarlo en una computadora, porque por defecto usa una base de datos SQLite que no requiere instalar nada. Para trabajar con más datos o para publicarlo se recomienda PostgreSQL, que el sistema usa en cuanto se le indica una base de datos en el archivo de configuración. Para usar al asistente hacen falta una llave de la API de Google (Gemini), una de OpenAI (ChatGPT) o ambas; sin ninguna, todo lo demás funciona y solo el chat y las explicaciones avisan que no están disponibles. En el navegador del usuario, Chrome o Edge permiten el dictado por voz; el resto del sistema funciona en los navegadores modernos.</w:t>
+        <w:t>B.1 Requisitos</w:t>
+      </w:r>
+    </w:p>
+    <w:p>
+      <w:pPr>
+        <w:jc w:val="both"/>
+      </w:pPr>
+      <w:r>
+        <w:t>El sistema está hecho con Django, así que necesita Python 3.12 o posterior y la herramienta pip para instalar sus bibliotecas. Con eso basta para ejecutarlo en una computadora, porque por defecto usa una base de datos SQLite que no requiere instalar nada. Para trabajar con más datos o para publicarlo se recomienda PostgreSQL, que el sistema usa en cuanto se le indica una base de datos en el archivo de configuración. Para usar al asistente hacen falta una llave de la API de Google (Gemini), una de OpenAI (ChatGPT) o ambas; sin ninguna, todo lo demás funciona y solo el chat y las explicaciones avisan que no están disponibles. En el navegador del usuario, Chrome o Edge permiten el dictado por voz; el resto del sistema funciona en los navegadores modernos.</w:t>
       </w:r>
     </w:p>
     <w:p>
@@ -45,7 +45,7 @@
         <w:rPr>
           <w:rFonts w:ascii="Consolas" w:hAnsi="Consolas" w:cs="Consolas"/>
         </w:rPr>
-        <w:t xml:space="preserve">requirements.txt</w:t>
+        <w:t>requirements.txt</w:t>
       </w:r>
       <w:r>
         <w:t xml:space="preserve">: Django (de la versión 5.1 a la 5.x), las bibliotecas de OpenAI y de Google para el asistente, </w:t>
@@ -54,7 +54,7 @@
         <w:rPr>
           <w:rFonts w:ascii="Consolas" w:hAnsi="Consolas" w:cs="Consolas"/>
         </w:rPr>
-        <w:t xml:space="preserve">python-dotenv</w:t>
+        <w:t>python-dotenv</w:t>
       </w:r>
       <w:r>
         <w:t xml:space="preserve"> para leer el archivo de configuración, </w:t>
@@ -63,7 +63,7 @@
         <w:rPr>
           <w:rFonts w:ascii="Consolas" w:hAnsi="Consolas" w:cs="Consolas"/>
         </w:rPr>
-        <w:t xml:space="preserve">psycopg</w:t>
+        <w:t>psycopg</w:t>
       </w:r>
       <w:r>
         <w:t xml:space="preserve"> como controlador de PostgreSQL, </w:t>
@@ -72,7 +72,7 @@
         <w:rPr>
           <w:rFonts w:ascii="Consolas" w:hAnsi="Consolas" w:cs="Consolas"/>
         </w:rPr>
-        <w:t xml:space="preserve">statsmodels</w:t>
+        <w:t>statsmodels</w:t>
       </w:r>
       <w:r>
         <w:t xml:space="preserve"> para el pronóstico de ventas y </w:t>
@@ -81,7 +81,7 @@
         <w:rPr>
           <w:rFonts w:ascii="Consolas" w:hAnsi="Consolas" w:cs="Consolas"/>
         </w:rPr>
-        <w:t xml:space="preserve">cryptography</w:t>
+        <w:t>cryptography</w:t>
       </w:r>
       <w:r>
         <w:t xml:space="preserve"> para cifrar las llaves de las APIs.</w:t>
@@ -92,20 +92,20 @@
         <w:pStyle w:val="Heading2"/>
       </w:pPr>
       <w:r>
-        <w:t xml:space="preserve">B.2 Instalación en una computadora nueva</w:t>
-      </w:r>
-    </w:p>
-    <w:p>
-      <w:pPr>
-        <w:jc w:val="both"/>
-      </w:pPr>
-      <w:r>
-        <w:t xml:space="preserve">Todos los comandos se ejecutan desde la carpeta del proyecto. En Windows quedan así.</w:t>
-      </w:r>
-    </w:p>
-    <w:p>
-      <w:pPr>
-        <w:spacing w:before="0" w:after="0" w:line="240" w:lineRule="auto"/>
+        <w:t>B.2 Instalación en una computadora nueva</w:t>
+      </w:r>
+    </w:p>
+    <w:p>
+      <w:pPr>
+        <w:jc w:val="both"/>
+      </w:pPr>
+      <w:r>
+        <w:t>Todos los comandos se ejecutan desde la carpeta del proyecto. En Windows quedan así.</w:t>
+      </w:r>
+    </w:p>
+    <w:p>
+      <w:pPr>
+        <w:spacing w:after="0" w:line="240" w:lineRule="auto"/>
         <w:ind w:left="284"/>
       </w:pPr>
       <w:r>
@@ -114,96 +114,106 @@
           <w:sz w:val="20"/>
           <w:szCs w:val="20"/>
         </w:rPr>
-        <w:t xml:space="preserve">python -m venv venv</w:t>
-      </w:r>
-    </w:p>
-    <w:p>
-      <w:pPr>
-        <w:spacing w:before="0" w:after="0" w:line="240" w:lineRule="auto"/>
+        <w:t>python -m venv venv</w:t>
+      </w:r>
+    </w:p>
+    <w:p>
+      <w:pPr>
+        <w:spacing w:after="0" w:line="240" w:lineRule="auto"/>
         <w:ind w:left="284"/>
+        <w:rPr>
+          <w:lang w:val="en-US"/>
+        </w:rPr>
       </w:pPr>
       <w:r>
         <w:rPr>
           <w:rFonts w:ascii="Consolas" w:hAnsi="Consolas" w:cs="Consolas"/>
           <w:sz w:val="20"/>
           <w:szCs w:val="20"/>
-        </w:rPr>
-        <w:t xml:space="preserve">venv\Scripts\activate</w:t>
-      </w:r>
-    </w:p>
-    <w:p>
-      <w:pPr>
-        <w:spacing w:before="0" w:after="0" w:line="240" w:lineRule="auto"/>
+          <w:lang w:val="en-US"/>
+        </w:rPr>
+        <w:t>venv\Scripts\activate</w:t>
+      </w:r>
+    </w:p>
+    <w:p>
+      <w:pPr>
+        <w:spacing w:after="0" w:line="240" w:lineRule="auto"/>
         <w:ind w:left="284"/>
+        <w:rPr>
+          <w:lang w:val="en-US"/>
+        </w:rPr>
       </w:pPr>
       <w:r>
         <w:rPr>
           <w:rFonts w:ascii="Consolas" w:hAnsi="Consolas" w:cs="Consolas"/>
           <w:sz w:val="20"/>
           <w:szCs w:val="20"/>
-        </w:rPr>
-        <w:t xml:space="preserve">python -m pip install -r requirements.txt</w:t>
-      </w:r>
-    </w:p>
-    <w:p>
-      <w:pPr>
-        <w:spacing w:before="0" w:after="0" w:line="240" w:lineRule="auto"/>
+          <w:lang w:val="en-US"/>
+        </w:rPr>
+        <w:t>python -m pip install -r requirements.txt</w:t>
+      </w:r>
+    </w:p>
+    <w:p>
+      <w:pPr>
+        <w:spacing w:after="0" w:line="240" w:lineRule="auto"/>
         <w:ind w:left="284"/>
-      </w:pPr>
+        <w:rPr>
+          <w:lang w:val="en-US"/>
+        </w:rPr>
+      </w:pPr>
+      <w:proofErr w:type="gramStart"/>
       <w:r>
         <w:rPr>
           <w:rFonts w:ascii="Consolas" w:hAnsi="Consolas" w:cs="Consolas"/>
           <w:sz w:val="20"/>
           <w:szCs w:val="20"/>
-        </w:rPr>
-        <w:t xml:space="preserve">copy .env.example .env</w:t>
-      </w:r>
-    </w:p>
-    <w:p>
-      <w:pPr>
-        <w:spacing w:before="0" w:after="0" w:line="240" w:lineRule="auto"/>
-        <w:ind w:left="284"/>
-      </w:pPr>
+          <w:lang w:val="en-US"/>
+        </w:rPr>
+        <w:t>copy .env</w:t>
+      </w:r>
+      <w:proofErr w:type="gramEnd"/>
       <w:r>
         <w:rPr>
           <w:rFonts w:ascii="Consolas" w:hAnsi="Consolas" w:cs="Consolas"/>
           <w:sz w:val="20"/>
           <w:szCs w:val="20"/>
-        </w:rPr>
-        <w:t xml:space="preserve">python manage.py migrate</w:t>
-      </w:r>
-    </w:p>
-    <w:p>
-      <w:pPr>
-        <w:spacing w:before="0" w:after="0" w:line="240" w:lineRule="auto"/>
-        <w:ind w:left="284"/>
-      </w:pPr>
+          <w:lang w:val="en-US"/>
+        </w:rPr>
+        <w:t>.</w:t>
+      </w:r>
+      <w:proofErr w:type="gramStart"/>
       <w:r>
         <w:rPr>
           <w:rFonts w:ascii="Consolas" w:hAnsi="Consolas" w:cs="Consolas"/>
           <w:sz w:val="20"/>
           <w:szCs w:val="20"/>
-        </w:rPr>
-        <w:t xml:space="preserve">python manage.py configurar_ia</w:t>
-      </w:r>
-    </w:p>
-    <w:p>
-      <w:pPr>
-        <w:spacing w:before="0" w:after="0" w:line="240" w:lineRule="auto"/>
+          <w:lang w:val="en-US"/>
+        </w:rPr>
+        <w:t>example .env</w:t>
+      </w:r>
+      <w:proofErr w:type="gramEnd"/>
+    </w:p>
+    <w:p>
+      <w:pPr>
+        <w:spacing w:after="0" w:line="240" w:lineRule="auto"/>
         <w:ind w:left="284"/>
+        <w:rPr>
+          <w:lang w:val="en-US"/>
+        </w:rPr>
       </w:pPr>
       <w:r>
         <w:rPr>
           <w:rFonts w:ascii="Consolas" w:hAnsi="Consolas" w:cs="Consolas"/>
           <w:sz w:val="20"/>
           <w:szCs w:val="20"/>
-        </w:rPr>
-        <w:t xml:space="preserve">python manage.py seed_catalogo --negocios</w:t>
-      </w:r>
-    </w:p>
-    <w:p>
-      <w:pPr>
-        <w:spacing w:before="0" w:after="0" w:line="240" w:lineRule="auto"/>
+          <w:lang w:val="en-US"/>
+        </w:rPr>
+        <w:t>python manage.py migrate</w:t>
+      </w:r>
+    </w:p>
+    <w:p>
+      <w:pPr>
+        <w:spacing w:after="0" w:line="240" w:lineRule="auto"/>
         <w:ind w:left="284"/>
       </w:pPr>
       <w:r>
@@ -212,141 +222,12 @@
           <w:sz w:val="20"/>
           <w:szCs w:val="20"/>
         </w:rPr>
-        <w:t xml:space="preserve">python manage.py runserver</w:t>
-      </w:r>
-    </w:p>
-    <w:p>
-      <w:pPr>
-        <w:spacing w:after="60"/>
-      </w:pPr>
-    </w:p>
-    <w:p>
-      <w:pPr>
-        <w:jc w:val="both"/>
-      </w:pPr>
-      <w:r>
-        <w:t xml:space="preserve">El primer comando crea un entorno virtual, para que las bibliotecas del proyecto no se mezclen con las de otros programas, y el segundo lo activa. Conviene usar siempre </w:t>
-      </w:r>
-      <w:r>
-        <w:rPr>
-          <w:rFonts w:ascii="Consolas" w:hAnsi="Consolas" w:cs="Consolas"/>
-        </w:rPr>
-        <w:t xml:space="preserve">python -m pip</w:t>
-      </w:r>
-      <w:r>
-        <w:t xml:space="preserve"> en lugar de </w:t>
-      </w:r>
-      <w:r>
-        <w:rPr>
-          <w:rFonts w:ascii="Consolas" w:hAnsi="Consolas" w:cs="Consolas"/>
-        </w:rPr>
-        <w:t xml:space="preserve">pip</w:t>
-      </w:r>
-      <w:r>
-        <w:t xml:space="preserve"> a secas, porque si hay más de un Python instalado un </w:t>
-      </w:r>
-      <w:r>
-        <w:rPr>
-          <w:rFonts w:ascii="Consolas" w:hAnsi="Consolas" w:cs="Consolas"/>
-        </w:rPr>
-        <w:t xml:space="preserve">pip</w:t>
-      </w:r>
-      <w:r>
-        <w:t xml:space="preserve"> suelto puede instalar en el equivocado. El archivo </w:t>
-      </w:r>
-      <w:r>
-        <w:rPr>
-          <w:rFonts w:ascii="Consolas" w:hAnsi="Consolas" w:cs="Consolas"/>
-        </w:rPr>
-        <w:t xml:space="preserve">.env</w:t>
-      </w:r>
-      <w:r>
-        <w:t xml:space="preserve"> se crea copiando el ejemplo y es donde viven los datos propios de cada instalación (sección B.3); nunca se sube al repositorio. El comando </w:t>
-      </w:r>
-      <w:r>
-        <w:rPr>
-          <w:rFonts w:ascii="Consolas" w:hAnsi="Consolas" w:cs="Consolas"/>
-        </w:rPr>
-        <w:t xml:space="preserve">migrate</w:t>
-      </w:r>
-      <w:r>
-        <w:t xml:space="preserve"> crea las tablas, y debe ir antes de </w:t>
-      </w:r>
-      <w:r>
-        <w:rPr>
-          <w:rFonts w:ascii="Consolas" w:hAnsi="Consolas" w:cs="Consolas"/>
-        </w:rPr>
-        <w:t xml:space="preserve">configurar_ia</w:t>
-      </w:r>
-      <w:r>
-        <w:t xml:space="preserve">, que usa una de ellas. </w:t>
-      </w:r>
-      <w:r>
-        <w:rPr>
-          <w:rFonts w:ascii="Consolas" w:hAnsi="Consolas" w:cs="Consolas"/>
-        </w:rPr>
-        <w:t xml:space="preserve">seed_catalogo</w:t>
-      </w:r>
-      <w:r>
-        <w:t xml:space="preserve"> carga las categorías y el catálogo de productos que se ofrece al registrar una tienda, y con </w:t>
-      </w:r>
-      <w:r>
-        <w:rPr>
-          <w:rFonts w:ascii="Consolas" w:hAnsi="Consolas" w:cs="Consolas"/>
-        </w:rPr>
-        <w:t xml:space="preserve">--negocios</w:t>
-      </w:r>
-      <w:r>
-        <w:t xml:space="preserve"> completa las tiendas que ya existan con sus proveedores y categorías de gastos. Al final, </w:t>
-      </w:r>
-      <w:r>
-        <w:rPr>
-          <w:rFonts w:ascii="Consolas" w:hAnsi="Consolas" w:cs="Consolas"/>
-        </w:rPr>
-        <w:t xml:space="preserve">runserver</w:t>
-      </w:r>
-      <w:r>
-        <w:t xml:space="preserve"> inicia el sistema en </w:t>
-      </w:r>
-      <w:r>
-        <w:rPr>
-          <w:rFonts w:ascii="Consolas" w:hAnsi="Consolas" w:cs="Consolas"/>
-        </w:rPr>
-        <w:t xml:space="preserve">http://localhost:8000/</w:t>
-      </w:r>
-      <w:r>
-        <w:t xml:space="preserve">. No hace falta crear un administrador, porque cada tienda se registra desde la propia aplicación; para entrar al panel de administración de Django (</w:t>
-      </w:r>
-      <w:r>
-        <w:rPr>
-          <w:rFonts w:ascii="Consolas" w:hAnsi="Consolas" w:cs="Consolas"/>
-        </w:rPr>
-        <w:t xml:space="preserve">/admin/</w:t>
-      </w:r>
-      <w:r>
-        <w:t xml:space="preserve">) se puede crear uno con </w:t>
-      </w:r>
-      <w:r>
-        <w:rPr>
-          <w:rFonts w:ascii="Consolas" w:hAnsi="Consolas" w:cs="Consolas"/>
-        </w:rPr>
-        <w:t xml:space="preserve">python manage.py createsuperuser</w:t>
-      </w:r>
-      <w:r>
-        <w:t xml:space="preserve">.</w:t>
-      </w:r>
-    </w:p>
-    <w:p>
-      <w:pPr>
-        <w:jc w:val="both"/>
-      </w:pPr>
-      <w:r>
-        <w:t xml:space="preserve">Para comprobar que la instalación quedó bien se corren las pruebas automáticas, que crean una base de datos temporal y la borran al terminar.</w:t>
-      </w:r>
-    </w:p>
-    <w:p>
-      <w:pPr>
-        <w:spacing w:before="0" w:after="0" w:line="240" w:lineRule="auto"/>
+        <w:t>python manage.py configurar_ia</w:t>
+      </w:r>
+    </w:p>
+    <w:p>
+      <w:pPr>
+        <w:spacing w:after="0" w:line="240" w:lineRule="auto"/>
         <w:ind w:left="284"/>
       </w:pPr>
       <w:r>
@@ -355,7 +236,21 @@
           <w:sz w:val="20"/>
           <w:szCs w:val="20"/>
         </w:rPr>
-        <w:t xml:space="preserve">python manage.py test</w:t>
+        <w:t>python manage.py seed_catalogo --negocios</w:t>
+      </w:r>
+    </w:p>
+    <w:p>
+      <w:pPr>
+        <w:spacing w:after="0" w:line="240" w:lineRule="auto"/>
+        <w:ind w:left="284"/>
+      </w:pPr>
+      <w:r>
+        <w:rPr>
+          <w:rFonts w:ascii="Consolas" w:hAnsi="Consolas" w:cs="Consolas"/>
+          <w:sz w:val="20"/>
+          <w:szCs w:val="20"/>
+        </w:rPr>
+        <w:t>python manage.py runserver</w:t>
       </w:r>
     </w:p>
     <w:p>
@@ -368,16 +263,176 @@
         <w:jc w:val="both"/>
       </w:pPr>
       <w:r>
-        <w:t xml:space="preserve">Al momento de escribir este manual el sistema tiene 472 pruebas, que se pueden correr por aplicación indicando su nombre, por ejemplo </w:t>
-      </w:r>
-      <w:r>
-        <w:rPr>
-          <w:rFonts w:ascii="Consolas" w:hAnsi="Consolas" w:cs="Consolas"/>
-        </w:rPr>
-        <w:t xml:space="preserve">python manage.py test inventario</w:t>
-      </w:r>
-      <w:r>
-        <w:t xml:space="preserve">.</w:t>
+        <w:t xml:space="preserve">El primer comando crea un entorno virtual, para que las bibliotecas del proyecto no se mezclen con las de otros programas, y el segundo lo activa. Conviene usar siempre </w:t>
+      </w:r>
+      <w:r>
+        <w:rPr>
+          <w:rFonts w:ascii="Consolas" w:hAnsi="Consolas" w:cs="Consolas"/>
+        </w:rPr>
+        <w:t>python -m pip</w:t>
+      </w:r>
+      <w:r>
+        <w:t xml:space="preserve"> en lugar de </w:t>
+      </w:r>
+      <w:r>
+        <w:rPr>
+          <w:rFonts w:ascii="Consolas" w:hAnsi="Consolas" w:cs="Consolas"/>
+        </w:rPr>
+        <w:t>pip</w:t>
+      </w:r>
+      <w:r>
+        <w:t xml:space="preserve"> a secas, porque si hay más de un Python instalado un </w:t>
+      </w:r>
+      <w:r>
+        <w:rPr>
+          <w:rFonts w:ascii="Consolas" w:hAnsi="Consolas" w:cs="Consolas"/>
+        </w:rPr>
+        <w:t>pip</w:t>
+      </w:r>
+      <w:r>
+        <w:t xml:space="preserve"> suelto puede instalar en el equivocado. El </w:t>
+      </w:r>
+      <w:proofErr w:type="gramStart"/>
+      <w:r>
+        <w:t xml:space="preserve">archivo </w:t>
+      </w:r>
+      <w:r>
+        <w:rPr>
+          <w:rFonts w:ascii="Consolas" w:hAnsi="Consolas" w:cs="Consolas"/>
+        </w:rPr>
+        <w:t>.env</w:t>
+      </w:r>
+      <w:proofErr w:type="gramEnd"/>
+      <w:r>
+        <w:t xml:space="preserve"> se crea copiando el ejemplo y es donde viven los datos propios de cada instalación (sección B.3); nunca se sube al repositorio. El comando </w:t>
+      </w:r>
+      <w:r>
+        <w:rPr>
+          <w:rFonts w:ascii="Consolas" w:hAnsi="Consolas" w:cs="Consolas"/>
+        </w:rPr>
+        <w:t>migrate</w:t>
+      </w:r>
+      <w:r>
+        <w:t xml:space="preserve"> crea las tablas, y debe ir antes de </w:t>
+      </w:r>
+      <w:r>
+        <w:rPr>
+          <w:rFonts w:ascii="Consolas" w:hAnsi="Consolas" w:cs="Consolas"/>
+        </w:rPr>
+        <w:t>configurar_ia</w:t>
+      </w:r>
+      <w:r>
+        <w:t xml:space="preserve">, que usa una de ellas. </w:t>
+      </w:r>
+      <w:r>
+        <w:rPr>
+          <w:rFonts w:ascii="Consolas" w:hAnsi="Consolas" w:cs="Consolas"/>
+        </w:rPr>
+        <w:t>seed_catalogo</w:t>
+      </w:r>
+      <w:r>
+        <w:t xml:space="preserve"> carga las categorías y el catálogo de productos que se ofrece al registrar una tienda, y con </w:t>
+      </w:r>
+      <w:r>
+        <w:rPr>
+          <w:rFonts w:ascii="Consolas" w:hAnsi="Consolas" w:cs="Consolas"/>
+        </w:rPr>
+        <w:t>--negocios</w:t>
+      </w:r>
+      <w:r>
+        <w:t xml:space="preserve"> completa las tiendas que ya existan con sus proveedores y categorías de gastos. Al final, </w:t>
+      </w:r>
+      <w:r>
+        <w:rPr>
+          <w:rFonts w:ascii="Consolas" w:hAnsi="Consolas" w:cs="Consolas"/>
+        </w:rPr>
+        <w:t>runserver</w:t>
+      </w:r>
+      <w:r>
+        <w:t xml:space="preserve"> inicia el </w:t>
+      </w:r>
+      <w:r>
+        <w:lastRenderedPageBreak/>
+        <w:t xml:space="preserve">sistema en </w:t>
+      </w:r>
+      <w:r>
+        <w:rPr>
+          <w:rFonts w:ascii="Consolas" w:hAnsi="Consolas" w:cs="Consolas"/>
+        </w:rPr>
+        <w:t>http://localhost:8000/</w:t>
+      </w:r>
+      <w:r>
+        <w:t>. No hace falta crear un administrador, porque cada tienda se registra desde la propia aplicación; para entrar al panel de administración de Django (</w:t>
+      </w:r>
+      <w:r>
+        <w:rPr>
+          <w:rFonts w:ascii="Consolas" w:hAnsi="Consolas" w:cs="Consolas"/>
+        </w:rPr>
+        <w:t>/admin/</w:t>
+      </w:r>
+      <w:r>
+        <w:t xml:space="preserve">) se puede crear uno con </w:t>
+      </w:r>
+      <w:r>
+        <w:rPr>
+          <w:rFonts w:ascii="Consolas" w:hAnsi="Consolas" w:cs="Consolas"/>
+        </w:rPr>
+        <w:t>python manage.py createsuperuser</w:t>
+      </w:r>
+      <w:r>
+        <w:t>.</w:t>
+      </w:r>
+    </w:p>
+    <w:p>
+      <w:pPr>
+        <w:jc w:val="both"/>
+      </w:pPr>
+      <w:r>
+        <w:t>Para comprobar que la instalación quedó bien se corren las pruebas automáticas, que crean una base de datos temporal y la borran al terminar.</w:t>
+      </w:r>
+    </w:p>
+    <w:p>
+      <w:pPr>
+        <w:spacing w:after="0" w:line="240" w:lineRule="auto"/>
+        <w:ind w:left="284"/>
+      </w:pPr>
+      <w:r>
+        <w:rPr>
+          <w:rFonts w:ascii="Consolas" w:hAnsi="Consolas" w:cs="Consolas"/>
+          <w:sz w:val="20"/>
+          <w:szCs w:val="20"/>
+        </w:rPr>
+        <w:t>python manage.py test</w:t>
+      </w:r>
+    </w:p>
+    <w:p>
+      <w:pPr>
+        <w:spacing w:after="60"/>
+      </w:pPr>
+    </w:p>
+    <w:p>
+      <w:pPr>
+        <w:jc w:val="both"/>
+      </w:pPr>
+      <w:r>
+        <w:t xml:space="preserve">Al momento de escribir este manual el sistema tiene 472 pruebas, que se pueden correr por aplicación indicando su nombre, por </w:t>
+      </w:r>
+      <w:proofErr w:type="gramStart"/>
+      <w:r>
+        <w:t>ejemplo</w:t>
+      </w:r>
+      <w:proofErr w:type="gramEnd"/>
+      <w:r>
+        <w:t xml:space="preserve"> </w:t>
+      </w:r>
+      <w:r>
+        <w:rPr>
+          <w:rFonts w:ascii="Consolas" w:hAnsi="Consolas" w:cs="Consolas"/>
+        </w:rPr>
+        <w:t>python manage.py test inventario</w:t>
+      </w:r>
+      <w:r>
+        <w:t>.</w:t>
       </w:r>
     </w:p>
     <w:p>
@@ -385,30 +440,51 @@
         <w:pStyle w:val="Heading2"/>
       </w:pPr>
       <w:r>
-        <w:t xml:space="preserve">B.3 Configuración con el archivo .env</w:t>
-      </w:r>
-    </w:p>
-    <w:p>
-      <w:pPr>
-        <w:jc w:val="both"/>
-      </w:pPr>
-      <w:r>
-        <w:t xml:space="preserve">Todo lo que cambia de una instalación a otra se lee del archivo </w:t>
-      </w:r>
-      <w:r>
-        <w:rPr>
-          <w:rFonts w:ascii="Consolas" w:hAnsi="Consolas" w:cs="Consolas"/>
-        </w:rPr>
-        <w:t xml:space="preserve">.env</w:t>
-      </w:r>
-      <w:r>
-        <w:t xml:space="preserve">, y el archivo </w:t>
-      </w:r>
-      <w:r>
-        <w:rPr>
-          <w:rFonts w:ascii="Consolas" w:hAnsi="Consolas" w:cs="Consolas"/>
-        </w:rPr>
-        <w:t xml:space="preserve">.env.example</w:t>
+        <w:t xml:space="preserve">B.3 Configuración con el </w:t>
+      </w:r>
+      <w:proofErr w:type="gramStart"/>
+      <w:r>
+        <w:t>archivo .env</w:t>
+      </w:r>
+      <w:proofErr w:type="gramEnd"/>
+    </w:p>
+    <w:p>
+      <w:pPr>
+        <w:jc w:val="both"/>
+      </w:pPr>
+      <w:r>
+        <w:t xml:space="preserve">Todo lo que cambia de una instalación a otra se lee del </w:t>
+      </w:r>
+      <w:proofErr w:type="gramStart"/>
+      <w:r>
+        <w:t xml:space="preserve">archivo </w:t>
+      </w:r>
+      <w:r>
+        <w:rPr>
+          <w:rFonts w:ascii="Consolas" w:hAnsi="Consolas" w:cs="Consolas"/>
+        </w:rPr>
+        <w:t>.env</w:t>
+      </w:r>
+      <w:proofErr w:type="gramEnd"/>
+      <w:r>
+        <w:t xml:space="preserve">, y el </w:t>
+      </w:r>
+      <w:proofErr w:type="gramStart"/>
+      <w:r>
+        <w:t xml:space="preserve">archivo </w:t>
+      </w:r>
+      <w:r>
+        <w:rPr>
+          <w:rFonts w:ascii="Consolas" w:hAnsi="Consolas" w:cs="Consolas"/>
+        </w:rPr>
+        <w:t>.env</w:t>
+      </w:r>
+      <w:proofErr w:type="gramEnd"/>
+      <w:r>
+        <w:rPr>
+          <w:rFonts w:ascii="Consolas" w:hAnsi="Consolas" w:cs="Consolas"/>
+        </w:rPr>
+        <w:t>.example</w:t>
       </w:r>
       <w:r>
         <w:t xml:space="preserve"> trae las variables comentadas para copiarlas. Ninguna es obligatoria para desarrollo local. La Tabla B.1 las resume.</w:t>
@@ -419,7 +495,15 @@
         <w:jc w:val="both"/>
       </w:pPr>
       <w:r>
-        <w:t xml:space="preserve">Tabla B.1. Variables del archivo .env.</w:t>
+        <w:t xml:space="preserve">Tabla B.1. Variables del </w:t>
+      </w:r>
+      <w:proofErr w:type="gramStart"/>
+      <w:r>
+        <w:t>archivo .env</w:t>
+      </w:r>
+      <w:proofErr w:type="gramEnd"/>
+      <w:r>
+        <w:t>.</w:t>
       </w:r>
     </w:p>
     <w:tbl>
@@ -427,7 +511,7 @@
         <w:tblStyle w:val="TableGrid"/>
         <w:tblW w:w="9399" w:type="dxa"/>
         <w:tblLayout w:type="fixed"/>
-        <w:tblLook w:val="04A0"/>
+        <w:tblLook w:val="04A0" w:firstRow="1" w:lastRow="0" w:firstColumn="1" w:lastColumn="0" w:noHBand="0" w:noVBand="1"/>
       </w:tblPr>
       <w:tblGrid>
         <w:gridCol w:w="2951"/>
@@ -454,7 +538,7 @@
                 <w:sz w:val="20"/>
                 <w:szCs w:val="20"/>
               </w:rPr>
-              <w:t xml:space="preserve">Variable</w:t>
+              <w:t>Variable</w:t>
             </w:r>
           </w:p>
         </w:tc>
@@ -474,7 +558,7 @@
                 <w:sz w:val="20"/>
                 <w:szCs w:val="20"/>
               </w:rPr>
-              <w:t xml:space="preserve">Para qué sirve</w:t>
+              <w:t>Para qué sirve</w:t>
             </w:r>
           </w:p>
         </w:tc>
@@ -490,19 +574,24 @@
           <w:p>
             <w:pPr>
               <w:spacing w:before="40" w:after="40" w:line="240" w:lineRule="auto"/>
+              <w:rPr>
+                <w:lang w:val="en-US"/>
+              </w:rPr>
             </w:pPr>
             <w:r>
               <w:rPr>
                 <w:rFonts w:ascii="Consolas" w:hAnsi="Consolas" w:cs="Consolas"/>
                 <w:sz w:val="20"/>
                 <w:szCs w:val="20"/>
-              </w:rPr>
-              <w:t xml:space="preserve">OPENAI_API_KEY</w:t>
-            </w:r>
-            <w:r>
-              <w:rPr>
-                <w:sz w:val="20"/>
-                <w:szCs w:val="20"/>
+                <w:lang w:val="en-US"/>
+              </w:rPr>
+              <w:t>OPENAI_API_KEY</w:t>
+            </w:r>
+            <w:r>
+              <w:rPr>
+                <w:sz w:val="20"/>
+                <w:szCs w:val="20"/>
+                <w:lang w:val="en-US"/>
               </w:rPr>
               <w:t xml:space="preserve">, </w:t>
             </w:r>
@@ -511,8 +600,9 @@
                 <w:rFonts w:ascii="Consolas" w:hAnsi="Consolas" w:cs="Consolas"/>
                 <w:sz w:val="20"/>
                 <w:szCs w:val="20"/>
-              </w:rPr>
-              <w:t xml:space="preserve">GEMINI_API_KEY</w:t>
+                <w:lang w:val="en-US"/>
+              </w:rPr>
+              <w:t>GEMINI_API_KEY</w:t>
             </w:r>
           </w:p>
         </w:tc>
@@ -537,7 +627,7 @@
                 <w:sz w:val="20"/>
                 <w:szCs w:val="20"/>
               </w:rPr>
-              <w:t xml:space="preserve">configurar_ia</w:t>
+              <w:t>configurar_ia</w:t>
             </w:r>
           </w:p>
         </w:tc>
@@ -553,19 +643,24 @@
           <w:p>
             <w:pPr>
               <w:spacing w:before="40" w:after="40" w:line="240" w:lineRule="auto"/>
+              <w:rPr>
+                <w:lang w:val="en-US"/>
+              </w:rPr>
             </w:pPr>
             <w:r>
               <w:rPr>
                 <w:rFonts w:ascii="Consolas" w:hAnsi="Consolas" w:cs="Consolas"/>
                 <w:sz w:val="20"/>
                 <w:szCs w:val="20"/>
-              </w:rPr>
-              <w:t xml:space="preserve">DB_NAME</w:t>
-            </w:r>
-            <w:r>
-              <w:rPr>
-                <w:sz w:val="20"/>
-                <w:szCs w:val="20"/>
+                <w:lang w:val="en-US"/>
+              </w:rPr>
+              <w:t>DB_NAME</w:t>
+            </w:r>
+            <w:r>
+              <w:rPr>
+                <w:sz w:val="20"/>
+                <w:szCs w:val="20"/>
+                <w:lang w:val="en-US"/>
               </w:rPr>
               <w:t xml:space="preserve">, </w:t>
             </w:r>
@@ -574,13 +669,15 @@
                 <w:rFonts w:ascii="Consolas" w:hAnsi="Consolas" w:cs="Consolas"/>
                 <w:sz w:val="20"/>
                 <w:szCs w:val="20"/>
-              </w:rPr>
-              <w:t xml:space="preserve">DB_USER</w:t>
-            </w:r>
-            <w:r>
-              <w:rPr>
-                <w:sz w:val="20"/>
-                <w:szCs w:val="20"/>
+                <w:lang w:val="en-US"/>
+              </w:rPr>
+              <w:t>DB_USER</w:t>
+            </w:r>
+            <w:r>
+              <w:rPr>
+                <w:sz w:val="20"/>
+                <w:szCs w:val="20"/>
+                <w:lang w:val="en-US"/>
               </w:rPr>
               <w:t xml:space="preserve">, </w:t>
             </w:r>
@@ -589,13 +686,15 @@
                 <w:rFonts w:ascii="Consolas" w:hAnsi="Consolas" w:cs="Consolas"/>
                 <w:sz w:val="20"/>
                 <w:szCs w:val="20"/>
-              </w:rPr>
-              <w:t xml:space="preserve">DB_PASSWORD</w:t>
-            </w:r>
-            <w:r>
-              <w:rPr>
-                <w:sz w:val="20"/>
-                <w:szCs w:val="20"/>
+                <w:lang w:val="en-US"/>
+              </w:rPr>
+              <w:t>DB_PASSWORD</w:t>
+            </w:r>
+            <w:r>
+              <w:rPr>
+                <w:sz w:val="20"/>
+                <w:szCs w:val="20"/>
+                <w:lang w:val="en-US"/>
               </w:rPr>
               <w:t xml:space="preserve">, </w:t>
             </w:r>
@@ -604,13 +703,15 @@
                 <w:rFonts w:ascii="Consolas" w:hAnsi="Consolas" w:cs="Consolas"/>
                 <w:sz w:val="20"/>
                 <w:szCs w:val="20"/>
-              </w:rPr>
-              <w:t xml:space="preserve">DB_HOST</w:t>
-            </w:r>
-            <w:r>
-              <w:rPr>
-                <w:sz w:val="20"/>
-                <w:szCs w:val="20"/>
+                <w:lang w:val="en-US"/>
+              </w:rPr>
+              <w:t>DB_HOST</w:t>
+            </w:r>
+            <w:r>
+              <w:rPr>
+                <w:sz w:val="20"/>
+                <w:szCs w:val="20"/>
+                <w:lang w:val="en-US"/>
               </w:rPr>
               <w:t xml:space="preserve">, </w:t>
             </w:r>
@@ -619,8 +720,9 @@
                 <w:rFonts w:ascii="Consolas" w:hAnsi="Consolas" w:cs="Consolas"/>
                 <w:sz w:val="20"/>
                 <w:szCs w:val="20"/>
-              </w:rPr>
-              <w:t xml:space="preserve">DB_PORT</w:t>
+                <w:lang w:val="en-US"/>
+              </w:rPr>
+              <w:t>DB_PORT</w:t>
             </w:r>
           </w:p>
         </w:tc>
@@ -645,7 +747,7 @@
                 <w:sz w:val="20"/>
                 <w:szCs w:val="20"/>
               </w:rPr>
-              <w:t xml:space="preserve">DB_NAME</w:t>
+              <w:t>DB_NAME</w:t>
             </w:r>
             <w:r>
               <w:rPr>
@@ -675,7 +777,7 @@
                 <w:sz w:val="20"/>
                 <w:szCs w:val="20"/>
               </w:rPr>
-              <w:t xml:space="preserve">DJANGO_SECRET_KEY</w:t>
+              <w:t>DJANGO_SECRET_KEY</w:t>
             </w:r>
           </w:p>
         </w:tc>
@@ -692,7 +794,7 @@
                 <w:sz w:val="20"/>
                 <w:szCs w:val="20"/>
               </w:rPr>
-              <w:t xml:space="preserve">Llave secreta de Django. En un servidor debe fijarse y no cambiar, porque con ella se cifran las llaves de las APIs</w:t>
+              <w:t>Llave secreta de Django. En un servidor debe fijarse y no cambiar, porque con ella se cifran las llaves de las APIs</w:t>
             </w:r>
           </w:p>
         </w:tc>
@@ -715,7 +817,7 @@
                 <w:sz w:val="20"/>
                 <w:szCs w:val="20"/>
               </w:rPr>
-              <w:t xml:space="preserve">DJANGO_DEBUG</w:t>
+              <w:t>DJANGO_DEBUG</w:t>
             </w:r>
           </w:p>
         </w:tc>
@@ -733,7 +835,7 @@
                 <w:sz w:val="20"/>
                 <w:szCs w:val="20"/>
               </w:rPr>
-              <w:t xml:space="preserve">False</w:t>
+              <w:t>False</w:t>
             </w:r>
             <w:r>
               <w:rPr>
@@ -763,7 +865,7 @@
                 <w:sz w:val="20"/>
                 <w:szCs w:val="20"/>
               </w:rPr>
-              <w:t xml:space="preserve">ALLOWED_HOSTS</w:t>
+              <w:t>ALLOWED_HOSTS</w:t>
             </w:r>
           </w:p>
         </w:tc>
@@ -780,7 +882,7 @@
                 <w:sz w:val="20"/>
                 <w:szCs w:val="20"/>
               </w:rPr>
-              <w:t xml:space="preserve">Direcciones desde las que se acepta el sistema, separadas por comas</w:t>
+              <w:t>Direcciones desde las que se acepta el sistema, separadas por comas</w:t>
             </w:r>
           </w:p>
         </w:tc>
@@ -803,7 +905,7 @@
                 <w:sz w:val="20"/>
                 <w:szCs w:val="20"/>
               </w:rPr>
-              <w:t xml:space="preserve">CSRF_TRUSTED_ORIGINS</w:t>
+              <w:t>CSRF_TRUSTED_ORIGINS</w:t>
             </w:r>
           </w:p>
         </w:tc>
@@ -820,7 +922,7 @@
                 <w:sz w:val="20"/>
                 <w:szCs w:val="20"/>
               </w:rPr>
-              <w:t xml:space="preserve">Orígenes seguros para los formularios cuando hay un dominio propio</w:t>
+              <w:t>Orígenes seguros para los formularios cuando hay un dominio propio</w:t>
             </w:r>
           </w:p>
         </w:tc>
@@ -843,7 +945,7 @@
                 <w:sz w:val="20"/>
                 <w:szCs w:val="20"/>
               </w:rPr>
-              <w:t xml:space="preserve">USAR_HTTPS</w:t>
+              <w:t>USAR_HTTPS</w:t>
             </w:r>
           </w:p>
         </w:tc>
@@ -868,7 +970,7 @@
                 <w:sz w:val="20"/>
                 <w:szCs w:val="20"/>
               </w:rPr>
-              <w:t xml:space="preserve">True</w:t>
+              <w:t>True</w:t>
             </w:r>
             <w:r>
               <w:rPr>
@@ -891,19 +993,24 @@
           <w:p>
             <w:pPr>
               <w:spacing w:before="40" w:after="40" w:line="240" w:lineRule="auto"/>
+              <w:rPr>
+                <w:lang w:val="en-US"/>
+              </w:rPr>
             </w:pPr>
             <w:r>
               <w:rPr>
                 <w:rFonts w:ascii="Consolas" w:hAnsi="Consolas" w:cs="Consolas"/>
                 <w:sz w:val="20"/>
                 <w:szCs w:val="20"/>
-              </w:rPr>
-              <w:t xml:space="preserve">EMAIL_HOST</w:t>
-            </w:r>
-            <w:r>
-              <w:rPr>
-                <w:sz w:val="20"/>
-                <w:szCs w:val="20"/>
+                <w:lang w:val="en-US"/>
+              </w:rPr>
+              <w:t>EMAIL_HOST</w:t>
+            </w:r>
+            <w:r>
+              <w:rPr>
+                <w:sz w:val="20"/>
+                <w:szCs w:val="20"/>
+                <w:lang w:val="en-US"/>
               </w:rPr>
               <w:t xml:space="preserve">, </w:t>
             </w:r>
@@ -912,13 +1019,15 @@
                 <w:rFonts w:ascii="Consolas" w:hAnsi="Consolas" w:cs="Consolas"/>
                 <w:sz w:val="20"/>
                 <w:szCs w:val="20"/>
-              </w:rPr>
-              <w:t xml:space="preserve">EMAIL_PORT</w:t>
-            </w:r>
-            <w:r>
-              <w:rPr>
-                <w:sz w:val="20"/>
-                <w:szCs w:val="20"/>
+                <w:lang w:val="en-US"/>
+              </w:rPr>
+              <w:t>EMAIL_PORT</w:t>
+            </w:r>
+            <w:r>
+              <w:rPr>
+                <w:sz w:val="20"/>
+                <w:szCs w:val="20"/>
+                <w:lang w:val="en-US"/>
               </w:rPr>
               <w:t xml:space="preserve">, </w:t>
             </w:r>
@@ -927,13 +1036,15 @@
                 <w:rFonts w:ascii="Consolas" w:hAnsi="Consolas" w:cs="Consolas"/>
                 <w:sz w:val="20"/>
                 <w:szCs w:val="20"/>
-              </w:rPr>
-              <w:t xml:space="preserve">EMAIL_HOST_USER</w:t>
-            </w:r>
-            <w:r>
-              <w:rPr>
-                <w:sz w:val="20"/>
-                <w:szCs w:val="20"/>
+                <w:lang w:val="en-US"/>
+              </w:rPr>
+              <w:t>EMAIL_HOST_USER</w:t>
+            </w:r>
+            <w:r>
+              <w:rPr>
+                <w:sz w:val="20"/>
+                <w:szCs w:val="20"/>
+                <w:lang w:val="en-US"/>
               </w:rPr>
               <w:t xml:space="preserve">, </w:t>
             </w:r>
@@ -942,13 +1053,15 @@
                 <w:rFonts w:ascii="Consolas" w:hAnsi="Consolas" w:cs="Consolas"/>
                 <w:sz w:val="20"/>
                 <w:szCs w:val="20"/>
-              </w:rPr>
-              <w:t xml:space="preserve">EMAIL_HOST_PASSWORD</w:t>
-            </w:r>
-            <w:r>
-              <w:rPr>
-                <w:sz w:val="20"/>
-                <w:szCs w:val="20"/>
+                <w:lang w:val="en-US"/>
+              </w:rPr>
+              <w:t>EMAIL_HOST_PASSWORD</w:t>
+            </w:r>
+            <w:r>
+              <w:rPr>
+                <w:sz w:val="20"/>
+                <w:szCs w:val="20"/>
+                <w:lang w:val="en-US"/>
               </w:rPr>
               <w:t xml:space="preserve">, </w:t>
             </w:r>
@@ -957,8 +1070,9 @@
                 <w:rFonts w:ascii="Consolas" w:hAnsi="Consolas" w:cs="Consolas"/>
                 <w:sz w:val="20"/>
                 <w:szCs w:val="20"/>
-              </w:rPr>
-              <w:t xml:space="preserve">EMAIL_USE_TLS</w:t>
+                <w:lang w:val="en-US"/>
+              </w:rPr>
+              <w:t>EMAIL_USE_TLS</w:t>
             </w:r>
           </w:p>
         </w:tc>
@@ -975,7 +1089,7 @@
                 <w:sz w:val="20"/>
                 <w:szCs w:val="20"/>
               </w:rPr>
-              <w:t xml:space="preserve">Servidor de correo para recuperar contraseñas. Sin ellos el correo se imprime en la terminal</w:t>
+              <w:t>Servidor de correo para recuperar contraseñas. Sin ellos el correo se imprime en la terminal</w:t>
             </w:r>
           </w:p>
         </w:tc>
@@ -998,7 +1112,7 @@
                 <w:sz w:val="20"/>
                 <w:szCs w:val="20"/>
               </w:rPr>
-              <w:t xml:space="preserve">VIDEO_INTRODUCTORIO_URL</w:t>
+              <w:t>VIDEO_INTRODUCTORIO_URL</w:t>
             </w:r>
           </w:p>
         </w:tc>
@@ -1015,7 +1129,7 @@
                 <w:sz w:val="20"/>
                 <w:szCs w:val="20"/>
               </w:rPr>
-              <w:t xml:space="preserve">Enlace de incrustación del video de bienvenida</w:t>
+              <w:t>Enlace de incrustación del video de bienvenida</w:t>
             </w:r>
           </w:p>
         </w:tc>
@@ -1038,7 +1152,7 @@
                 <w:sz w:val="20"/>
                 <w:szCs w:val="20"/>
               </w:rPr>
-              <w:t xml:space="preserve">PRONOSTICO_MINIMO_DIAS</w:t>
+              <w:t>PRONOSTICO_MINIMO_DIAS</w:t>
             </w:r>
           </w:p>
         </w:tc>
@@ -1055,7 +1169,7 @@
                 <w:sz w:val="20"/>
                 <w:szCs w:val="20"/>
               </w:rPr>
-              <w:t xml:space="preserve">Días mínimos de ventas para calcular el pronóstico (30 por defecto)</w:t>
+              <w:t>Días mínimos de ventas para calcular el pronóstico (30 por defecto)</w:t>
             </w:r>
           </w:p>
         </w:tc>
@@ -1077,15 +1191,23 @@
         <w:rPr>
           <w:rFonts w:ascii="Consolas" w:hAnsi="Consolas" w:cs="Consolas"/>
         </w:rPr>
-        <w:t xml:space="preserve">configurar_ia</w:t>
-      </w:r>
-      <w:r>
-        <w:t xml:space="preserve">, que las pide sin mostrarlas en pantalla y las guarda cifradas en la base de datos.</w:t>
-      </w:r>
-    </w:p>
-    <w:p>
-      <w:pPr>
-        <w:spacing w:before="0" w:after="0" w:line="240" w:lineRule="auto"/>
+        <w:t>configurar_ia</w:t>
+      </w:r>
+      <w:r>
+        <w:t xml:space="preserve">, que las pide sin mostrarlas en pantalla y las </w:t>
+      </w:r>
+      <w:proofErr w:type="gramStart"/>
+      <w:r>
+        <w:t>guarda cifradas</w:t>
+      </w:r>
+      <w:proofErr w:type="gramEnd"/>
+      <w:r>
+        <w:t xml:space="preserve"> en la base de datos.</w:t>
+      </w:r>
+    </w:p>
+    <w:p>
+      <w:pPr>
+        <w:spacing w:after="0" w:line="240" w:lineRule="auto"/>
         <w:ind w:left="284"/>
       </w:pPr>
       <w:r>
@@ -1094,12 +1216,12 @@
           <w:sz w:val="20"/>
           <w:szCs w:val="20"/>
         </w:rPr>
-        <w:t xml:space="preserve">python manage.py configurar_ia</w:t>
-      </w:r>
-    </w:p>
-    <w:p>
-      <w:pPr>
-        <w:spacing w:before="0" w:after="0" w:line="240" w:lineRule="auto"/>
+        <w:t>python manage.py configurar_ia</w:t>
+      </w:r>
+    </w:p>
+    <w:p>
+      <w:pPr>
+        <w:spacing w:after="0" w:line="240" w:lineRule="auto"/>
         <w:ind w:left="284"/>
       </w:pPr>
       <w:r>
@@ -1108,12 +1230,12 @@
           <w:sz w:val="20"/>
           <w:szCs w:val="20"/>
         </w:rPr>
-        <w:t xml:space="preserve">python manage.py configurar_ia --openai sk-... --gemini AIza...</w:t>
-      </w:r>
-    </w:p>
-    <w:p>
-      <w:pPr>
-        <w:spacing w:before="0" w:after="0" w:line="240" w:lineRule="auto"/>
+        <w:t>python manage.py configurar_ia --openai sk-... --gemini AIza...</w:t>
+      </w:r>
+    </w:p>
+    <w:p>
+      <w:pPr>
+        <w:spacing w:after="0" w:line="240" w:lineRule="auto"/>
         <w:ind w:left="284"/>
       </w:pPr>
       <w:r>
@@ -1122,12 +1244,12 @@
           <w:sz w:val="20"/>
           <w:szCs w:val="20"/>
         </w:rPr>
-        <w:t xml:space="preserve">python manage.py configurar_ia --archivo claves.txt</w:t>
-      </w:r>
-    </w:p>
-    <w:p>
-      <w:pPr>
-        <w:spacing w:before="0" w:after="0" w:line="240" w:lineRule="auto"/>
+        <w:t>python manage.py configurar_ia --archivo claves.txt</w:t>
+      </w:r>
+    </w:p>
+    <w:p>
+      <w:pPr>
+        <w:spacing w:after="0" w:line="240" w:lineRule="auto"/>
         <w:ind w:left="284"/>
       </w:pPr>
       <w:r>
@@ -1136,12 +1258,12 @@
           <w:sz w:val="20"/>
           <w:szCs w:val="20"/>
         </w:rPr>
-        <w:t xml:space="preserve">python manage.py configurar_ia --desde-env</w:t>
-      </w:r>
-    </w:p>
-    <w:p>
-      <w:pPr>
-        <w:spacing w:before="0" w:after="0" w:line="240" w:lineRule="auto"/>
+        <w:t>python manage.py configurar_ia --desde-env</w:t>
+      </w:r>
+    </w:p>
+    <w:p>
+      <w:pPr>
+        <w:spacing w:after="0" w:line="240" w:lineRule="auto"/>
         <w:ind w:left="284"/>
       </w:pPr>
       <w:r>
@@ -1150,7 +1272,7 @@
           <w:sz w:val="20"/>
           <w:szCs w:val="20"/>
         </w:rPr>
-        <w:t xml:space="preserve">python manage.py configurar_ia --ver</w:t>
+        <w:t>python manage.py configurar_ia --ver</w:t>
       </w:r>
     </w:p>
     <w:p>
@@ -1169,17 +1291,22 @@
         <w:rPr>
           <w:rFonts w:ascii="Consolas" w:hAnsi="Consolas" w:cs="Consolas"/>
         </w:rPr>
-        <w:t xml:space="preserve">OPENAI_API_KEY=...</w:t>
-      </w:r>
-      <w:r>
-        <w:t xml:space="preserve">, la cuarta pasa a la base de datos las llaves que ya estén en el </w:t>
-      </w:r>
-      <w:r>
-        <w:rPr>
-          <w:rFonts w:ascii="Consolas" w:hAnsi="Consolas" w:cs="Consolas"/>
-        </w:rPr>
-        <w:t xml:space="preserve">.env</w:t>
-      </w:r>
+        <w:t>OPENAI_API_KEY=...</w:t>
+      </w:r>
+      <w:r>
+        <w:t xml:space="preserve">, la cuarta pasa a la base de datos las llaves que ya estén en </w:t>
+      </w:r>
+      <w:proofErr w:type="gramStart"/>
+      <w:r>
+        <w:t xml:space="preserve">el </w:t>
+      </w:r>
+      <w:r>
+        <w:rPr>
+          <w:rFonts w:ascii="Consolas" w:hAnsi="Consolas" w:cs="Consolas"/>
+        </w:rPr>
+        <w:t>.env</w:t>
+      </w:r>
+      <w:proofErr w:type="gramEnd"/>
       <w:r>
         <w:t xml:space="preserve"> y la última muestra cuáles hay y de dónde salen, siempre tapadas. Las llaves se cifran con Fernet, usando una clave derivada de </w:t>
       </w:r>
@@ -1187,10 +1314,10 @@
         <w:rPr>
           <w:rFonts w:ascii="Consolas" w:hAnsi="Consolas" w:cs="Consolas"/>
         </w:rPr>
-        <w:t xml:space="preserve">DJANGO_SECRET_KEY</w:t>
-      </w:r>
-      <w:r>
-        <w:t xml:space="preserve">. Por eso, si esa llave secreta cambia, las llaves guardadas ya no se pueden descifrar: el sistema no truena, simplemente las trata como ausentes y hay que capturarlas de nuevo.</w:t>
+        <w:t>DJANGO_SECRET_KEY</w:t>
+      </w:r>
+      <w:r>
+        <w:t>. Por eso, si esa llave secreta cambia, las llaves guardadas ya no se pueden descifrar: el sistema no truena, simplemente las trata como ausentes y hay que capturarlas de nuevo.</w:t>
       </w:r>
     </w:p>
     <w:p>
@@ -1198,7 +1325,7 @@
         <w:pStyle w:val="Heading2"/>
       </w:pPr>
       <w:r>
-        <w:t xml:space="preserve">B.4 Base de datos</w:t>
+        <w:t>B.4 Base de datos</w:t>
       </w:r>
     </w:p>
     <w:p>
@@ -1212,7 +1339,7 @@
         <w:rPr>
           <w:rFonts w:ascii="Consolas" w:hAnsi="Consolas" w:cs="Consolas"/>
         </w:rPr>
-        <w:t xml:space="preserve">db.sqlite3</w:t>
+        <w:t>db.sqlite3</w:t>
       </w:r>
       <w:r>
         <w:t xml:space="preserve"> se crea con las migraciones. Para usar PostgreSQL se instala el servidor, se crea la base de datos con el archivo </w:t>
@@ -1221,7 +1348,7 @@
         <w:rPr>
           <w:rFonts w:ascii="Consolas" w:hAnsi="Consolas" w:cs="Consolas"/>
         </w:rPr>
-        <w:t xml:space="preserve">database/crear_base.sql</w:t>
+        <w:t>database/crear_base.sql</w:t>
       </w:r>
       <w:r>
         <w:t xml:space="preserve"> y se llenan las variables </w:t>
@@ -1230,17 +1357,22 @@
         <w:rPr>
           <w:rFonts w:ascii="Consolas" w:hAnsi="Consolas" w:cs="Consolas"/>
         </w:rPr>
-        <w:t xml:space="preserve">DB_*</w:t>
-      </w:r>
-      <w:r>
-        <w:t xml:space="preserve"> del </w:t>
-      </w:r>
-      <w:r>
-        <w:rPr>
-          <w:rFonts w:ascii="Consolas" w:hAnsi="Consolas" w:cs="Consolas"/>
-        </w:rPr>
-        <w:t xml:space="preserve">.env</w:t>
-      </w:r>
+        <w:t>DB_*</w:t>
+      </w:r>
+      <w:r>
+        <w:t xml:space="preserve"> </w:t>
+      </w:r>
+      <w:proofErr w:type="gramStart"/>
+      <w:r>
+        <w:t xml:space="preserve">del </w:t>
+      </w:r>
+      <w:r>
+        <w:rPr>
+          <w:rFonts w:ascii="Consolas" w:hAnsi="Consolas" w:cs="Consolas"/>
+        </w:rPr>
+        <w:t>.env</w:t>
+      </w:r>
+      <w:proofErr w:type="gramEnd"/>
       <w:r>
         <w:t xml:space="preserve">; los pasos detallados están en </w:t>
       </w:r>
@@ -1248,7 +1380,7 @@
         <w:rPr>
           <w:rFonts w:ascii="Consolas" w:hAnsi="Consolas" w:cs="Consolas"/>
         </w:rPr>
-        <w:t xml:space="preserve">database/README.md</w:t>
+        <w:t>database/README.md</w:t>
       </w:r>
       <w:r>
         <w:t xml:space="preserve">, que también incluye consultas útiles en </w:t>
@@ -1257,7 +1389,7 @@
         <w:rPr>
           <w:rFonts w:ascii="Consolas" w:hAnsi="Consolas" w:cs="Consolas"/>
         </w:rPr>
-        <w:t xml:space="preserve">consultas_utiles.sql</w:t>
+        <w:t>consultas_utiles.sql</w:t>
       </w:r>
       <w:r>
         <w:t xml:space="preserve">. Después se corre </w:t>
@@ -1266,7 +1398,7 @@
         <w:rPr>
           <w:rFonts w:ascii="Consolas" w:hAnsi="Consolas" w:cs="Consolas"/>
         </w:rPr>
-        <w:t xml:space="preserve">python manage.py migrate</w:t>
+        <w:t>python manage.py migrate</w:t>
       </w:r>
       <w:r>
         <w:t xml:space="preserve"> para crear las tablas.</w:t>
@@ -1277,15 +1409,15 @@
         <w:jc w:val="both"/>
       </w:pPr>
       <w:r>
-        <w:t xml:space="preserve">El sistema tiene 18 tablas propias. Las de cuentas son el usuario y el negocio; las de inventario, las categorías, los proveedores, el catálogo precargado, los productos, el historial de cambios de cada producto, el kardex de movimientos y los lotes de compra; las de ventas, la venta y sus renglones; las de finanzas, los gastos y sus categorías; las del asistente, la conversación, el resumen diario y las explicaciones con IA; y las de uso interno, las operaciones sincronizadas sin internet y las llaves cifradas de las APIs. La Tabla 6.1 del capítulo 6 las describe una por una.</w:t>
-      </w:r>
-    </w:p>
-    <w:p>
-      <w:pPr>
-        <w:jc w:val="both"/>
-      </w:pPr>
-      <w:r>
-        <w:t xml:space="preserve">La base de datos cuida sus propias reglas con restricciones: no puede haber dos ventas con el mismo folio en una tienda, ni existencias o precios negativos, ni cantidades vendidas en cero o menos. Esas restricciones, junto con las validaciones de los formularios, evitan que un error de la pantalla deje datos inconsistentes.</w:t>
+        <w:t>El sistema tiene 18 tablas propias. Las de cuentas son el usuario y el negocio; las de inventario, las categorías, los proveedores, el catálogo precargado, los productos, el historial de cambios de cada producto, el kardex de movimientos y los lotes de compra; las de ventas, la venta y sus renglones; las de finanzas, los gastos y sus categorías; las del asistente, la conversación, el resumen diario y las explicaciones con IA; y las de uso interno, las operaciones sincronizadas sin internet y las llaves cifradas de las APIs. La Tabla 6.1 del capítulo 6 las describe una por una.</w:t>
+      </w:r>
+    </w:p>
+    <w:p>
+      <w:pPr>
+        <w:jc w:val="both"/>
+      </w:pPr>
+      <w:r>
+        <w:t>La base de datos cuida sus propias reglas con restricciones: no puede haber dos ventas con el mismo folio en una tienda, ni existencias o precios negativos, ni cantidades vendidas en cero o menos. Esas restricciones, junto con las validaciones de los formularios, evitan que un error de la pantalla deje datos inconsistentes.</w:t>
       </w:r>
     </w:p>
     <w:p>
@@ -1299,15 +1431,15 @@
         <w:rPr>
           <w:rFonts w:ascii="Consolas" w:hAnsi="Consolas" w:cs="Consolas"/>
         </w:rPr>
-        <w:t xml:space="preserve">database/ejemplos</w:t>
-      </w:r>
-      <w:r>
-        <w:t xml:space="preserve">. Para cargar un historial grande de productos y ventas se usa un comando que inserta por paquetes de mil registros dentro de una sola transacción, y por eso es rápido.</w:t>
-      </w:r>
-    </w:p>
-    <w:p>
-      <w:pPr>
-        <w:spacing w:before="0" w:after="0" w:line="240" w:lineRule="auto"/>
+        <w:t>database/ejemplos</w:t>
+      </w:r>
+      <w:r>
+        <w:t>. Para cargar un historial grande de productos y ventas se usa un comando que inserta por paquetes de mil registros dentro de una sola transacción, y por eso es rápido.</w:t>
+      </w:r>
+    </w:p>
+    <w:p>
+      <w:pPr>
+        <w:spacing w:after="0" w:line="240" w:lineRule="auto"/>
         <w:ind w:left="284"/>
       </w:pPr>
       <w:r>
@@ -1316,7 +1448,7 @@
           <w:sz w:val="20"/>
           <w:szCs w:val="20"/>
         </w:rPr>
-        <w:t xml:space="preserve">python manage.py importar_csv --usuario correo_o_telefono --productos productos.csv --ventas ventas.csv</w:t>
+        <w:t>python manage.py importar_csv --usuario correo_o_telefono --productos productos.csv --ventas ventas.csv</w:t>
       </w:r>
     </w:p>
     <w:p>
@@ -1329,7 +1461,15 @@
         <w:jc w:val="both"/>
       </w:pPr>
       <w:r>
-        <w:t xml:space="preserve">El archivo de productos lleva el nombre, la categoría, el costo, el precio de venta y las cantidades; el de ventas, la fecha, el folio, el producto, la cantidad y el precio, con un renglón por producto vendido y el mismo folio para los de un mismo ticket.</w:t>
+        <w:t xml:space="preserve">El archivo de productos lleva el nombre, la categoría, el costo, el precio de venta y las cantidades; el de ventas, la fecha, el folio, el producto, la cantidad y el precio, con un renglón por producto vendido y el mismo folio para los de un mismo </w:t>
+      </w:r>
+      <w:proofErr w:type="gramStart"/>
+      <w:r>
+        <w:t>ticket</w:t>
+      </w:r>
+      <w:proofErr w:type="gramEnd"/>
+      <w:r>
+        <w:t>.</w:t>
       </w:r>
     </w:p>
     <w:p>
@@ -1337,34 +1477,42 @@
         <w:pStyle w:val="Heading2"/>
       </w:pPr>
       <w:r>
-        <w:t xml:space="preserve">B.5 Actualizar el sistema</w:t>
-      </w:r>
-    </w:p>
-    <w:p>
-      <w:pPr>
-        <w:jc w:val="both"/>
-      </w:pPr>
-      <w:r>
-        <w:t xml:space="preserve">Cuando el código cambia, la estructura de la base de datos puede cambiar con él, y Django lo maneja con migraciones. El orden recomendado para actualizar una instalación es hacer un respaldo de la base de datos, descargar el código nuevo, volver a instalar las dependencias por si se agregó alguna, aplicar las migraciones y reiniciar el servidor.</w:t>
-      </w:r>
-    </w:p>
-    <w:p>
-      <w:pPr>
-        <w:spacing w:before="0" w:after="0" w:line="240" w:lineRule="auto"/>
+        <w:t>B.5 Actualizar el sistema</w:t>
+      </w:r>
+    </w:p>
+    <w:p>
+      <w:pPr>
+        <w:jc w:val="both"/>
+      </w:pPr>
+      <w:r>
+        <w:t xml:space="preserve">Cuando el código cambia, la estructura de la base de datos puede cambiar con él, y Django lo maneja con migraciones. El orden recomendado para actualizar una instalación es hacer un </w:t>
+      </w:r>
+      <w:r>
+        <w:lastRenderedPageBreak/>
+        <w:t>respaldo de la base de datos, descargar el código nuevo, volver a instalar las dependencias por si se agregó alguna, aplicar las migraciones y reiniciar el servidor.</w:t>
+      </w:r>
+    </w:p>
+    <w:p>
+      <w:pPr>
+        <w:spacing w:after="0" w:line="240" w:lineRule="auto"/>
         <w:ind w:left="284"/>
+        <w:rPr>
+          <w:lang w:val="en-US"/>
+        </w:rPr>
       </w:pPr>
       <w:r>
         <w:rPr>
           <w:rFonts w:ascii="Consolas" w:hAnsi="Consolas" w:cs="Consolas"/>
           <w:sz w:val="20"/>
           <w:szCs w:val="20"/>
-        </w:rPr>
-        <w:t xml:space="preserve">python -m pip install -r requirements.txt</w:t>
-      </w:r>
-    </w:p>
-    <w:p>
-      <w:pPr>
-        <w:spacing w:before="0" w:after="0" w:line="240" w:lineRule="auto"/>
+          <w:lang w:val="en-US"/>
+        </w:rPr>
+        <w:t>python -m pip install -r requirements.txt</w:t>
+      </w:r>
+    </w:p>
+    <w:p>
+      <w:pPr>
+        <w:spacing w:after="0" w:line="240" w:lineRule="auto"/>
         <w:ind w:left="284"/>
       </w:pPr>
       <w:r>
@@ -1373,7 +1521,7 @@
           <w:sz w:val="20"/>
           <w:szCs w:val="20"/>
         </w:rPr>
-        <w:t xml:space="preserve">python manage.py migrate</w:t>
+        <w:t>python manage.py migrate</w:t>
       </w:r>
     </w:p>
     <w:p>
@@ -1386,7 +1534,15 @@
         <w:jc w:val="both"/>
       </w:pPr>
       <w:r>
-        <w:t xml:space="preserve">Si algo sale mal, se puede regresar a una migración anterior con el mismo comando indicando su número, y restaurar el respaldo que se hizo al principio. Las migraciones del sistema incluyen pasos que llenan datos de lo que ya había, por ejemplo al agregar los lotes de compra se crea uno por cada producto que ya tenía piezas.</w:t>
+        <w:t xml:space="preserve">Si algo sale mal, se puede regresar a una migración anterior con el mismo comando indicando su número, y restaurar el respaldo que se hizo al principio. Las migraciones del sistema incluyen pasos que llenan datos de lo que ya había, por </w:t>
+      </w:r>
+      <w:proofErr w:type="gramStart"/>
+      <w:r>
+        <w:t>ejemplo</w:t>
+      </w:r>
+      <w:proofErr w:type="gramEnd"/>
+      <w:r>
+        <w:t xml:space="preserve"> al agregar los lotes de compra se crea uno por cada producto que ya tenía piezas.</w:t>
       </w:r>
     </w:p>
     <w:p>
@@ -1394,7 +1550,7 @@
         <w:pStyle w:val="Heading2"/>
       </w:pPr>
       <w:r>
-        <w:t xml:space="preserve">B.6 Cómo está organizado el código</w:t>
+        <w:t>B.6 Cómo está organizado el código</w:t>
       </w:r>
     </w:p>
     <w:p>
@@ -1408,7 +1564,7 @@
         <w:rPr>
           <w:rFonts w:ascii="Consolas" w:hAnsi="Consolas" w:cs="Consolas"/>
         </w:rPr>
-        <w:t xml:space="preserve">config</w:t>
+        <w:t>config</w:t>
       </w:r>
       <w:r>
         <w:t xml:space="preserve"> guarda la configuración y las rutas; </w:t>
@@ -1417,7 +1573,7 @@
         <w:rPr>
           <w:rFonts w:ascii="Consolas" w:hAnsi="Consolas" w:cs="Consolas"/>
         </w:rPr>
-        <w:t xml:space="preserve">core</w:t>
+        <w:t>core</w:t>
       </w:r>
       <w:r>
         <w:t xml:space="preserve"> guarda lo compartido, como el caché por tienda, la sincronización de lo hecho sin internet, el cifrado de llaves y los comandos de carga; </w:t>
@@ -1426,7 +1582,7 @@
         <w:rPr>
           <w:rFonts w:ascii="Consolas" w:hAnsi="Consolas" w:cs="Consolas"/>
         </w:rPr>
-        <w:t xml:space="preserve">accounts</w:t>
+        <w:t>accounts</w:t>
       </w:r>
       <w:r>
         <w:t xml:space="preserve"> maneja usuarios, registro y datos de la tienda; </w:t>
@@ -1435,7 +1591,7 @@
         <w:rPr>
           <w:rFonts w:ascii="Consolas" w:hAnsi="Consolas" w:cs="Consolas"/>
         </w:rPr>
-        <w:t xml:space="preserve">inventario</w:t>
+        <w:t>inventario</w:t>
       </w:r>
       <w:r>
         <w:t xml:space="preserve">, </w:t>
@@ -1444,7 +1600,7 @@
         <w:rPr>
           <w:rFonts w:ascii="Consolas" w:hAnsi="Consolas" w:cs="Consolas"/>
         </w:rPr>
-        <w:t xml:space="preserve">ventas</w:t>
+        <w:t>ventas</w:t>
       </w:r>
       <w:r>
         <w:t xml:space="preserve"> y </w:t>
@@ -1453,7 +1609,7 @@
         <w:rPr>
           <w:rFonts w:ascii="Consolas" w:hAnsi="Consolas" w:cs="Consolas"/>
         </w:rPr>
-        <w:t xml:space="preserve">finanzas</w:t>
+        <w:t>finanzas</w:t>
       </w:r>
       <w:r>
         <w:t xml:space="preserve"> son los tres módulos que ve el tendero; y </w:t>
@@ -1462,7 +1618,7 @@
         <w:rPr>
           <w:rFonts w:ascii="Consolas" w:hAnsi="Consolas" w:cs="Consolas"/>
         </w:rPr>
-        <w:t xml:space="preserve">avi</w:t>
+        <w:t>avi</w:t>
       </w:r>
       <w:r>
         <w:t xml:space="preserve"> es el asistente. Cada aplicación lleva sus plantillas, sus archivos de estilos y scripts y sus pruebas.</w:t>
@@ -1479,7 +1635,7 @@
         <w:rPr>
           <w:rFonts w:ascii="Consolas" w:hAnsi="Consolas" w:cs="Consolas"/>
         </w:rPr>
-        <w:t xml:space="preserve">finanzas/calculos.py</w:t>
+        <w:t>finanzas/calculos.py</w:t>
       </w:r>
       <w:r>
         <w:t xml:space="preserve"> concentra las fórmulas financieras y el pronóstico, </w:t>
@@ -1488,7 +1644,7 @@
         <w:rPr>
           <w:rFonts w:ascii="Consolas" w:hAnsi="Consolas" w:cs="Consolas"/>
         </w:rPr>
-        <w:t xml:space="preserve">finanzas/graficas.py</w:t>
+        <w:t>finanzas/graficas.py</w:t>
       </w:r>
       <w:r>
         <w:t xml:space="preserve"> prepara los datos de las gráficas, </w:t>
@@ -1497,7 +1653,7 @@
         <w:rPr>
           <w:rFonts w:ascii="Consolas" w:hAnsi="Consolas" w:cs="Consolas"/>
         </w:rPr>
-        <w:t xml:space="preserve">ventas/cobro.py</w:t>
+        <w:t>ventas/cobro.py</w:t>
       </w:r>
       <w:r>
         <w:t xml:space="preserve"> el cobro y la regla de oro, </w:t>
@@ -1506,7 +1662,7 @@
         <w:rPr>
           <w:rFonts w:ascii="Consolas" w:hAnsi="Consolas" w:cs="Consolas"/>
         </w:rPr>
-        <w:t xml:space="preserve">inventario/compras.py</w:t>
+        <w:t>inventario/compras.py</w:t>
       </w:r>
       <w:r>
         <w:t xml:space="preserve"> las entradas de mercancía, </w:t>
@@ -1515,7 +1671,7 @@
         <w:rPr>
           <w:rFonts w:ascii="Consolas" w:hAnsi="Consolas" w:cs="Consolas"/>
         </w:rPr>
-        <w:t xml:space="preserve">inventario/lotes.py</w:t>
+        <w:t>inventario/lotes.py</w:t>
       </w:r>
       <w:r>
         <w:t xml:space="preserve"> el costo por lotes y </w:t>
@@ -1524,7 +1680,7 @@
         <w:rPr>
           <w:rFonts w:ascii="Consolas" w:hAnsi="Consolas" w:cs="Consolas"/>
         </w:rPr>
-        <w:t xml:space="preserve">inventario/movimientos.py</w:t>
+        <w:t>inventario/movimientos.py</w:t>
       </w:r>
       <w:r>
         <w:t xml:space="preserve"> el kardex. Cualquier regla de negocio nueva debe ponerse ahí y no en una pantalla. Por ejemplo, la regla de que el precio de venta no sea menor al costo está en una sola función de </w:t>
@@ -1533,25 +1689,30 @@
         <w:rPr>
           <w:rFonts w:ascii="Consolas" w:hAnsi="Consolas" w:cs="Consolas"/>
         </w:rPr>
-        <w:t xml:space="preserve">inventario/compras.py</w:t>
-      </w:r>
-      <w:r>
-        <w:t xml:space="preserve">, que usan el formulario de productos, el resurtido, la importación y el asistente.</w:t>
-      </w:r>
-    </w:p>
-    <w:p>
-      <w:pPr>
-        <w:jc w:val="both"/>
-      </w:pPr>
-      <w:r>
-        <w:t xml:space="preserve">El navegador habla con el servidor con peticiones a rutas que responden en JSON (las </w:t>
-      </w:r>
-      <w:r>
-        <w:rPr>
-          <w:rFonts w:ascii="Consolas" w:hAnsi="Consolas" w:cs="Consolas"/>
-        </w:rPr>
-        <w:t xml:space="preserve">api</w:t>
-      </w:r>
+        <w:t>inventario/compras.py</w:t>
+      </w:r>
+      <w:r>
+        <w:t>, que usan el formulario de productos, el resurtido, la importación y el asistente.</w:t>
+      </w:r>
+    </w:p>
+    <w:p>
+      <w:pPr>
+        <w:jc w:val="both"/>
+      </w:pPr>
+      <w:r>
+        <w:t>El navegador habla con el servidor con peticiones a rutas que responden en JSON (</w:t>
+      </w:r>
+      <w:proofErr w:type="gramStart"/>
+      <w:r>
+        <w:t xml:space="preserve">las </w:t>
+      </w:r>
+      <w:r>
+        <w:rPr>
+          <w:rFonts w:ascii="Consolas" w:hAnsi="Consolas" w:cs="Consolas"/>
+        </w:rPr>
+        <w:t>api</w:t>
+      </w:r>
+      <w:proofErr w:type="gramEnd"/>
       <w:r>
         <w:t xml:space="preserve"> de ventas, la búsqueda, el chat y la sincronización) y todas las que modifican datos llevan el código de seguridad de Django. La Tabla 7.1 lista las rutas principales.</w:t>
       </w:r>
@@ -1561,7 +1722,7 @@
         <w:pStyle w:val="Heading2"/>
       </w:pPr>
       <w:r>
-        <w:t xml:space="preserve">B.7 El asistente de inteligencia artificial</w:t>
+        <w:t>B.7 El asistente de inteligencia artificial</w:t>
       </w:r>
     </w:p>
     <w:p>
@@ -1575,7 +1736,7 @@
         <w:rPr>
           <w:rFonts w:ascii="Consolas" w:hAnsi="Consolas" w:cs="Consolas"/>
         </w:rPr>
-        <w:t xml:space="preserve">avi/services.py</w:t>
+        <w:t>avi/services.py</w:t>
       </w:r>
       <w:r>
         <w:t xml:space="preserve">, que ejecutan las mismas operaciones que la interfaz y con las mismas validaciones. A cada mensaje se le manda al modelo solo las funciones de la pantalla donde está el usuario, más las consultas, para gastar menos. La comunicación con las APIs está en </w:t>
@@ -1584,7 +1745,7 @@
         <w:rPr>
           <w:rFonts w:ascii="Consolas" w:hAnsi="Consolas" w:cs="Consolas"/>
         </w:rPr>
-        <w:t xml:space="preserve">avi/clients.py</w:t>
+        <w:t>avi/clients.py</w:t>
       </w:r>
       <w:r>
         <w:t xml:space="preserve">: primero se intenta con Gemini (modelo </w:t>
@@ -1593,27 +1754,36 @@
         <w:rPr>
           <w:rFonts w:ascii="Consolas" w:hAnsi="Consolas" w:cs="Consolas"/>
         </w:rPr>
-        <w:t xml:space="preserve">gemini-2.5-flash</w:t>
-      </w:r>
-      <w:r>
-        <w:t xml:space="preserve">) y, si no responde, con ChatGPT (</w:t>
-      </w:r>
-      <w:r>
-        <w:rPr>
-          <w:rFonts w:ascii="Consolas" w:hAnsi="Consolas" w:cs="Consolas"/>
-        </w:rPr>
-        <w:t xml:space="preserve">gpt-4o-mini</w:t>
-      </w:r>
-      <w:r>
-        <w:t xml:space="preserve">). Si el primer modelo ya alcanzó a ejecutar una acción antes de fallar, no se repite con el segundo, para no duplicarla.</w:t>
-      </w:r>
-    </w:p>
-    <w:p>
-      <w:pPr>
-        <w:jc w:val="both"/>
-      </w:pPr>
-      <w:r>
-        <w:t xml:space="preserve">Para controlar el costo, el sistema contesta directo sin una segunda llamada cuando solo se ejecutaron acciones, guarda el resumen del día y las explicaciones para no pedirlas otra vez y usa un caché del contexto de la tienda. El chat conserva 24 horas de historial. Las explicaciones de reportes, del inicio y del pronóstico se piden aparte y solo se mandan a la API cuando hay datos suficientes.</w:t>
+        <w:t>gemini-2.5-</w:t>
+      </w:r>
+      <w:proofErr w:type="gramStart"/>
+      <w:r>
+        <w:rPr>
+          <w:rFonts w:ascii="Consolas" w:hAnsi="Consolas" w:cs="Consolas"/>
+        </w:rPr>
+        <w:t>flash</w:t>
+      </w:r>
+      <w:proofErr w:type="gramEnd"/>
+      <w:r>
+        <w:t>) y, si no responde, con ChatGPT (</w:t>
+      </w:r>
+      <w:r>
+        <w:rPr>
+          <w:rFonts w:ascii="Consolas" w:hAnsi="Consolas" w:cs="Consolas"/>
+        </w:rPr>
+        <w:t>gpt-4o-mini</w:t>
+      </w:r>
+      <w:r>
+        <w:t>). Si el primer modelo ya alcanzó a ejecutar una acción antes de fallar, no se repite con el segundo, para no duplicarla.</w:t>
+      </w:r>
+    </w:p>
+    <w:p>
+      <w:pPr>
+        <w:jc w:val="both"/>
+      </w:pPr>
+      <w:r>
+        <w:lastRenderedPageBreak/>
+        <w:t>Para controlar el costo, el sistema contesta directo sin una segunda llamada cuando solo se ejecutaron acciones, guarda el resumen del día y las explicaciones para no pedirlas otra vez y usa un caché del contexto de la tienda. El chat conserva 24 horas de historial. Las explicaciones de reportes, del inicio y del pronóstico se piden aparte y solo se mandan a la API cuando hay datos suficientes.</w:t>
       </w:r>
     </w:p>
     <w:p>
@@ -1627,10 +1797,10 @@
         <w:rPr>
           <w:rFonts w:ascii="Consolas" w:hAnsi="Consolas" w:cs="Consolas"/>
         </w:rPr>
-        <w:t xml:space="preserve">avi/clients.py</w:t>
-      </w:r>
-      <w:r>
-        <w:t xml:space="preserve">. Ahí se define que solo atiende temas de la tienda y el mensaje estándar con el que rechaza lo demás, y cualquier cambio en el comportamiento del asistente empieza por ese texto y por las descripciones de las funciones.</w:t>
+        <w:t>avi/clients.py</w:t>
+      </w:r>
+      <w:r>
+        <w:t>. Ahí se define que solo atiende temas de la tienda y el mensaje estándar con el que rechaza lo demás, y cualquier cambio en el comportamiento del asistente empieza por ese texto y por las descripciones de las funciones.</w:t>
       </w:r>
     </w:p>
     <w:p>
@@ -1638,7 +1808,7 @@
         <w:pStyle w:val="Heading2"/>
       </w:pPr>
       <w:r>
-        <w:t xml:space="preserve">B.8 Pronóstico de ventas</w:t>
+        <w:t>B.8 Pronóstico de ventas</w:t>
       </w:r>
     </w:p>
     <w:p>
@@ -1652,19 +1822,27 @@
         <w:rPr>
           <w:rFonts w:ascii="Consolas" w:hAnsi="Consolas" w:cs="Consolas"/>
         </w:rPr>
-        <w:t xml:space="preserve">finanzas/calculos.py</w:t>
-      </w:r>
-      <w:r>
-        <w:t xml:space="preserve"> con los diez productos más vendidos y las ventas de las últimas 26 semanas. Se ajustan tres modelos, una regresión lineal escrita a mano, un ARIMA(1,1,1) y un Holt-Winters aditivo con estacionalidad de cuatro semanas, y se compara el error absoluto medio de cada uno contra las últimas cuatro semanas conocidas. Los modelos no se guardan: se ajustan cada vez que se abre la pantalla, y por eso el resultado se guarda en el caché por tienda y se invalida con cada venta nueva. La pantalla pide primero la base y luego cada modelo por separado, para no bloquearse. Si hay menos días de ventas que los de </w:t>
-      </w:r>
-      <w:r>
-        <w:rPr>
-          <w:rFonts w:ascii="Consolas" w:hAnsi="Consolas" w:cs="Consolas"/>
-        </w:rPr>
-        <w:t xml:space="preserve">PRONOSTICO_MINIMO_DIAS</w:t>
-      </w:r>
-      <w:r>
-        <w:t xml:space="preserve">, el sistema no calcula y avisa por qué.</w:t>
+        <w:t>finanzas/calculos.py</w:t>
+      </w:r>
+      <w:r>
+        <w:t xml:space="preserve"> con los diez productos más vendidos y las ventas de las últimas 26 semanas. Se ajustan tres modelos, una regresión lineal escrita a mano, un </w:t>
+      </w:r>
+      <w:proofErr w:type="gramStart"/>
+      <w:r>
+        <w:t>ARIMA(</w:t>
+      </w:r>
+      <w:proofErr w:type="gramEnd"/>
+      <w:r>
+        <w:t xml:space="preserve">1,1,1) y un Holt-Winters aditivo con estacionalidad de cuatro semanas, y se compara el error absoluto medio de cada uno contra las últimas cuatro semanas conocidas. Los modelos no se guardan: se ajustan cada vez que se abre la pantalla, y por eso el resultado se guarda en el caché por tienda y se invalida con cada venta nueva. La pantalla pide primero la base y luego cada modelo por separado, para no bloquearse. Si hay menos días de ventas que los de </w:t>
+      </w:r>
+      <w:r>
+        <w:rPr>
+          <w:rFonts w:ascii="Consolas" w:hAnsi="Consolas" w:cs="Consolas"/>
+        </w:rPr>
+        <w:t>PRONOSTICO_MINIMO_DIAS</w:t>
+      </w:r>
+      <w:r>
+        <w:t>, el sistema no calcula y avisa por qué.</w:t>
       </w:r>
     </w:p>
     <w:p>
@@ -1672,30 +1850,30 @@
         <w:pStyle w:val="Heading2"/>
       </w:pPr>
       <w:r>
-        <w:t xml:space="preserve">B.9 Funcionamiento sin internet</w:t>
-      </w:r>
-    </w:p>
-    <w:p>
-      <w:pPr>
-        <w:jc w:val="both"/>
-      </w:pPr>
-      <w:r>
-        <w:t xml:space="preserve">Las pantallas principales las guarda un service worker (</w:t>
-      </w:r>
-      <w:r>
-        <w:rPr>
-          <w:rFonts w:ascii="Consolas" w:hAnsi="Consolas" w:cs="Consolas"/>
-        </w:rPr>
-        <w:t xml:space="preserve">static/sw.js</w:t>
-      </w:r>
-      <w:r>
-        <w:t xml:space="preserve">) para poder abrirlas sin conexión. Los archivos propios de estilos y scripts se piden primero al servidor y solo se usa la copia guardada cuando no hay internet, así no se quedan versiones viejas; cuando se cambia la lógica del service worker conviene subir su número de versión. Los datos no se guardan ahí: lo que se hace sin conexión se pone en una cola en el navegador (</w:t>
-      </w:r>
-      <w:r>
-        <w:rPr>
-          <w:rFonts w:ascii="Consolas" w:hAnsi="Consolas" w:cs="Consolas"/>
-        </w:rPr>
-        <w:t xml:space="preserve">static/js/sinconexion.js</w:t>
+        <w:t>B.9 Funcionamiento sin internet</w:t>
+      </w:r>
+    </w:p>
+    <w:p>
+      <w:pPr>
+        <w:jc w:val="both"/>
+      </w:pPr>
+      <w:r>
+        <w:t>Las pantallas principales las guarda un service worker (</w:t>
+      </w:r>
+      <w:r>
+        <w:rPr>
+          <w:rFonts w:ascii="Consolas" w:hAnsi="Consolas" w:cs="Consolas"/>
+        </w:rPr>
+        <w:t>static/sw.js</w:t>
+      </w:r>
+      <w:r>
+        <w:t>) para poder abrirlas sin conexión. Los archivos propios de estilos y scripts se piden primero al servidor y solo se usa la copia guardada cuando no hay internet, así no se quedan versiones viejas; cuando se cambia la lógica del service worker conviene subir su número de versión. Los datos no se guardan ahí: lo que se hace sin conexión se pone en una cola en el navegador (</w:t>
+      </w:r>
+      <w:r>
+        <w:rPr>
+          <w:rFonts w:ascii="Consolas" w:hAnsi="Consolas" w:cs="Consolas"/>
+        </w:rPr>
+        <w:t>static/js/sinconexion.js</w:t>
       </w:r>
       <w:r>
         <w:t xml:space="preserve">) y se manda al servidor al regresar el internet, donde </w:t>
@@ -1704,7 +1882,7 @@
         <w:rPr>
           <w:rFonts w:ascii="Consolas" w:hAnsi="Consolas" w:cs="Consolas"/>
         </w:rPr>
-        <w:t xml:space="preserve">core/sync.py</w:t>
+        <w:t>core/sync.py</w:t>
       </w:r>
       <w:r>
         <w:t xml:space="preserve"> lo aplica. Cada operación lleva un identificador único, así que si se manda dos veces solo se guarda una.</w:t>
@@ -1715,15 +1893,15 @@
         <w:pStyle w:val="Heading2"/>
       </w:pPr>
       <w:r>
-        <w:t xml:space="preserve">B.10 Seguridad</w:t>
-      </w:r>
-    </w:p>
-    <w:p>
-      <w:pPr>
-        <w:jc w:val="both"/>
-      </w:pPr>
-      <w:r>
-        <w:t xml:space="preserve">El acceso se controla con sesiones de Django. Las contraseñas se guardan con los algoritmos de la biblioteca, pasan por los validadores de contraseñas y no pueden recuperarse, solo restablecerse por correo. Se puede iniciar sesión con el correo o con el teléfono. Los formularios y las peticiones que cambian datos llevan el código CSRF, y cada consulta se filtra por la tienda del usuario, de modo que una tienda no puede ver ni modificar los datos de otra. Las llaves de las APIs se cifran en la base de datos y nunca llegan al navegador. Al crear la cuenta se guarda la fecha en que se aceptaron los términos y condiciones.</w:t>
+        <w:t>B.10 Seguridad</w:t>
+      </w:r>
+    </w:p>
+    <w:p>
+      <w:pPr>
+        <w:jc w:val="both"/>
+      </w:pPr>
+      <w:r>
+        <w:t>El acceso se controla con sesiones de Django. Las contraseñas se guardan con los algoritmos de la biblioteca, pasan por los validadores de contraseñas y no pueden recuperarse, solo restablecerse por correo. Se puede iniciar sesión con el correo o con el teléfono. Los formularios y las peticiones que cambian datos llevan el código CSRF, y cada consulta se filtra por la tienda del usuario, de modo que una tienda no puede ver ni modificar los datos de otra. Las llaves de las APIs se cifran en la base de datos y nunca llegan al navegador. Al crear la cuenta se guarda la fecha en que se aceptaron los términos y condiciones.</w:t>
       </w:r>
     </w:p>
     <w:p>
@@ -1737,7 +1915,7 @@
         <w:rPr>
           <w:rFonts w:ascii="Consolas" w:hAnsi="Consolas" w:cs="Consolas"/>
         </w:rPr>
-        <w:t xml:space="preserve">DJANGO_SECRET_KEY</w:t>
+        <w:t>DJANGO_SECRET_KEY</w:t>
       </w:r>
       <w:r>
         <w:t xml:space="preserve">, </w:t>
@@ -1746,7 +1924,7 @@
         <w:rPr>
           <w:rFonts w:ascii="Consolas" w:hAnsi="Consolas" w:cs="Consolas"/>
         </w:rPr>
-        <w:t xml:space="preserve">DJANGO_DEBUG=False</w:t>
+        <w:t>DJANGO_DEBUG=False</w:t>
       </w:r>
       <w:r>
         <w:t xml:space="preserve">, </w:t>
@@ -1755,7 +1933,7 @@
         <w:rPr>
           <w:rFonts w:ascii="Consolas" w:hAnsi="Consolas" w:cs="Consolas"/>
         </w:rPr>
-        <w:t xml:space="preserve">ALLOWED_HOSTS</w:t>
+        <w:t>ALLOWED_HOSTS</w:t>
       </w:r>
       <w:r>
         <w:t xml:space="preserve"> y </w:t>
@@ -1764,7 +1942,7 @@
         <w:rPr>
           <w:rFonts w:ascii="Consolas" w:hAnsi="Consolas" w:cs="Consolas"/>
         </w:rPr>
-        <w:t xml:space="preserve">CSRF_TRUSTED_ORIGINS</w:t>
+        <w:t>CSRF_TRUSTED_ORIGINS</w:t>
       </w:r>
       <w:r>
         <w:t xml:space="preserve">, y activarse </w:t>
@@ -1773,10 +1951,14 @@
         <w:rPr>
           <w:rFonts w:ascii="Consolas" w:hAnsi="Consolas" w:cs="Consolas"/>
         </w:rPr>
-        <w:t xml:space="preserve">USAR_HTTPS=True</w:t>
-      </w:r>
-      <w:r>
-        <w:t xml:space="preserve">, que redirige a HTTPS y marca las cookies como seguras. Los temas de TLS 1.3, cifrado en reposo y OAuth 2.0 que se mencionan en los términos y condiciones son lo que se recomendaría en un entorno productivo y no están implementados en el prototipo.</w:t>
+        <w:t>USAR_HTTPS=True</w:t>
+      </w:r>
+      <w:r>
+        <w:t xml:space="preserve">, que redirige a HTTPS y marca las cookies como seguras. Los temas de TLS 1.3, cifrado en reposo y OAuth 2.0 </w:t>
+      </w:r>
+      <w:r>
+        <w:lastRenderedPageBreak/>
+        <w:t>que se mencionan en los términos y condiciones son lo que se recomendaría en un entorno productivo y no están implementados en el prototipo.</w:t>
       </w:r>
     </w:p>
     <w:p>
@@ -1784,42 +1966,570 @@
         <w:pStyle w:val="Heading2"/>
       </w:pPr>
       <w:r>
-        <w:t xml:space="preserve">B.11 Despliegue</w:t>
-      </w:r>
-    </w:p>
-    <w:p>
-      <w:pPr>
-        <w:jc w:val="both"/>
-      </w:pPr>
-      <w:r>
-        <w:rPr>
-          <w:highlight w:val="yellow"/>
-        </w:rPr>
-        <w:t xml:space="preserve">El caché del sistema es el de memoria de Django, que vive dentro de cada proceso. Con un solo proceso funciona bien, pero si el servidor ejecuta varios procesos cada uno tendría su propio caché y las invalidaciones no se compartirían, así que en un despliegue con varios procesos habría que cambiarlo por uno compartido, por ejemplo Redis. [COMPLETAR cuando se haga el despliegue en Azure: servicio utilizado, cómo se publican los archivos estáticos, variables de entorno configuradas, dirección final y problemas encontrados]</w:t>
-      </w:r>
+        <w:t>B.11 Despliegue</w:t>
+      </w:r>
+    </w:p>
+    <w:p>
+      <w:pPr>
+        <w:jc w:val="both"/>
+      </w:pPr>
+      <w:r>
+        <w:t>s</w:t>
+      </w:r>
+      <w:r>
+        <w:rPr>
+          <w:lang w:eastAsia="en-US"/>
+        </w:rPr>
+        <w:t xml:space="preserve"> </w:t>
+      </w:r>
+      <w:r>
+        <w:t xml:space="preserve">Originalmente se tenía planeado utilizar Microsoft Azure para alojar una imagen del frontend y mantener el sitio visible en internet la mayor parte del día, aunque la funcionalidad completa dependiera de encender el backend de forma local desde nuestras computadoras. Sin embargo, al vencerse los créditos educativos de Azure y resultar inviable absorber los costos mensuales de un servidor en la nube comercial, se cambió de estrategia hacia una solución práctica bajo el principio de </w:t>
+      </w:r>
+      <w:r>
+        <w:rPr>
+          <w:i/>
+          <w:iCs/>
+        </w:rPr>
+        <w:t>Zero-CapEx</w:t>
+      </w:r>
+      <w:r>
+        <w:t xml:space="preserve">: el uso de </w:t>
+      </w:r>
+      <w:r>
+        <w:rPr>
+          <w:b/>
+          <w:bCs/>
+        </w:rPr>
+        <w:t>Cloudflare Tunnel (cloudflared)</w:t>
+      </w:r>
+      <w:r>
+        <w:t xml:space="preserve"> junto con un dominio propio.</w:t>
+      </w:r>
+    </w:p>
+    <w:p>
+      <w:pPr>
+        <w:jc w:val="both"/>
+        <w:rPr>
+          <w:b/>
+          <w:bCs/>
+        </w:rPr>
+      </w:pPr>
+      <w:r>
+        <w:rPr>
+          <w:b/>
+          <w:bCs/>
+        </w:rPr>
+        <w:t>Arquitectura de publicación adoptada</w:t>
+      </w:r>
+    </w:p>
+    <w:p>
+      <w:pPr>
+        <w:jc w:val="both"/>
+      </w:pPr>
+      <w:r>
+        <w:t>En lugar de pagar hospedaje mensual, la computadora portátil funciona como el servidor integral del sistema (alojando tanto la base de datos PostgreSQL como el backend monolítico de Django). Para exponerlo a internet de forma segura sin contratar una IP pública fija ni abrir puertos en el módem de casa, se utiliza el cliente gratuito cloudflared.</w:t>
+      </w:r>
+    </w:p>
+    <w:p>
+      <w:pPr>
+        <w:numPr>
+          <w:ilvl w:val="0"/>
+          <w:numId w:val="3"/>
+        </w:numPr>
+        <w:jc w:val="both"/>
+      </w:pPr>
+      <w:r>
+        <w:rPr>
+          <w:b/>
+          <w:bCs/>
+        </w:rPr>
+        <w:t>Dominio adquirido:</w:t>
+      </w:r>
+      <w:r>
+        <w:t xml:space="preserve"> Se compró el dominio propio maria-asistente-prototipo con una inversión única de $120.00 MXN. Al vincular este dominio al plan gratuito de Cloudflare, se aprovecha su red global y sus certificados de seguridad sin generar ningún pago recurrente adicional.</w:t>
+      </w:r>
+    </w:p>
+    <w:p>
+      <w:pPr>
+        <w:numPr>
+          <w:ilvl w:val="0"/>
+          <w:numId w:val="3"/>
+        </w:numPr>
+        <w:jc w:val="both"/>
+      </w:pPr>
+      <w:r>
+        <w:rPr>
+          <w:b/>
+          <w:bCs/>
+        </w:rPr>
+        <w:t>Condición operativa:</w:t>
+      </w:r>
+      <w:r>
+        <w:t xml:space="preserve"> Al ser un despliegue asistido por hardware local, el prototipo responde en internet exclusivamente mientras la computadora del proyecto permanezca encendida, conectada a la red y ejecutando tanto el servidor de Django como el túnel de Cloudflare.</w:t>
+      </w:r>
+    </w:p>
+    <w:p>
+      <w:pPr>
+        <w:jc w:val="both"/>
+        <w:rPr>
+          <w:b/>
+          <w:bCs/>
+        </w:rPr>
+      </w:pPr>
+      <w:r>
+        <w:rPr>
+          <w:b/>
+          <w:bCs/>
+        </w:rPr>
+        <w:t>Configuración y puesta en marcha</w:t>
+      </w:r>
+    </w:p>
+    <w:p>
+      <w:pPr>
+        <w:jc w:val="both"/>
+      </w:pPr>
+      <w:r>
+        <w:t>Para poner en línea el sistema hacia el dominio público se siguen estos pasos:</w:t>
+      </w:r>
+    </w:p>
+    <w:p>
+      <w:pPr>
+        <w:numPr>
+          <w:ilvl w:val="0"/>
+          <w:numId w:val="4"/>
+        </w:numPr>
+        <w:jc w:val="both"/>
+      </w:pPr>
+      <w:r>
+        <w:rPr>
+          <w:b/>
+          <w:bCs/>
+        </w:rPr>
+        <w:t xml:space="preserve">Configurar el </w:t>
+      </w:r>
+      <w:proofErr w:type="gramStart"/>
+      <w:r>
+        <w:rPr>
+          <w:b/>
+          <w:bCs/>
+        </w:rPr>
+        <w:t>archivo .env</w:t>
+      </w:r>
+      <w:proofErr w:type="gramEnd"/>
+      <w:r>
+        <w:rPr>
+          <w:b/>
+          <w:bCs/>
+        </w:rPr>
+        <w:t>:</w:t>
+      </w:r>
+      <w:r>
+        <w:t xml:space="preserve"> En la computadora anfitriona se agregan el dominio y las políticas de seguridad para que Django acepte peticiones desde el exterior:</w:t>
+      </w:r>
+    </w:p>
+    <w:p>
+      <w:pPr>
+        <w:jc w:val="both"/>
+        <w:rPr>
+          <w:lang w:val="en-US"/>
+        </w:rPr>
+      </w:pPr>
+      <w:r>
+        <w:rPr>
+          <w:lang w:val="en-US"/>
+        </w:rPr>
+        <w:t>cd "F:\prototipo_versiones\Prototype_Finance_Agent_GraduationProject"</w:t>
+      </w:r>
+    </w:p>
+    <w:p>
+      <w:pPr>
+        <w:jc w:val="both"/>
+        <w:rPr>
+          <w:lang w:val="en-US"/>
+        </w:rPr>
+      </w:pPr>
+      <w:r>
+        <w:rPr>
+          <w:lang w:val="en-US"/>
+        </w:rPr>
+        <w:t>.\.venv\Scripts\Activate.ps1</w:t>
+      </w:r>
+    </w:p>
+    <w:p>
+      <w:pPr>
+        <w:jc w:val="both"/>
+        <w:rPr>
+          <w:lang w:val="en-US"/>
+        </w:rPr>
+      </w:pPr>
+    </w:p>
+    <w:p>
+      <w:pPr>
+        <w:jc w:val="both"/>
+        <w:rPr>
+          <w:lang w:val="en-US"/>
+        </w:rPr>
+      </w:pPr>
+      <w:r>
+        <w:rPr>
+          <w:lang w:val="en-US"/>
+        </w:rPr>
+        <w:t>$</w:t>
+      </w:r>
+      <w:proofErr w:type="gramStart"/>
+      <w:r>
+        <w:rPr>
+          <w:lang w:val="en-US"/>
+        </w:rPr>
+        <w:t>env:DJANGO</w:t>
+      </w:r>
+      <w:proofErr w:type="gramEnd"/>
+      <w:r>
+        <w:rPr>
+          <w:lang w:val="en-US"/>
+        </w:rPr>
+        <w:t>_DEBUG = "True"</w:t>
+      </w:r>
+    </w:p>
+    <w:p>
+      <w:pPr>
+        <w:jc w:val="both"/>
+        <w:rPr>
+          <w:lang w:val="en-US"/>
+        </w:rPr>
+      </w:pPr>
+      <w:r>
+        <w:rPr>
+          <w:lang w:val="en-US"/>
+        </w:rPr>
+        <w:t>$</w:t>
+      </w:r>
+      <w:proofErr w:type="gramStart"/>
+      <w:r>
+        <w:rPr>
+          <w:lang w:val="en-US"/>
+        </w:rPr>
+        <w:t>env:ALLOWED</w:t>
+      </w:r>
+      <w:proofErr w:type="gramEnd"/>
+      <w:r>
+        <w:rPr>
+          <w:lang w:val="en-US"/>
+        </w:rPr>
+        <w:t>_HOSTS = "127.0.0.</w:t>
+      </w:r>
+      <w:proofErr w:type="gramStart"/>
+      <w:r>
+        <w:rPr>
+          <w:lang w:val="en-US"/>
+        </w:rPr>
+        <w:t>1,localhost</w:t>
+      </w:r>
+      <w:proofErr w:type="gramEnd"/>
+      <w:r>
+        <w:rPr>
+          <w:lang w:val="en-US"/>
+        </w:rPr>
+        <w:t>,demo.maria-prototipo-asistente.com"</w:t>
+      </w:r>
+    </w:p>
+    <w:p>
+      <w:pPr>
+        <w:jc w:val="both"/>
+        <w:rPr>
+          <w:lang w:val="en-US"/>
+        </w:rPr>
+      </w:pPr>
+      <w:r>
+        <w:rPr>
+          <w:lang w:val="en-US"/>
+        </w:rPr>
+        <w:t>$</w:t>
+      </w:r>
+      <w:proofErr w:type="gramStart"/>
+      <w:r>
+        <w:rPr>
+          <w:lang w:val="en-US"/>
+        </w:rPr>
+        <w:t>env:CSRF</w:t>
+      </w:r>
+      <w:proofErr w:type="gramEnd"/>
+      <w:r>
+        <w:rPr>
+          <w:lang w:val="en-US"/>
+        </w:rPr>
+        <w:t>_TRUSTED_ORIGINS = "https://demo.maria-prototipo-asistente.com"</w:t>
+      </w:r>
+    </w:p>
+    <w:p>
+      <w:pPr>
+        <w:jc w:val="both"/>
+        <w:rPr>
+          <w:lang w:val="en-US"/>
+        </w:rPr>
+      </w:pPr>
+      <w:r>
+        <w:rPr>
+          <w:lang w:val="en-US"/>
+        </w:rPr>
+        <w:t>$</w:t>
+      </w:r>
+      <w:proofErr w:type="gramStart"/>
+      <w:r>
+        <w:rPr>
+          <w:lang w:val="en-US"/>
+        </w:rPr>
+        <w:t>env:USAR</w:t>
+      </w:r>
+      <w:proofErr w:type="gramEnd"/>
+      <w:r>
+        <w:rPr>
+          <w:lang w:val="en-US"/>
+        </w:rPr>
+        <w:t>_HTTPS = "False"</w:t>
+      </w:r>
+    </w:p>
+    <w:p>
+      <w:pPr>
+        <w:jc w:val="both"/>
+        <w:rPr>
+          <w:lang w:val="en-US"/>
+        </w:rPr>
+      </w:pPr>
+    </w:p>
+    <w:p>
+      <w:pPr>
+        <w:numPr>
+          <w:ilvl w:val="0"/>
+          <w:numId w:val="4"/>
+        </w:numPr>
+        <w:jc w:val="both"/>
+      </w:pPr>
+      <w:r>
+        <w:rPr>
+          <w:b/>
+          <w:bCs/>
+        </w:rPr>
+        <w:lastRenderedPageBreak/>
+        <w:t>Iniciar el servidor local:</w:t>
+      </w:r>
+      <w:r>
+        <w:t xml:space="preserve"> Desde la terminal con el entorno virtual activo, se arranca Django:</w:t>
+      </w:r>
+    </w:p>
+    <w:p>
+      <w:pPr>
+        <w:jc w:val="both"/>
+        <w:rPr>
+          <w:lang w:val="en-US"/>
+        </w:rPr>
+      </w:pPr>
+      <w:r>
+        <w:rPr>
+          <w:lang w:val="en-US"/>
+        </w:rPr>
+        <w:t>python manage.py check</w:t>
+      </w:r>
+    </w:p>
+    <w:p>
+      <w:pPr>
+        <w:jc w:val="both"/>
+        <w:rPr>
+          <w:lang w:val="en-US"/>
+        </w:rPr>
+      </w:pPr>
+      <w:r>
+        <w:rPr>
+          <w:lang w:val="en-US"/>
+        </w:rPr>
+        <w:t>python manage.py runserver 127.0.0.1:8000</w:t>
+      </w:r>
+    </w:p>
+    <w:p>
+      <w:pPr>
+        <w:numPr>
+          <w:ilvl w:val="0"/>
+          <w:numId w:val="4"/>
+        </w:numPr>
+        <w:jc w:val="both"/>
+      </w:pPr>
+      <w:r>
+        <w:rPr>
+          <w:b/>
+          <w:bCs/>
+        </w:rPr>
+        <w:t>Iniciar el túnel de Cloudflare:</w:t>
+      </w:r>
+      <w:r>
+        <w:t xml:space="preserve"> En una segunda terminal, se lanza el conector cloudflared configurado para redirigir el tráfico del dominio hacia el puerto local:</w:t>
+      </w:r>
+    </w:p>
+    <w:p>
+      <w:pPr>
+        <w:jc w:val="both"/>
+        <w:rPr>
+          <w:lang w:val="en-US"/>
+        </w:rPr>
+      </w:pPr>
+      <w:r>
+        <w:rPr>
+          <w:lang w:val="en-US"/>
+        </w:rPr>
+        <w:t>$exe = "$</w:t>
+      </w:r>
+      <w:proofErr w:type="gramStart"/>
+      <w:r>
+        <w:rPr>
+          <w:lang w:val="en-US"/>
+        </w:rPr>
+        <w:t>env:USERPROFILE\Downloads\cloudflared-windows-amd64.exe</w:t>
+      </w:r>
+      <w:proofErr w:type="gramEnd"/>
+      <w:r>
+        <w:rPr>
+          <w:lang w:val="en-US"/>
+        </w:rPr>
+        <w:t>"</w:t>
+      </w:r>
+    </w:p>
+    <w:p>
+      <w:pPr>
+        <w:jc w:val="both"/>
+        <w:rPr>
+          <w:lang w:val="en-US"/>
+        </w:rPr>
+      </w:pPr>
+      <w:r>
+        <w:rPr>
+          <w:lang w:val="en-US"/>
+        </w:rPr>
+        <w:t>$secureToken = Read-Host "Pega el token del túnel de Cloudflare" -AsSecureString</w:t>
+      </w:r>
+    </w:p>
+    <w:p>
+      <w:pPr>
+        <w:jc w:val="both"/>
+        <w:rPr>
+          <w:lang w:val="en-US"/>
+        </w:rPr>
+      </w:pPr>
+      <w:r>
+        <w:rPr>
+          <w:lang w:val="en-US"/>
+        </w:rPr>
+        <w:t>$token = [System.Net.NetworkCredential</w:t>
+      </w:r>
+      <w:proofErr w:type="gramStart"/>
+      <w:r>
+        <w:rPr>
+          <w:lang w:val="en-US"/>
+        </w:rPr>
+        <w:t>]::new(</w:t>
+      </w:r>
+      <w:proofErr w:type="gramEnd"/>
+      <w:r>
+        <w:rPr>
+          <w:lang w:val="en-US"/>
+        </w:rPr>
+        <w:t>"", $secureToken</w:t>
+      </w:r>
+      <w:proofErr w:type="gramStart"/>
+      <w:r>
+        <w:rPr>
+          <w:lang w:val="en-US"/>
+        </w:rPr>
+        <w:t>).Password</w:t>
+      </w:r>
+      <w:proofErr w:type="gramEnd"/>
+    </w:p>
+    <w:p>
+      <w:pPr>
+        <w:jc w:val="both"/>
+        <w:rPr>
+          <w:lang w:val="en-US"/>
+        </w:rPr>
+      </w:pPr>
+      <w:r>
+        <w:rPr>
+          <w:lang w:val="en-US"/>
+        </w:rPr>
+        <w:t>&amp; $exe tunnel run --token $token</w:t>
+      </w:r>
+    </w:p>
+    <w:p>
+      <w:pPr>
+        <w:jc w:val="both"/>
+      </w:pPr>
+    </w:p>
+    <w:p>
+      <w:pPr>
+        <w:jc w:val="both"/>
+        <w:rPr>
+          <w:b/>
+          <w:bCs/>
+        </w:rPr>
+      </w:pPr>
+      <w:r>
+        <w:rPr>
+          <w:b/>
+          <w:bCs/>
+        </w:rPr>
+        <w:t>Archivos estáticos y consideraciones</w:t>
+      </w:r>
+    </w:p>
+    <w:p>
+      <w:pPr>
+        <w:jc w:val="both"/>
+      </w:pPr>
+      <w:r>
+        <w:t>Los archivos estáticos (hojas de estilo CSS, scripts de JavaScript e imágenes) se sirven directamente a través de Django hacia la conexión tunelizada.</w:t>
+      </w:r>
+    </w:p>
+    <w:p>
+      <w:pPr>
+        <w:jc w:val="both"/>
+      </w:pPr>
+      <w:r>
+        <w:t xml:space="preserve">El principal detalle técnico resuelto durante este despliegue fue el bloqueo de formularios por seguridad (error </w:t>
+      </w:r>
+      <w:r>
+        <w:rPr>
+          <w:i/>
+          <w:iCs/>
+        </w:rPr>
+        <w:t>403 Forbidden - CSRF verification failed</w:t>
+      </w:r>
+      <w:r>
+        <w:t>): al acceder mediante el dominio público, Django exige de forma estricta que la dirección completa con https:// esté registrada en CSRF_TRUSTED_ORIGINS. Una vez agregada, el cobro, el inicio de sesión y la sincronización operan con normalidad desde cualquier dispositivo móvil o computadora externa que ingrese a la dirección web.</w:t>
+      </w:r>
+    </w:p>
+    <w:p>
+      <w:pPr>
+        <w:jc w:val="both"/>
+      </w:pPr>
     </w:p>
     <w:p>
       <w:pPr>
         <w:pStyle w:val="Heading2"/>
       </w:pPr>
       <w:r>
-        <w:t xml:space="preserve">B.12 Problemas frecuentes</w:t>
-      </w:r>
-    </w:p>
-    <w:p>
-      <w:pPr>
-        <w:jc w:val="both"/>
-      </w:pPr>
-      <w:r>
-        <w:t xml:space="preserve">La Tabla B.2 reúne los problemas que más se presentaron durante el desarrollo y cómo resolverlos.</w:t>
-      </w:r>
-    </w:p>
-    <w:p>
-      <w:pPr>
-        <w:jc w:val="both"/>
-      </w:pPr>
-      <w:r>
-        <w:t xml:space="preserve">Tabla B.2. Problemas frecuentes y su solución.</w:t>
+        <w:t>B.12 Problemas frecuentes</w:t>
+      </w:r>
+    </w:p>
+    <w:p>
+      <w:pPr>
+        <w:jc w:val="both"/>
+      </w:pPr>
+      <w:r>
+        <w:t>La Tabla B.2 reúne los problemas que más se presentaron durante el desarrollo y cómo resolverlos.</w:t>
+      </w:r>
+    </w:p>
+    <w:p>
+      <w:pPr>
+        <w:jc w:val="both"/>
+      </w:pPr>
+      <w:r>
+        <w:t>Tabla B.2. Problemas frecuentes y su solución.</w:t>
       </w:r>
     </w:p>
     <w:tbl>
@@ -1827,7 +2537,7 @@
         <w:tblStyle w:val="TableGrid"/>
         <w:tblW w:w="9399" w:type="dxa"/>
         <w:tblLayout w:type="fixed"/>
-        <w:tblLook w:val="04A0"/>
+        <w:tblLook w:val="04A0" w:firstRow="1" w:lastRow="0" w:firstColumn="1" w:lastColumn="0" w:noHBand="0" w:noVBand="1"/>
       </w:tblPr>
       <w:tblGrid>
         <w:gridCol w:w="2577"/>
@@ -1855,7 +2565,7 @@
                 <w:sz w:val="20"/>
                 <w:szCs w:val="20"/>
               </w:rPr>
-              <w:t xml:space="preserve">Problema</w:t>
+              <w:t>Problema</w:t>
             </w:r>
           </w:p>
         </w:tc>
@@ -1875,7 +2585,7 @@
                 <w:sz w:val="20"/>
                 <w:szCs w:val="20"/>
               </w:rPr>
-              <w:t xml:space="preserve">Causa probable</w:t>
+              <w:t>Causa probable</w:t>
             </w:r>
           </w:p>
         </w:tc>
@@ -1895,7 +2605,7 @@
                 <w:sz w:val="20"/>
                 <w:szCs w:val="20"/>
               </w:rPr>
-              <w:t xml:space="preserve">Qué hacer</w:t>
+              <w:t>Qué hacer</w:t>
             </w:r>
           </w:p>
         </w:tc>
@@ -1917,7 +2627,7 @@
                 <w:sz w:val="20"/>
                 <w:szCs w:val="20"/>
               </w:rPr>
-              <w:t xml:space="preserve">El chat dice que no pudo conectarse</w:t>
+              <w:t>El chat dice que no pudo conectarse</w:t>
             </w:r>
           </w:p>
         </w:tc>
@@ -1934,7 +2644,7 @@
                 <w:sz w:val="20"/>
                 <w:szCs w:val="20"/>
               </w:rPr>
-              <w:t xml:space="preserve">Ninguna llave configurada, sin saldo o servicio saturado</w:t>
+              <w:t>Ninguna llave configurada, sin saldo o servicio saturado</w:t>
             </w:r>
           </w:p>
         </w:tc>
@@ -1959,14 +2669,14 @@
                 <w:sz w:val="20"/>
                 <w:szCs w:val="20"/>
               </w:rPr>
-              <w:t xml:space="preserve">configurar_ia --ver</w:t>
-            </w:r>
-            <w:r>
-              <w:rPr>
-                <w:sz w:val="20"/>
-                <w:szCs w:val="20"/>
-              </w:rPr>
-              <w:t xml:space="preserve">; el sistema ya intenta con el segundo proveedor</w:t>
+              <w:t>configurar_ia --ver</w:t>
+            </w:r>
+            <w:r>
+              <w:rPr>
+                <w:sz w:val="20"/>
+                <w:szCs w:val="20"/>
+              </w:rPr>
+              <w:t>; el sistema ya intenta con el segundo proveedor</w:t>
             </w:r>
           </w:p>
         </w:tc>
@@ -1988,7 +2698,7 @@
                 <w:sz w:val="20"/>
                 <w:szCs w:val="20"/>
               </w:rPr>
-              <w:t xml:space="preserve">Las llaves guardadas ya no funcionan</w:t>
+              <w:t>Las llaves guardadas ya no funcionan</w:t>
             </w:r>
           </w:p>
         </w:tc>
@@ -2013,7 +2723,7 @@
                 <w:sz w:val="20"/>
                 <w:szCs w:val="20"/>
               </w:rPr>
-              <w:t xml:space="preserve">DJANGO_SECRET_KEY</w:t>
+              <w:t>DJANGO_SECRET_KEY</w:t>
             </w:r>
           </w:p>
         </w:tc>
@@ -2038,7 +2748,7 @@
                 <w:sz w:val="20"/>
                 <w:szCs w:val="20"/>
               </w:rPr>
-              <w:t xml:space="preserve">configurar_ia</w:t>
+              <w:t>configurar_ia</w:t>
             </w:r>
           </w:p>
         </w:tc>
@@ -2060,7 +2770,7 @@
                 <w:sz w:val="20"/>
                 <w:szCs w:val="20"/>
               </w:rPr>
-              <w:t xml:space="preserve">Error al iniciar por una tabla que no existe</w:t>
+              <w:t>Error al iniciar por una tabla que no existe</w:t>
             </w:r>
           </w:p>
         </w:tc>
@@ -2077,7 +2787,7 @@
                 <w:sz w:val="20"/>
                 <w:szCs w:val="20"/>
               </w:rPr>
-              <w:t xml:space="preserve">Faltan migraciones</w:t>
+              <w:t>Faltan migraciones</w:t>
             </w:r>
           </w:p>
         </w:tc>
@@ -2088,11 +2798,15 @@
           <w:p>
             <w:pPr>
               <w:spacing w:before="40" w:after="40" w:line="240" w:lineRule="auto"/>
-            </w:pPr>
-            <w:r>
-              <w:rPr>
-                <w:sz w:val="20"/>
-                <w:szCs w:val="20"/>
+              <w:rPr>
+                <w:lang w:val="en-US"/>
+              </w:rPr>
+            </w:pPr>
+            <w:r>
+              <w:rPr>
+                <w:sz w:val="20"/>
+                <w:szCs w:val="20"/>
+                <w:lang w:val="en-US"/>
               </w:rPr>
               <w:t xml:space="preserve">Correr </w:t>
             </w:r>
@@ -2101,8 +2815,9 @@
                 <w:rFonts w:ascii="Consolas" w:hAnsi="Consolas" w:cs="Consolas"/>
                 <w:sz w:val="20"/>
                 <w:szCs w:val="20"/>
-              </w:rPr>
-              <w:t xml:space="preserve">python manage.py migrate</w:t>
+                <w:lang w:val="en-US"/>
+              </w:rPr>
+              <w:t>python manage.py migrate</w:t>
             </w:r>
           </w:p>
         </w:tc>
@@ -2125,7 +2840,7 @@
                 <w:sz w:val="20"/>
                 <w:szCs w:val="20"/>
               </w:rPr>
-              <w:t xml:space="preserve">configurar_ia</w:t>
+              <w:t>configurar_ia</w:t>
             </w:r>
             <w:r>
               <w:rPr>
@@ -2157,7 +2872,7 @@
                 <w:sz w:val="20"/>
                 <w:szCs w:val="20"/>
               </w:rPr>
-              <w:t xml:space="preserve">migrate</w:t>
+              <w:t>migrate</w:t>
             </w:r>
           </w:p>
         </w:tc>
@@ -2182,7 +2897,7 @@
                 <w:sz w:val="20"/>
                 <w:szCs w:val="20"/>
               </w:rPr>
-              <w:t xml:space="preserve">migrate</w:t>
+              <w:t>migrate</w:t>
             </w:r>
           </w:p>
         </w:tc>
@@ -2204,7 +2919,7 @@
                 <w:sz w:val="20"/>
                 <w:szCs w:val="20"/>
               </w:rPr>
-              <w:t xml:space="preserve">Una pantalla se ve con estilos o comportamiento viejo</w:t>
+              <w:t>Una pantalla se ve con estilos o comportamiento viejo</w:t>
             </w:r>
           </w:p>
         </w:tc>
@@ -2221,7 +2936,7 @@
                 <w:sz w:val="20"/>
                 <w:szCs w:val="20"/>
               </w:rPr>
-              <w:t xml:space="preserve">El navegador tiene guardada una versión anterior</w:t>
+              <w:t>El navegador tiene guardada una versión anterior</w:t>
             </w:r>
           </w:p>
         </w:tc>
@@ -2238,7 +2953,7 @@
                 <w:sz w:val="20"/>
                 <w:szCs w:val="20"/>
               </w:rPr>
-              <w:t xml:space="preserve">Recargar con Ctrl+F5; si persiste, borrar los datos del sitio</w:t>
+              <w:t>Recargar con Ctrl+F5; si persiste, borrar los datos del sitio</w:t>
             </w:r>
           </w:p>
         </w:tc>
@@ -2260,7 +2975,8 @@
                 <w:sz w:val="20"/>
                 <w:szCs w:val="20"/>
               </w:rPr>
-              <w:t xml:space="preserve">El dictado por voz no responde</w:t>
+              <w:lastRenderedPageBreak/>
+              <w:t>El dictado por voz no responde</w:t>
             </w:r>
           </w:p>
         </w:tc>
@@ -2277,7 +2993,7 @@
                 <w:sz w:val="20"/>
                 <w:szCs w:val="20"/>
               </w:rPr>
-              <w:t xml:space="preserve">Navegador sin soporte (Firefox), sin permiso de micrófono o sin internet</w:t>
+              <w:t>Navegador sin soporte (Firefox), sin permiso de micrófono o sin internet</w:t>
             </w:r>
           </w:p>
         </w:tc>
@@ -2294,7 +3010,7 @@
                 <w:sz w:val="20"/>
                 <w:szCs w:val="20"/>
               </w:rPr>
-              <w:t xml:space="preserve">Usar Chrome o Edge y permitir el micrófono</w:t>
+              <w:t>Usar Chrome o Edge y permitir el micrófono</w:t>
             </w:r>
           </w:p>
         </w:tc>
@@ -2316,7 +3032,7 @@
                 <w:sz w:val="20"/>
                 <w:szCs w:val="20"/>
               </w:rPr>
-              <w:t xml:space="preserve">El pronóstico no se calcula</w:t>
+              <w:t>El pronóstico no se calcula</w:t>
             </w:r>
           </w:p>
         </w:tc>
@@ -2341,7 +3057,7 @@
                 <w:sz w:val="20"/>
                 <w:szCs w:val="20"/>
               </w:rPr>
-              <w:t xml:space="preserve">PRONOSTICO_MINIMO_DIAS</w:t>
+              <w:t>PRONOSTICO_MINIMO_DIAS</w:t>
             </w:r>
           </w:p>
         </w:tc>
@@ -2358,7 +3074,15 @@
                 <w:sz w:val="20"/>
                 <w:szCs w:val="20"/>
               </w:rPr>
-              <w:t xml:space="preserve">Esperar a tener historial o bajar el valor en el </w:t>
+              <w:t xml:space="preserve">Esperar a tener historial o bajar el valor en </w:t>
+            </w:r>
+            <w:proofErr w:type="gramStart"/>
+            <w:r>
+              <w:rPr>
+                <w:sz w:val="20"/>
+                <w:szCs w:val="20"/>
+              </w:rPr>
+              <w:t xml:space="preserve">el </w:t>
             </w:r>
             <w:r>
               <w:rPr>
@@ -2366,8 +3090,9 @@
                 <w:sz w:val="20"/>
                 <w:szCs w:val="20"/>
               </w:rPr>
-              <w:t xml:space="preserve">.env</w:t>
-            </w:r>
+              <w:t>.env</w:t>
+            </w:r>
+            <w:proofErr w:type="gramEnd"/>
           </w:p>
         </w:tc>
       </w:tr>
@@ -2388,7 +3113,7 @@
                 <w:sz w:val="20"/>
                 <w:szCs w:val="20"/>
               </w:rPr>
-              <w:t xml:space="preserve">No se conecta a PostgreSQL</w:t>
+              <w:t>No se conecta a PostgreSQL</w:t>
             </w:r>
           </w:p>
         </w:tc>
@@ -2413,7 +3138,7 @@
                 <w:sz w:val="20"/>
                 <w:szCs w:val="20"/>
               </w:rPr>
-              <w:t xml:space="preserve">DB_*</w:t>
+              <w:t>DB_*</w:t>
             </w:r>
             <w:r>
               <w:rPr>
@@ -2437,7 +3162,15 @@
                 <w:sz w:val="20"/>
                 <w:szCs w:val="20"/>
               </w:rPr>
-              <w:t xml:space="preserve">Revisar el </w:t>
+              <w:t xml:space="preserve">Revisar </w:t>
+            </w:r>
+            <w:proofErr w:type="gramStart"/>
+            <w:r>
+              <w:rPr>
+                <w:sz w:val="20"/>
+                <w:szCs w:val="20"/>
+              </w:rPr>
+              <w:t xml:space="preserve">el </w:t>
             </w:r>
             <w:r>
               <w:rPr>
@@ -2445,8 +3178,9 @@
                 <w:sz w:val="20"/>
                 <w:szCs w:val="20"/>
               </w:rPr>
-              <w:t xml:space="preserve">.env</w:t>
-            </w:r>
+              <w:t>.env</w:t>
+            </w:r>
+            <w:proofErr w:type="gramEnd"/>
             <w:r>
               <w:rPr>
                 <w:sz w:val="20"/>
@@ -2475,7 +3209,7 @@
                 <w:sz w:val="20"/>
                 <w:szCs w:val="20"/>
               </w:rPr>
-              <w:t xml:space="preserve">pip</w:t>
+              <w:t>pip</w:t>
             </w:r>
             <w:r>
               <w:rPr>
@@ -2499,7 +3233,7 @@
                 <w:sz w:val="20"/>
                 <w:szCs w:val="20"/>
               </w:rPr>
-              <w:t xml:space="preserve">Hay varios Python instalados</w:t>
+              <w:t>Hay varios Python instalados</w:t>
             </w:r>
           </w:p>
         </w:tc>
@@ -2524,7 +3258,7 @@
                 <w:sz w:val="20"/>
                 <w:szCs w:val="20"/>
               </w:rPr>
-              <w:t xml:space="preserve">python -m pip</w:t>
+              <w:t>python -m pip</w:t>
             </w:r>
             <w:r>
               <w:rPr>
@@ -2547,29 +3281,55 @@
         <w:pStyle w:val="Heading2"/>
       </w:pPr>
       <w:r>
-        <w:t xml:space="preserve">B.13 Mantenimiento</w:t>
-      </w:r>
-    </w:p>
-    <w:p>
-      <w:pPr>
-        <w:jc w:val="both"/>
-      </w:pPr>
-      <w:r>
-        <w:t xml:space="preserve">Con el uso normal conviene hacer respaldos de la base de datos, revisar de vez en cuando el consumo de las APIs de IA, que es el único gasto variable del sistema, y volver a correr las pruebas automáticas después de cada cambio. Los errores al hablar con la IA se escriben completos en la terminal donde corre el servidor y el usuario ve un mensaje claro; hoy esos registros no se guardan en un archivo, así que para revisar fallas de días anteriores habría que agregar un registro a archivo en la configuración.</w:t>
+        <w:t>B.13 Mantenimiento</w:t>
+      </w:r>
+    </w:p>
+    <w:p>
+      <w:pPr>
+        <w:jc w:val="both"/>
+      </w:pPr>
+      <w:r>
+        <w:t>Con el uso normal conviene hacer respaldos de la base de datos, revisar de vez en cuando el consumo de las APIs de IA, que es el único gasto variable del sistema, y volver a correr las pruebas automáticas después de cada cambio. Los errores al hablar con la IA se escriben completos en la terminal donde corre el servidor y el usuario ve un mensaje claro; hoy esos registros no se guardan en un archivo, así que para revisar fallas de días anteriores habría que agregar un registro a archivo en la configuración.</w:t>
       </w:r>
     </w:p>
     <w:sectPr>
-      <w:footerReference w:type="default" r:id="rId3"/>
+      <w:footerReference w:type="default" r:id="rId7"/>
       <w:pgSz w:w="12240" w:h="15840"/>
       <w:pgMar w:top="1134" w:right="1134" w:bottom="1134" w:left="1701" w:header="567" w:footer="567" w:gutter="0"/>
+      <w:cols w:space="720"/>
       <w:titlePg/>
     </w:sectPr>
   </w:body>
 </w:document>
 </file>
 
+<file path=word/endnotes.xml><?xml version="1.0" encoding="utf-8"?>
+<w:endnotes xmlns:wpc="http://schemas.microsoft.com/office/word/2010/wordprocessingCanvas" xmlns:cx="http://schemas.microsoft.com/office/drawing/2014/chartex" xmlns:cx1="http://schemas.microsoft.com/office/drawing/2015/9/8/chartex" xmlns:cx2="http://schemas.microsoft.com/office/drawing/2015/10/21/chartex" xmlns:cx3="http://schemas.microsoft.com/office/drawing/2016/5/9/chartex" xmlns:cx4="http://schemas.microsoft.com/office/drawing/2016/5/10/chartex" xmlns:cx5="http://schemas.microsoft.com/office/drawing/2016/5/11/chartex" xmlns:cx6="http://schemas.microsoft.com/office/drawing/2016/5/12/chartex" xmlns:cx7="http://schemas.microsoft.com/office/drawing/2016/5/13/chartex" xmlns:cx8="http://schemas.microsoft.com/office/drawing/2016/5/14/chartex" xmlns:mc="http://schemas.openxmlformats.org/markup-compatibility/2006" xmlns:aink="http://schemas.microsoft.com/office/drawing/2016/ink" xmlns:am3d="http://schemas.microsoft.com/office/drawing/2017/model3d" xmlns:o="urn:schemas-microsoft-com:office:office" xmlns:oel="http://schemas.microsoft.com/office/2019/extlst" xmlns:r="http://schemas.openxmlformats.org/officeDocument/2006/relationships" xmlns:m="http://schemas.openxmlformats.org/officeDocument/2006/math" xmlns:v="urn:schemas-microsoft-com:vml" xmlns:wp14="http://schemas.microsoft.com/office/word/2010/wordprocessingDrawing" xmlns:wp="http://schemas.openxmlformats.org/drawingml/2006/wordprocessingDrawing" xmlns:w10="urn:schemas-microsoft-com:office:word" xmlns:w="http://schemas.openxmlformats.org/wordprocessingml/2006/main" xmlns:w14="http://schemas.microsoft.com/office/word/2010/wordml" xmlns:w15="http://schemas.microsoft.com/office/word/2012/wordml" xmlns:w16cex="http://schemas.microsoft.com/office/word/2018/wordml/cex" xmlns:w16cid="http://schemas.microsoft.com/office/word/2016/wordml/cid" xmlns:w16="http://schemas.microsoft.com/office/word/2018/wordml" xmlns:w16du="http://schemas.microsoft.com/office/word/2023/wordml/word16du" xmlns:w16sdtdh="http://schemas.microsoft.com/office/word/2020/wordml/sdtdatahash" xmlns:w16sdtfl="http://schemas.microsoft.com/office/word/2024/wordml/sdtformatlock" xmlns:w16se="http://schemas.microsoft.com/office/word/2015/wordml/symex" xmlns:wpg="http://schemas.microsoft.com/office/word/2010/wordprocessingGroup" xmlns:wpi="http://schemas.microsoft.com/office/word/2010/wordprocessingInk" xmlns:wne="http://schemas.microsoft.com/office/word/2006/wordml" xmlns:wps="http://schemas.microsoft.com/office/word/2010/wordprocessingShape" mc:Ignorable="w14 w15 w16se w16cid w16 w16cex w16sdtdh w16sdtfl w16du wp14">
+  <w:endnote w:type="separator" w:id="-1">
+    <w:p>
+      <w:pPr>
+        <w:spacing w:after="0" w:line="240" w:lineRule="auto"/>
+      </w:pPr>
+      <w:r>
+        <w:separator/>
+      </w:r>
+    </w:p>
+  </w:endnote>
+  <w:endnote w:type="continuationSeparator" w:id="0">
+    <w:p>
+      <w:pPr>
+        <w:spacing w:after="0" w:line="240" w:lineRule="auto"/>
+      </w:pPr>
+      <w:r>
+        <w:continuationSeparator/>
+      </w:r>
+    </w:p>
+  </w:endnote>
+</w:endnotes>
+</file>
+
 <file path=word/footer1.xml><?xml version="1.0" encoding="utf-8"?>
-<w:ftr xmlns:w="http://schemas.openxmlformats.org/wordprocessingml/2006/main" xmlns:r="http://schemas.openxmlformats.org/officeDocument/2006/relationships">
+<w:ftr xmlns:wpc="http://schemas.microsoft.com/office/word/2010/wordprocessingCanvas" xmlns:cx="http://schemas.microsoft.com/office/drawing/2014/chartex" xmlns:cx1="http://schemas.microsoft.com/office/drawing/2015/9/8/chartex" xmlns:cx2="http://schemas.microsoft.com/office/drawing/2015/10/21/chartex" xmlns:cx3="http://schemas.microsoft.com/office/drawing/2016/5/9/chartex" xmlns:cx4="http://schemas.microsoft.com/office/drawing/2016/5/10/chartex" xmlns:cx5="http://schemas.microsoft.com/office/drawing/2016/5/11/chartex" xmlns:cx6="http://schemas.microsoft.com/office/drawing/2016/5/12/chartex" xmlns:cx7="http://schemas.microsoft.com/office/drawing/2016/5/13/chartex" xmlns:cx8="http://schemas.microsoft.com/office/drawing/2016/5/14/chartex" xmlns:mc="http://schemas.openxmlformats.org/markup-compatibility/2006" xmlns:aink="http://schemas.microsoft.com/office/drawing/2016/ink" xmlns:am3d="http://schemas.microsoft.com/office/drawing/2017/model3d" xmlns:o="urn:schemas-microsoft-com:office:office" xmlns:oel="http://schemas.microsoft.com/office/2019/extlst" xmlns:r="http://schemas.openxmlformats.org/officeDocument/2006/relationships" xmlns:m="http://schemas.openxmlformats.org/officeDocument/2006/math" xmlns:v="urn:schemas-microsoft-com:vml" xmlns:wp14="http://schemas.microsoft.com/office/word/2010/wordprocessingDrawing" xmlns:wp="http://schemas.openxmlformats.org/drawingml/2006/wordprocessingDrawing" xmlns:w10="urn:schemas-microsoft-com:office:word" xmlns:w="http://schemas.openxmlformats.org/wordprocessingml/2006/main" xmlns:w14="http://schemas.microsoft.com/office/word/2010/wordml" xmlns:w15="http://schemas.microsoft.com/office/word/2012/wordml" xmlns:w16cex="http://schemas.microsoft.com/office/word/2018/wordml/cex" xmlns:w16cid="http://schemas.microsoft.com/office/word/2016/wordml/cid" xmlns:w16="http://schemas.microsoft.com/office/word/2018/wordml" xmlns:w16du="http://schemas.microsoft.com/office/word/2023/wordml/word16du" xmlns:w16sdtdh="http://schemas.microsoft.com/office/word/2020/wordml/sdtdatahash" xmlns:w16sdtfl="http://schemas.microsoft.com/office/word/2024/wordml/sdtformatlock" xmlns:w16se="http://schemas.microsoft.com/office/word/2015/wordml/symex" xmlns:wpg="http://schemas.microsoft.com/office/word/2010/wordprocessingGroup" xmlns:wpi="http://schemas.microsoft.com/office/word/2010/wordprocessingInk" xmlns:wne="http://schemas.microsoft.com/office/word/2006/wordml" xmlns:wps="http://schemas.microsoft.com/office/word/2010/wordprocessingShape" mc:Ignorable="w14 w15 w16se w16cid w16 w16cex w16sdtdh w16sdtfl w16du wp14">
   <w:p>
     <w:pPr>
       <w:jc w:val="center"/>
@@ -2593,12 +3353,506 @@
 </w:ftr>
 </file>
 
+<file path=word/footnotes.xml><?xml version="1.0" encoding="utf-8"?>
+<w:footnotes xmlns:wpc="http://schemas.microsoft.com/office/word/2010/wordprocessingCanvas" xmlns:cx="http://schemas.microsoft.com/office/drawing/2014/chartex" xmlns:cx1="http://schemas.microsoft.com/office/drawing/2015/9/8/chartex" xmlns:cx2="http://schemas.microsoft.com/office/drawing/2015/10/21/chartex" xmlns:cx3="http://schemas.microsoft.com/office/drawing/2016/5/9/chartex" xmlns:cx4="http://schemas.microsoft.com/office/drawing/2016/5/10/chartex" xmlns:cx5="http://schemas.microsoft.com/office/drawing/2016/5/11/chartex" xmlns:cx6="http://schemas.microsoft.com/office/drawing/2016/5/12/chartex" xmlns:cx7="http://schemas.microsoft.com/office/drawing/2016/5/13/chartex" xmlns:cx8="http://schemas.microsoft.com/office/drawing/2016/5/14/chartex" xmlns:mc="http://schemas.openxmlformats.org/markup-compatibility/2006" xmlns:aink="http://schemas.microsoft.com/office/drawing/2016/ink" xmlns:am3d="http://schemas.microsoft.com/office/drawing/2017/model3d" xmlns:o="urn:schemas-microsoft-com:office:office" xmlns:oel="http://schemas.microsoft.com/office/2019/extlst" xmlns:r="http://schemas.openxmlformats.org/officeDocument/2006/relationships" xmlns:m="http://schemas.openxmlformats.org/officeDocument/2006/math" xmlns:v="urn:schemas-microsoft-com:vml" xmlns:wp14="http://schemas.microsoft.com/office/word/2010/wordprocessingDrawing" xmlns:wp="http://schemas.openxmlformats.org/drawingml/2006/wordprocessingDrawing" xmlns:w10="urn:schemas-microsoft-com:office:word" xmlns:w="http://schemas.openxmlformats.org/wordprocessingml/2006/main" xmlns:w14="http://schemas.microsoft.com/office/word/2010/wordml" xmlns:w15="http://schemas.microsoft.com/office/word/2012/wordml" xmlns:w16cex="http://schemas.microsoft.com/office/word/2018/wordml/cex" xmlns:w16cid="http://schemas.microsoft.com/office/word/2016/wordml/cid" xmlns:w16="http://schemas.microsoft.com/office/word/2018/wordml" xmlns:w16du="http://schemas.microsoft.com/office/word/2023/wordml/word16du" xmlns:w16sdtdh="http://schemas.microsoft.com/office/word/2020/wordml/sdtdatahash" xmlns:w16sdtfl="http://schemas.microsoft.com/office/word/2024/wordml/sdtformatlock" xmlns:w16se="http://schemas.microsoft.com/office/word/2015/wordml/symex" xmlns:wpg="http://schemas.microsoft.com/office/word/2010/wordprocessingGroup" xmlns:wpi="http://schemas.microsoft.com/office/word/2010/wordprocessingInk" xmlns:wne="http://schemas.microsoft.com/office/word/2006/wordml" xmlns:wps="http://schemas.microsoft.com/office/word/2010/wordprocessingShape" mc:Ignorable="w14 w15 w16se w16cid w16 w16cex w16sdtdh w16sdtfl w16du wp14">
+  <w:footnote w:type="separator" w:id="-1">
+    <w:p>
+      <w:pPr>
+        <w:spacing w:after="0" w:line="240" w:lineRule="auto"/>
+      </w:pPr>
+      <w:r>
+        <w:separator/>
+      </w:r>
+    </w:p>
+  </w:footnote>
+  <w:footnote w:type="continuationSeparator" w:id="0">
+    <w:p>
+      <w:pPr>
+        <w:spacing w:after="0" w:line="240" w:lineRule="auto"/>
+      </w:pPr>
+      <w:r>
+        <w:continuationSeparator/>
+      </w:r>
+    </w:p>
+  </w:footnote>
+</w:footnotes>
+</file>
+
+<file path=word/numbering.xml><?xml version="1.0" encoding="utf-8"?>
+<w:numbering xmlns:wpc="http://schemas.microsoft.com/office/word/2010/wordprocessingCanvas" xmlns:cx="http://schemas.microsoft.com/office/drawing/2014/chartex" xmlns:cx1="http://schemas.microsoft.com/office/drawing/2015/9/8/chartex" xmlns:cx2="http://schemas.microsoft.com/office/drawing/2015/10/21/chartex" xmlns:cx3="http://schemas.microsoft.com/office/drawing/2016/5/9/chartex" xmlns:cx4="http://schemas.microsoft.com/office/drawing/2016/5/10/chartex" xmlns:cx5="http://schemas.microsoft.com/office/drawing/2016/5/11/chartex" xmlns:cx6="http://schemas.microsoft.com/office/drawing/2016/5/12/chartex" xmlns:cx7="http://schemas.microsoft.com/office/drawing/2016/5/13/chartex" xmlns:cx8="http://schemas.microsoft.com/office/drawing/2016/5/14/chartex" xmlns:mc="http://schemas.openxmlformats.org/markup-compatibility/2006" xmlns:aink="http://schemas.microsoft.com/office/drawing/2016/ink" xmlns:am3d="http://schemas.microsoft.com/office/drawing/2017/model3d" xmlns:o="urn:schemas-microsoft-com:office:office" xmlns:oel="http://schemas.microsoft.com/office/2019/extlst" xmlns:r="http://schemas.openxmlformats.org/officeDocument/2006/relationships" xmlns:m="http://schemas.openxmlformats.org/officeDocument/2006/math" xmlns:v="urn:schemas-microsoft-com:vml" xmlns:wp14="http://schemas.microsoft.com/office/word/2010/wordprocessingDrawing" xmlns:wp="http://schemas.openxmlformats.org/drawingml/2006/wordprocessingDrawing" xmlns:w10="urn:schemas-microsoft-com:office:word" xmlns:w="http://schemas.openxmlformats.org/wordprocessingml/2006/main" xmlns:w14="http://schemas.microsoft.com/office/word/2010/wordml" xmlns:w15="http://schemas.microsoft.com/office/word/2012/wordml" xmlns:w16cex="http://schemas.microsoft.com/office/word/2018/wordml/cex" xmlns:w16cid="http://schemas.microsoft.com/office/word/2016/wordml/cid" xmlns:w16="http://schemas.microsoft.com/office/word/2018/wordml" xmlns:w16du="http://schemas.microsoft.com/office/word/2023/wordml/word16du" xmlns:w16sdtdh="http://schemas.microsoft.com/office/word/2020/wordml/sdtdatahash" xmlns:w16sdtfl="http://schemas.microsoft.com/office/word/2024/wordml/sdtformatlock" xmlns:w16se="http://schemas.microsoft.com/office/word/2015/wordml/symex" xmlns:wpg="http://schemas.microsoft.com/office/word/2010/wordprocessingGroup" xmlns:wpi="http://schemas.microsoft.com/office/word/2010/wordprocessingInk" xmlns:wne="http://schemas.microsoft.com/office/word/2006/wordml" xmlns:wps="http://schemas.microsoft.com/office/word/2010/wordprocessingShape" mc:Ignorable="w14 w15 w16se w16cid w16 w16cex w16sdtdh w16sdtfl w16du wp14">
+  <w:abstractNum w:abstractNumId="0" w15:restartNumberingAfterBreak="0">
+    <w:nsid w:val="2558572F"/>
+    <w:multiLevelType w:val="multilevel"/>
+    <w:tmpl w:val="C52E180A"/>
+    <w:lvl w:ilvl="0">
+      <w:start w:val="1"/>
+      <w:numFmt w:val="decimal"/>
+      <w:lvlText w:val="%1."/>
+      <w:lvlJc w:val="left"/>
+      <w:pPr>
+        <w:tabs>
+          <w:tab w:val="num" w:pos="720"/>
+        </w:tabs>
+        <w:ind w:left="720" w:hanging="360"/>
+      </w:pPr>
+    </w:lvl>
+    <w:lvl w:ilvl="1" w:tentative="1">
+      <w:start w:val="1"/>
+      <w:numFmt w:val="decimal"/>
+      <w:lvlText w:val="%2."/>
+      <w:lvlJc w:val="left"/>
+      <w:pPr>
+        <w:tabs>
+          <w:tab w:val="num" w:pos="1440"/>
+        </w:tabs>
+        <w:ind w:left="1440" w:hanging="360"/>
+      </w:pPr>
+    </w:lvl>
+    <w:lvl w:ilvl="2" w:tentative="1">
+      <w:start w:val="1"/>
+      <w:numFmt w:val="decimal"/>
+      <w:lvlText w:val="%3."/>
+      <w:lvlJc w:val="left"/>
+      <w:pPr>
+        <w:tabs>
+          <w:tab w:val="num" w:pos="2160"/>
+        </w:tabs>
+        <w:ind w:left="2160" w:hanging="360"/>
+      </w:pPr>
+    </w:lvl>
+    <w:lvl w:ilvl="3" w:tentative="1">
+      <w:start w:val="1"/>
+      <w:numFmt w:val="decimal"/>
+      <w:lvlText w:val="%4."/>
+      <w:lvlJc w:val="left"/>
+      <w:pPr>
+        <w:tabs>
+          <w:tab w:val="num" w:pos="2880"/>
+        </w:tabs>
+        <w:ind w:left="2880" w:hanging="360"/>
+      </w:pPr>
+    </w:lvl>
+    <w:lvl w:ilvl="4" w:tentative="1">
+      <w:start w:val="1"/>
+      <w:numFmt w:val="decimal"/>
+      <w:lvlText w:val="%5."/>
+      <w:lvlJc w:val="left"/>
+      <w:pPr>
+        <w:tabs>
+          <w:tab w:val="num" w:pos="3600"/>
+        </w:tabs>
+        <w:ind w:left="3600" w:hanging="360"/>
+      </w:pPr>
+    </w:lvl>
+    <w:lvl w:ilvl="5" w:tentative="1">
+      <w:start w:val="1"/>
+      <w:numFmt w:val="decimal"/>
+      <w:lvlText w:val="%6."/>
+      <w:lvlJc w:val="left"/>
+      <w:pPr>
+        <w:tabs>
+          <w:tab w:val="num" w:pos="4320"/>
+        </w:tabs>
+        <w:ind w:left="4320" w:hanging="360"/>
+      </w:pPr>
+    </w:lvl>
+    <w:lvl w:ilvl="6" w:tentative="1">
+      <w:start w:val="1"/>
+      <w:numFmt w:val="decimal"/>
+      <w:lvlText w:val="%7."/>
+      <w:lvlJc w:val="left"/>
+      <w:pPr>
+        <w:tabs>
+          <w:tab w:val="num" w:pos="5040"/>
+        </w:tabs>
+        <w:ind w:left="5040" w:hanging="360"/>
+      </w:pPr>
+    </w:lvl>
+    <w:lvl w:ilvl="7" w:tentative="1">
+      <w:start w:val="1"/>
+      <w:numFmt w:val="decimal"/>
+      <w:lvlText w:val="%8."/>
+      <w:lvlJc w:val="left"/>
+      <w:pPr>
+        <w:tabs>
+          <w:tab w:val="num" w:pos="5760"/>
+        </w:tabs>
+        <w:ind w:left="5760" w:hanging="360"/>
+      </w:pPr>
+    </w:lvl>
+    <w:lvl w:ilvl="8" w:tentative="1">
+      <w:start w:val="1"/>
+      <w:numFmt w:val="decimal"/>
+      <w:lvlText w:val="%9."/>
+      <w:lvlJc w:val="left"/>
+      <w:pPr>
+        <w:tabs>
+          <w:tab w:val="num" w:pos="6480"/>
+        </w:tabs>
+        <w:ind w:left="6480" w:hanging="360"/>
+      </w:pPr>
+    </w:lvl>
+  </w:abstractNum>
+  <w:abstractNum w:abstractNumId="1" w15:restartNumberingAfterBreak="0">
+    <w:nsid w:val="347B1B61"/>
+    <w:multiLevelType w:val="multilevel"/>
+    <w:tmpl w:val="235ABF5C"/>
+    <w:lvl w:ilvl="0">
+      <w:start w:val="1"/>
+      <w:numFmt w:val="decimal"/>
+      <w:lvlText w:val="%1."/>
+      <w:lvlJc w:val="left"/>
+      <w:pPr>
+        <w:tabs>
+          <w:tab w:val="num" w:pos="720"/>
+        </w:tabs>
+        <w:ind w:left="720" w:hanging="360"/>
+      </w:pPr>
+    </w:lvl>
+    <w:lvl w:ilvl="1" w:tentative="1">
+      <w:start w:val="1"/>
+      <w:numFmt w:val="decimal"/>
+      <w:lvlText w:val="%2."/>
+      <w:lvlJc w:val="left"/>
+      <w:pPr>
+        <w:tabs>
+          <w:tab w:val="num" w:pos="1440"/>
+        </w:tabs>
+        <w:ind w:left="1440" w:hanging="360"/>
+      </w:pPr>
+    </w:lvl>
+    <w:lvl w:ilvl="2" w:tentative="1">
+      <w:start w:val="1"/>
+      <w:numFmt w:val="decimal"/>
+      <w:lvlText w:val="%3."/>
+      <w:lvlJc w:val="left"/>
+      <w:pPr>
+        <w:tabs>
+          <w:tab w:val="num" w:pos="2160"/>
+        </w:tabs>
+        <w:ind w:left="2160" w:hanging="360"/>
+      </w:pPr>
+    </w:lvl>
+    <w:lvl w:ilvl="3" w:tentative="1">
+      <w:start w:val="1"/>
+      <w:numFmt w:val="decimal"/>
+      <w:lvlText w:val="%4."/>
+      <w:lvlJc w:val="left"/>
+      <w:pPr>
+        <w:tabs>
+          <w:tab w:val="num" w:pos="2880"/>
+        </w:tabs>
+        <w:ind w:left="2880" w:hanging="360"/>
+      </w:pPr>
+    </w:lvl>
+    <w:lvl w:ilvl="4" w:tentative="1">
+      <w:start w:val="1"/>
+      <w:numFmt w:val="decimal"/>
+      <w:lvlText w:val="%5."/>
+      <w:lvlJc w:val="left"/>
+      <w:pPr>
+        <w:tabs>
+          <w:tab w:val="num" w:pos="3600"/>
+        </w:tabs>
+        <w:ind w:left="3600" w:hanging="360"/>
+      </w:pPr>
+    </w:lvl>
+    <w:lvl w:ilvl="5" w:tentative="1">
+      <w:start w:val="1"/>
+      <w:numFmt w:val="decimal"/>
+      <w:lvlText w:val="%6."/>
+      <w:lvlJc w:val="left"/>
+      <w:pPr>
+        <w:tabs>
+          <w:tab w:val="num" w:pos="4320"/>
+        </w:tabs>
+        <w:ind w:left="4320" w:hanging="360"/>
+      </w:pPr>
+    </w:lvl>
+    <w:lvl w:ilvl="6" w:tentative="1">
+      <w:start w:val="1"/>
+      <w:numFmt w:val="decimal"/>
+      <w:lvlText w:val="%7."/>
+      <w:lvlJc w:val="left"/>
+      <w:pPr>
+        <w:tabs>
+          <w:tab w:val="num" w:pos="5040"/>
+        </w:tabs>
+        <w:ind w:left="5040" w:hanging="360"/>
+      </w:pPr>
+    </w:lvl>
+    <w:lvl w:ilvl="7" w:tentative="1">
+      <w:start w:val="1"/>
+      <w:numFmt w:val="decimal"/>
+      <w:lvlText w:val="%8."/>
+      <w:lvlJc w:val="left"/>
+      <w:pPr>
+        <w:tabs>
+          <w:tab w:val="num" w:pos="5760"/>
+        </w:tabs>
+        <w:ind w:left="5760" w:hanging="360"/>
+      </w:pPr>
+    </w:lvl>
+    <w:lvl w:ilvl="8" w:tentative="1">
+      <w:start w:val="1"/>
+      <w:numFmt w:val="decimal"/>
+      <w:lvlText w:val="%9."/>
+      <w:lvlJc w:val="left"/>
+      <w:pPr>
+        <w:tabs>
+          <w:tab w:val="num" w:pos="6480"/>
+        </w:tabs>
+        <w:ind w:left="6480" w:hanging="360"/>
+      </w:pPr>
+    </w:lvl>
+  </w:abstractNum>
+  <w:abstractNum w:abstractNumId="2" w15:restartNumberingAfterBreak="0">
+    <w:nsid w:val="63074F47"/>
+    <w:multiLevelType w:val="multilevel"/>
+    <w:tmpl w:val="5748C60C"/>
+    <w:lvl w:ilvl="0">
+      <w:start w:val="1"/>
+      <w:numFmt w:val="decimal"/>
+      <w:lvlText w:val="%1."/>
+      <w:lvlJc w:val="left"/>
+      <w:pPr>
+        <w:tabs>
+          <w:tab w:val="num" w:pos="720"/>
+        </w:tabs>
+        <w:ind w:left="720" w:hanging="360"/>
+      </w:pPr>
+    </w:lvl>
+    <w:lvl w:ilvl="1" w:tentative="1">
+      <w:start w:val="1"/>
+      <w:numFmt w:val="decimal"/>
+      <w:lvlText w:val="%2."/>
+      <w:lvlJc w:val="left"/>
+      <w:pPr>
+        <w:tabs>
+          <w:tab w:val="num" w:pos="1440"/>
+        </w:tabs>
+        <w:ind w:left="1440" w:hanging="360"/>
+      </w:pPr>
+    </w:lvl>
+    <w:lvl w:ilvl="2" w:tentative="1">
+      <w:start w:val="1"/>
+      <w:numFmt w:val="decimal"/>
+      <w:lvlText w:val="%3."/>
+      <w:lvlJc w:val="left"/>
+      <w:pPr>
+        <w:tabs>
+          <w:tab w:val="num" w:pos="2160"/>
+        </w:tabs>
+        <w:ind w:left="2160" w:hanging="360"/>
+      </w:pPr>
+    </w:lvl>
+    <w:lvl w:ilvl="3" w:tentative="1">
+      <w:start w:val="1"/>
+      <w:numFmt w:val="decimal"/>
+      <w:lvlText w:val="%4."/>
+      <w:lvlJc w:val="left"/>
+      <w:pPr>
+        <w:tabs>
+          <w:tab w:val="num" w:pos="2880"/>
+        </w:tabs>
+        <w:ind w:left="2880" w:hanging="360"/>
+      </w:pPr>
+    </w:lvl>
+    <w:lvl w:ilvl="4" w:tentative="1">
+      <w:start w:val="1"/>
+      <w:numFmt w:val="decimal"/>
+      <w:lvlText w:val="%5."/>
+      <w:lvlJc w:val="left"/>
+      <w:pPr>
+        <w:tabs>
+          <w:tab w:val="num" w:pos="3600"/>
+        </w:tabs>
+        <w:ind w:left="3600" w:hanging="360"/>
+      </w:pPr>
+    </w:lvl>
+    <w:lvl w:ilvl="5" w:tentative="1">
+      <w:start w:val="1"/>
+      <w:numFmt w:val="decimal"/>
+      <w:lvlText w:val="%6."/>
+      <w:lvlJc w:val="left"/>
+      <w:pPr>
+        <w:tabs>
+          <w:tab w:val="num" w:pos="4320"/>
+        </w:tabs>
+        <w:ind w:left="4320" w:hanging="360"/>
+      </w:pPr>
+    </w:lvl>
+    <w:lvl w:ilvl="6" w:tentative="1">
+      <w:start w:val="1"/>
+      <w:numFmt w:val="decimal"/>
+      <w:lvlText w:val="%7."/>
+      <w:lvlJc w:val="left"/>
+      <w:pPr>
+        <w:tabs>
+          <w:tab w:val="num" w:pos="5040"/>
+        </w:tabs>
+        <w:ind w:left="5040" w:hanging="360"/>
+      </w:pPr>
+    </w:lvl>
+    <w:lvl w:ilvl="7" w:tentative="1">
+      <w:start w:val="1"/>
+      <w:numFmt w:val="decimal"/>
+      <w:lvlText w:val="%8."/>
+      <w:lvlJc w:val="left"/>
+      <w:pPr>
+        <w:tabs>
+          <w:tab w:val="num" w:pos="5760"/>
+        </w:tabs>
+        <w:ind w:left="5760" w:hanging="360"/>
+      </w:pPr>
+    </w:lvl>
+    <w:lvl w:ilvl="8" w:tentative="1">
+      <w:start w:val="1"/>
+      <w:numFmt w:val="decimal"/>
+      <w:lvlText w:val="%9."/>
+      <w:lvlJc w:val="left"/>
+      <w:pPr>
+        <w:tabs>
+          <w:tab w:val="num" w:pos="6480"/>
+        </w:tabs>
+        <w:ind w:left="6480" w:hanging="360"/>
+      </w:pPr>
+    </w:lvl>
+  </w:abstractNum>
+  <w:abstractNum w:abstractNumId="3" w15:restartNumberingAfterBreak="0">
+    <w:nsid w:val="7C3264E4"/>
+    <w:multiLevelType w:val="multilevel"/>
+    <w:tmpl w:val="B0EA6E8C"/>
+    <w:lvl w:ilvl="0">
+      <w:start w:val="1"/>
+      <w:numFmt w:val="decimal"/>
+      <w:lvlText w:val="%1."/>
+      <w:lvlJc w:val="left"/>
+      <w:pPr>
+        <w:tabs>
+          <w:tab w:val="num" w:pos="720"/>
+        </w:tabs>
+        <w:ind w:left="720" w:hanging="360"/>
+      </w:pPr>
+    </w:lvl>
+    <w:lvl w:ilvl="1" w:tentative="1">
+      <w:start w:val="1"/>
+      <w:numFmt w:val="decimal"/>
+      <w:lvlText w:val="%2."/>
+      <w:lvlJc w:val="left"/>
+      <w:pPr>
+        <w:tabs>
+          <w:tab w:val="num" w:pos="1440"/>
+        </w:tabs>
+        <w:ind w:left="1440" w:hanging="360"/>
+      </w:pPr>
+    </w:lvl>
+    <w:lvl w:ilvl="2" w:tentative="1">
+      <w:start w:val="1"/>
+      <w:numFmt w:val="decimal"/>
+      <w:lvlText w:val="%3."/>
+      <w:lvlJc w:val="left"/>
+      <w:pPr>
+        <w:tabs>
+          <w:tab w:val="num" w:pos="2160"/>
+        </w:tabs>
+        <w:ind w:left="2160" w:hanging="360"/>
+      </w:pPr>
+    </w:lvl>
+    <w:lvl w:ilvl="3" w:tentative="1">
+      <w:start w:val="1"/>
+      <w:numFmt w:val="decimal"/>
+      <w:lvlText w:val="%4."/>
+      <w:lvlJc w:val="left"/>
+      <w:pPr>
+        <w:tabs>
+          <w:tab w:val="num" w:pos="2880"/>
+        </w:tabs>
+        <w:ind w:left="2880" w:hanging="360"/>
+      </w:pPr>
+    </w:lvl>
+    <w:lvl w:ilvl="4" w:tentative="1">
+      <w:start w:val="1"/>
+      <w:numFmt w:val="decimal"/>
+      <w:lvlText w:val="%5."/>
+      <w:lvlJc w:val="left"/>
+      <w:pPr>
+        <w:tabs>
+          <w:tab w:val="num" w:pos="3600"/>
+        </w:tabs>
+        <w:ind w:left="3600" w:hanging="360"/>
+      </w:pPr>
+    </w:lvl>
+    <w:lvl w:ilvl="5" w:tentative="1">
+      <w:start w:val="1"/>
+      <w:numFmt w:val="decimal"/>
+      <w:lvlText w:val="%6."/>
+      <w:lvlJc w:val="left"/>
+      <w:pPr>
+        <w:tabs>
+          <w:tab w:val="num" w:pos="4320"/>
+        </w:tabs>
+        <w:ind w:left="4320" w:hanging="360"/>
+      </w:pPr>
+    </w:lvl>
+    <w:lvl w:ilvl="6" w:tentative="1">
+      <w:start w:val="1"/>
+      <w:numFmt w:val="decimal"/>
+      <w:lvlText w:val="%7."/>
+      <w:lvlJc w:val="left"/>
+      <w:pPr>
+        <w:tabs>
+          <w:tab w:val="num" w:pos="5040"/>
+        </w:tabs>
+        <w:ind w:left="5040" w:hanging="360"/>
+      </w:pPr>
+    </w:lvl>
+    <w:lvl w:ilvl="7" w:tentative="1">
+      <w:start w:val="1"/>
+      <w:numFmt w:val="decimal"/>
+      <w:lvlText w:val="%8."/>
+      <w:lvlJc w:val="left"/>
+      <w:pPr>
+        <w:tabs>
+          <w:tab w:val="num" w:pos="5760"/>
+        </w:tabs>
+        <w:ind w:left="5760" w:hanging="360"/>
+      </w:pPr>
+    </w:lvl>
+    <w:lvl w:ilvl="8" w:tentative="1">
+      <w:start w:val="1"/>
+      <w:numFmt w:val="decimal"/>
+      <w:lvlText w:val="%9."/>
+      <w:lvlJc w:val="left"/>
+      <w:pPr>
+        <w:tabs>
+          <w:tab w:val="num" w:pos="6480"/>
+        </w:tabs>
+        <w:ind w:left="6480" w:hanging="360"/>
+      </w:pPr>
+    </w:lvl>
+  </w:abstractNum>
+  <w:num w:numId="1" w16cid:durableId="882253759">
+    <w:abstractNumId w:val="2"/>
+  </w:num>
+  <w:num w:numId="2" w16cid:durableId="1291398917">
+    <w:abstractNumId w:val="0"/>
+  </w:num>
+  <w:num w:numId="3" w16cid:durableId="1740589397">
+    <w:abstractNumId w:val="1"/>
+  </w:num>
+  <w:num w:numId="4" w16cid:durableId="1241132743">
+    <w:abstractNumId w:val="3"/>
+  </w:num>
+</w:numbering>
+</file>
+
 <file path=word/styles.xml><?xml version="1.0" encoding="utf-8"?>
-<w:styles xmlns:w="http://schemas.openxmlformats.org/wordprocessingml/2006/main" xmlns:r="http://schemas.openxmlformats.org/officeDocument/2006/relationships">
+<w:styles xmlns:mc="http://schemas.openxmlformats.org/markup-compatibility/2006" xmlns:r="http://schemas.openxmlformats.org/officeDocument/2006/relationships" xmlns:w="http://schemas.openxmlformats.org/wordprocessingml/2006/main" xmlns:w14="http://schemas.microsoft.com/office/word/2010/wordml" xmlns:w15="http://schemas.microsoft.com/office/word/2012/wordml" xmlns:w16cex="http://schemas.microsoft.com/office/word/2018/wordml/cex" xmlns:w16cid="http://schemas.microsoft.com/office/word/2016/wordml/cid" xmlns:w16="http://schemas.microsoft.com/office/word/2018/wordml" xmlns:w16du="http://schemas.microsoft.com/office/word/2023/wordml/word16du" xmlns:w16sdtdh="http://schemas.microsoft.com/office/word/2020/wordml/sdtdatahash" xmlns:w16sdtfl="http://schemas.microsoft.com/office/word/2024/wordml/sdtformatlock" xmlns:w16se="http://schemas.microsoft.com/office/word/2015/wordml/symex" mc:Ignorable="w14 w15 w16se w16cid w16 w16cex w16sdtdh w16sdtfl w16du">
   <w:docDefaults>
     <w:rPrDefault>
       <w:rPr>
-        <w:rFonts w:ascii="Times New Roman" w:hAnsi="Times New Roman" w:eastAsia="Times New Roman" w:cs="Times New Roman"/>
+        <w:rFonts w:ascii="Times New Roman" w:eastAsia="Times New Roman" w:hAnsi="Times New Roman" w:cs="Times New Roman"/>
         <w:sz w:val="24"/>
         <w:szCs w:val="24"/>
         <w:lang w:val="es-MX" w:eastAsia="es-MX" w:bidi="ar-SA"/>
@@ -2610,6 +3864,384 @@
       </w:pPr>
     </w:pPrDefault>
   </w:docDefaults>
+  <w:latentStyles w:defLockedState="0" w:defUIPriority="99" w:defSemiHidden="0" w:defUnhideWhenUsed="0" w:defQFormat="0" w:count="376">
+    <w:lsdException w:name="Normal" w:uiPriority="0" w:qFormat="1"/>
+    <w:lsdException w:name="heading 1" w:uiPriority="9" w:qFormat="1"/>
+    <w:lsdException w:name="heading 2" w:semiHidden="1" w:uiPriority="9" w:unhideWhenUsed="1" w:qFormat="1"/>
+    <w:lsdException w:name="heading 3" w:semiHidden="1" w:uiPriority="9" w:unhideWhenUsed="1" w:qFormat="1"/>
+    <w:lsdException w:name="heading 4" w:semiHidden="1" w:uiPriority="9" w:unhideWhenUsed="1" w:qFormat="1"/>
+    <w:lsdException w:name="heading 5" w:semiHidden="1" w:uiPriority="9" w:unhideWhenUsed="1" w:qFormat="1"/>
+    <w:lsdException w:name="heading 6" w:semiHidden="1" w:uiPriority="9" w:unhideWhenUsed="1" w:qFormat="1"/>
+    <w:lsdException w:name="heading 7" w:semiHidden="1" w:uiPriority="9" w:unhideWhenUsed="1" w:qFormat="1"/>
+    <w:lsdException w:name="heading 8" w:semiHidden="1" w:uiPriority="9" w:unhideWhenUsed="1" w:qFormat="1"/>
+    <w:lsdException w:name="heading 9" w:semiHidden="1" w:uiPriority="9" w:unhideWhenUsed="1" w:qFormat="1"/>
+    <w:lsdException w:name="index 1" w:semiHidden="1" w:unhideWhenUsed="1"/>
+    <w:lsdException w:name="index 2" w:semiHidden="1" w:unhideWhenUsed="1"/>
+    <w:lsdException w:name="index 3" w:semiHidden="1" w:unhideWhenUsed="1"/>
+    <w:lsdException w:name="index 4" w:semiHidden="1" w:unhideWhenUsed="1"/>
+    <w:lsdException w:name="index 5" w:semiHidden="1" w:unhideWhenUsed="1"/>
+    <w:lsdException w:name="index 6" w:semiHidden="1" w:unhideWhenUsed="1"/>
+    <w:lsdException w:name="index 7" w:semiHidden="1" w:unhideWhenUsed="1"/>
+    <w:lsdException w:name="index 8" w:semiHidden="1" w:unhideWhenUsed="1"/>
+    <w:lsdException w:name="index 9" w:semiHidden="1" w:unhideWhenUsed="1"/>
+    <w:lsdException w:name="toc 1" w:semiHidden="1" w:uiPriority="39" w:unhideWhenUsed="1"/>
+    <w:lsdException w:name="toc 2" w:semiHidden="1" w:uiPriority="39" w:unhideWhenUsed="1"/>
+    <w:lsdException w:name="toc 3" w:semiHidden="1" w:uiPriority="39" w:unhideWhenUsed="1"/>
+    <w:lsdException w:name="toc 4" w:semiHidden="1" w:uiPriority="39" w:unhideWhenUsed="1"/>
+    <w:lsdException w:name="toc 5" w:semiHidden="1" w:uiPriority="39" w:unhideWhenUsed="1"/>
+    <w:lsdException w:name="toc 6" w:semiHidden="1" w:uiPriority="39" w:unhideWhenUsed="1"/>
+    <w:lsdException w:name="toc 7" w:semiHidden="1" w:uiPriority="39" w:unhideWhenUsed="1"/>
+    <w:lsdException w:name="toc 8" w:semiHidden="1" w:uiPriority="39" w:unhideWhenUsed="1"/>
+    <w:lsdException w:name="toc 9" w:semiHidden="1" w:uiPriority="39" w:unhideWhenUsed="1"/>
+    <w:lsdException w:name="Normal Indent" w:semiHidden="1" w:unhideWhenUsed="1"/>
+    <w:lsdException w:name="footnote text" w:semiHidden="1" w:unhideWhenUsed="1"/>
+    <w:lsdException w:name="annotation text" w:semiHidden="1" w:unhideWhenUsed="1"/>
+    <w:lsdException w:name="header" w:semiHidden="1" w:unhideWhenUsed="1"/>
+    <w:lsdException w:name="footer" w:semiHidden="1" w:unhideWhenUsed="1"/>
+    <w:lsdException w:name="index heading" w:semiHidden="1" w:unhideWhenUsed="1"/>
+    <w:lsdException w:name="caption" w:semiHidden="1" w:uiPriority="35" w:unhideWhenUsed="1" w:qFormat="1"/>
+    <w:lsdException w:name="table of figures" w:semiHidden="1" w:unhideWhenUsed="1"/>
+    <w:lsdException w:name="envelope address" w:semiHidden="1" w:unhideWhenUsed="1"/>
+    <w:lsdException w:name="envelope return" w:semiHidden="1" w:unhideWhenUsed="1"/>
+    <w:lsdException w:name="footnote reference" w:semiHidden="1" w:unhideWhenUsed="1"/>
+    <w:lsdException w:name="annotation reference" w:semiHidden="1" w:unhideWhenUsed="1"/>
+    <w:lsdException w:name="line number" w:semiHidden="1" w:unhideWhenUsed="1"/>
+    <w:lsdException w:name="page number" w:semiHidden="1" w:unhideWhenUsed="1"/>
+    <w:lsdException w:name="endnote reference" w:semiHidden="1" w:unhideWhenUsed="1"/>
+    <w:lsdException w:name="endnote text" w:semiHidden="1" w:unhideWhenUsed="1"/>
+    <w:lsdException w:name="table of authorities" w:semiHidden="1" w:unhideWhenUsed="1"/>
+    <w:lsdException w:name="macro" w:semiHidden="1" w:unhideWhenUsed="1"/>
+    <w:lsdException w:name="toa heading" w:semiHidden="1" w:unhideWhenUsed="1"/>
+    <w:lsdException w:name="List" w:semiHidden="1" w:unhideWhenUsed="1"/>
+    <w:lsdException w:name="List Bullet" w:semiHidden="1" w:unhideWhenUsed="1"/>
+    <w:lsdException w:name="List Number" w:semiHidden="1" w:unhideWhenUsed="1"/>
+    <w:lsdException w:name="List 2" w:semiHidden="1" w:unhideWhenUsed="1"/>
+    <w:lsdException w:name="List 3" w:semiHidden="1" w:unhideWhenUsed="1"/>
+    <w:lsdException w:name="List 4" w:semiHidden="1" w:unhideWhenUsed="1"/>
+    <w:lsdException w:name="List 5" w:semiHidden="1" w:unhideWhenUsed="1"/>
+    <w:lsdException w:name="List Bullet 2" w:semiHidden="1" w:unhideWhenUsed="1"/>
+    <w:lsdException w:name="List Bullet 3" w:semiHidden="1" w:unhideWhenUsed="1"/>
+    <w:lsdException w:name="List Bullet 4" w:semiHidden="1" w:unhideWhenUsed="1"/>
+    <w:lsdException w:name="List Bullet 5" w:semiHidden="1" w:unhideWhenUsed="1"/>
+    <w:lsdException w:name="List Number 2" w:semiHidden="1" w:unhideWhenUsed="1"/>
+    <w:lsdException w:name="List Number 3" w:semiHidden="1" w:unhideWhenUsed="1"/>
+    <w:lsdException w:name="List Number 4" w:semiHidden="1" w:unhideWhenUsed="1"/>
+    <w:lsdException w:name="List Number 5" w:semiHidden="1" w:unhideWhenUsed="1"/>
+    <w:lsdException w:name="Title" w:uiPriority="10" w:qFormat="1"/>
+    <w:lsdException w:name="Closing" w:semiHidden="1" w:unhideWhenUsed="1"/>
+    <w:lsdException w:name="Signature" w:semiHidden="1" w:unhideWhenUsed="1"/>
+    <w:lsdException w:name="Default Paragraph Font" w:semiHidden="1" w:uiPriority="1" w:unhideWhenUsed="1"/>
+    <w:lsdException w:name="Body Text" w:semiHidden="1" w:unhideWhenUsed="1"/>
+    <w:lsdException w:name="Body Text Indent" w:semiHidden="1" w:unhideWhenUsed="1"/>
+    <w:lsdException w:name="List Continue" w:semiHidden="1" w:unhideWhenUsed="1"/>
+    <w:lsdException w:name="List Continue 2" w:semiHidden="1" w:unhideWhenUsed="1"/>
+    <w:lsdException w:name="List Continue 3" w:semiHidden="1" w:unhideWhenUsed="1"/>
+    <w:lsdException w:name="List Continue 4" w:semiHidden="1" w:unhideWhenUsed="1"/>
+    <w:lsdException w:name="List Continue 5" w:semiHidden="1" w:unhideWhenUsed="1"/>
+    <w:lsdException w:name="Message Header" w:semiHidden="1" w:unhideWhenUsed="1"/>
+    <w:lsdException w:name="Subtitle" w:uiPriority="11" w:qFormat="1"/>
+    <w:lsdException w:name="Salutation" w:semiHidden="1" w:unhideWhenUsed="1"/>
+    <w:lsdException w:name="Date" w:semiHidden="1" w:unhideWhenUsed="1"/>
+    <w:lsdException w:name="Body Text First Indent" w:semiHidden="1" w:unhideWhenUsed="1"/>
+    <w:lsdException w:name="Body Text First Indent 2" w:semiHidden="1" w:unhideWhenUsed="1"/>
+    <w:lsdException w:name="Note Heading" w:semiHidden="1" w:unhideWhenUsed="1"/>
+    <w:lsdException w:name="Body Text 2" w:semiHidden="1" w:unhideWhenUsed="1"/>
+    <w:lsdException w:name="Body Text 3" w:semiHidden="1" w:unhideWhenUsed="1"/>
+    <w:lsdException w:name="Body Text Indent 2" w:semiHidden="1" w:unhideWhenUsed="1"/>
+    <w:lsdException w:name="Body Text Indent 3" w:semiHidden="1" w:unhideWhenUsed="1"/>
+    <w:lsdException w:name="Block Text" w:semiHidden="1" w:unhideWhenUsed="1"/>
+    <w:lsdException w:name="Hyperlink" w:semiHidden="1" w:unhideWhenUsed="1"/>
+    <w:lsdException w:name="FollowedHyperlink" w:semiHidden="1" w:unhideWhenUsed="1"/>
+    <w:lsdException w:name="Strong" w:uiPriority="22" w:qFormat="1"/>
+    <w:lsdException w:name="Emphasis" w:uiPriority="20" w:qFormat="1"/>
+    <w:lsdException w:name="Document Map" w:semiHidden="1" w:unhideWhenUsed="1"/>
+    <w:lsdException w:name="Plain Text" w:semiHidden="1" w:unhideWhenUsed="1"/>
+    <w:lsdException w:name="E-mail Signature" w:semiHidden="1" w:unhideWhenUsed="1"/>
+    <w:lsdException w:name="HTML Top of Form" w:semiHidden="1" w:unhideWhenUsed="1"/>
+    <w:lsdException w:name="HTML Bottom of Form" w:semiHidden="1" w:unhideWhenUsed="1"/>
+    <w:lsdException w:name="Normal (Web)" w:semiHidden="1" w:unhideWhenUsed="1"/>
+    <w:lsdException w:name="HTML Acronym" w:semiHidden="1" w:unhideWhenUsed="1"/>
+    <w:lsdException w:name="HTML Address" w:semiHidden="1" w:unhideWhenUsed="1"/>
+    <w:lsdException w:name="HTML Cite" w:semiHidden="1" w:unhideWhenUsed="1"/>
+    <w:lsdException w:name="HTML Code" w:semiHidden="1" w:unhideWhenUsed="1"/>
+    <w:lsdException w:name="HTML Definition" w:semiHidden="1" w:unhideWhenUsed="1"/>
+    <w:lsdException w:name="HTML Keyboard" w:semiHidden="1" w:unhideWhenUsed="1"/>
+    <w:lsdException w:name="HTML Preformatted" w:semiHidden="1" w:unhideWhenUsed="1"/>
+    <w:lsdException w:name="HTML Sample" w:semiHidden="1" w:unhideWhenUsed="1"/>
+    <w:lsdException w:name="HTML Typewriter" w:semiHidden="1" w:unhideWhenUsed="1"/>
+    <w:lsdException w:name="HTML Variable" w:semiHidden="1" w:unhideWhenUsed="1"/>
+    <w:lsdException w:name="Normal Table" w:semiHidden="1" w:unhideWhenUsed="1"/>
+    <w:lsdException w:name="annotation subject" w:semiHidden="1" w:unhideWhenUsed="1"/>
+    <w:lsdException w:name="No List" w:semiHidden="1" w:unhideWhenUsed="1"/>
+    <w:lsdException w:name="Outline List 1" w:semiHidden="1" w:unhideWhenUsed="1"/>
+    <w:lsdException w:name="Outline List 2" w:semiHidden="1" w:unhideWhenUsed="1"/>
+    <w:lsdException w:name="Outline List 3" w:semiHidden="1" w:unhideWhenUsed="1"/>
+    <w:lsdException w:name="Table Simple 1" w:semiHidden="1" w:unhideWhenUsed="1"/>
+    <w:lsdException w:name="Table Simple 2" w:semiHidden="1" w:unhideWhenUsed="1"/>
+    <w:lsdException w:name="Table Simple 3" w:semiHidden="1" w:unhideWhenUsed="1"/>
+    <w:lsdException w:name="Table Classic 1" w:semiHidden="1" w:unhideWhenUsed="1"/>
+    <w:lsdException w:name="Table Classic 2" w:semiHidden="1" w:unhideWhenUsed="1"/>
+    <w:lsdException w:name="Table Classic 3" w:semiHidden="1" w:unhideWhenUsed="1"/>
+    <w:lsdException w:name="Table Classic 4" w:semiHidden="1" w:unhideWhenUsed="1"/>
+    <w:lsdException w:name="Table Colorful 1" w:semiHidden="1" w:unhideWhenUsed="1"/>
+    <w:lsdException w:name="Table Colorful 2" w:semiHidden="1" w:unhideWhenUsed="1"/>
+    <w:lsdException w:name="Table Colorful 3" w:semiHidden="1" w:unhideWhenUsed="1"/>
+    <w:lsdException w:name="Table Columns 1" w:semiHidden="1" w:unhideWhenUsed="1"/>
+    <w:lsdException w:name="Table Columns 2" w:semiHidden="1" w:unhideWhenUsed="1"/>
+    <w:lsdException w:name="Table Columns 3" w:semiHidden="1" w:unhideWhenUsed="1"/>
+    <w:lsdException w:name="Table Columns 4" w:semiHidden="1" w:unhideWhenUsed="1"/>
+    <w:lsdException w:name="Table Columns 5" w:semiHidden="1" w:unhideWhenUsed="1"/>
+    <w:lsdException w:name="Table Grid 1" w:semiHidden="1" w:unhideWhenUsed="1"/>
+    <w:lsdException w:name="Table Grid 2" w:semiHidden="1" w:unhideWhenUsed="1"/>
+    <w:lsdException w:name="Table Grid 3" w:semiHidden="1" w:unhideWhenUsed="1"/>
+    <w:lsdException w:name="Table Grid 4" w:semiHidden="1" w:unhideWhenUsed="1"/>
+    <w:lsdException w:name="Table Grid 5" w:semiHidden="1" w:unhideWhenUsed="1"/>
+    <w:lsdException w:name="Table Grid 6" w:semiHidden="1" w:unhideWhenUsed="1"/>
+    <w:lsdException w:name="Table Grid 7" w:semiHidden="1" w:unhideWhenUsed="1"/>
+    <w:lsdException w:name="Table Grid 8" w:semiHidden="1" w:unhideWhenUsed="1"/>
+    <w:lsdException w:name="Table List 1" w:semiHidden="1" w:unhideWhenUsed="1"/>
+    <w:lsdException w:name="Table List 2" w:semiHidden="1" w:unhideWhenUsed="1"/>
+    <w:lsdException w:name="Table List 3" w:semiHidden="1" w:unhideWhenUsed="1"/>
+    <w:lsdException w:name="Table List 4" w:semiHidden="1" w:unhideWhenUsed="1"/>
+    <w:lsdException w:name="Table List 5" w:semiHidden="1" w:unhideWhenUsed="1"/>
+    <w:lsdException w:name="Table List 6" w:semiHidden="1" w:unhideWhenUsed="1"/>
+    <w:lsdException w:name="Table List 7" w:semiHidden="1" w:unhideWhenUsed="1"/>
+    <w:lsdException w:name="Table List 8" w:semiHidden="1" w:unhideWhenUsed="1"/>
+    <w:lsdException w:name="Table 3D effects 1" w:semiHidden="1" w:unhideWhenUsed="1"/>
+    <w:lsdException w:name="Table 3D effects 2" w:semiHidden="1" w:unhideWhenUsed="1"/>
+    <w:lsdException w:name="Table 3D effects 3" w:semiHidden="1" w:unhideWhenUsed="1"/>
+    <w:lsdException w:name="Table Contemporary" w:semiHidden="1" w:unhideWhenUsed="1"/>
+    <w:lsdException w:name="Table Elegant" w:semiHidden="1" w:unhideWhenUsed="1"/>
+    <w:lsdException w:name="Table Professional" w:semiHidden="1" w:unhideWhenUsed="1"/>
+    <w:lsdException w:name="Table Subtle 1" w:semiHidden="1" w:unhideWhenUsed="1"/>
+    <w:lsdException w:name="Table Subtle 2" w:semiHidden="1" w:unhideWhenUsed="1"/>
+    <w:lsdException w:name="Table Web 1" w:semiHidden="1" w:unhideWhenUsed="1"/>
+    <w:lsdException w:name="Table Web 2" w:semiHidden="1" w:unhideWhenUsed="1"/>
+    <w:lsdException w:name="Table Web 3" w:semiHidden="1" w:unhideWhenUsed="1"/>
+    <w:lsdException w:name="Balloon Text" w:semiHidden="1" w:unhideWhenUsed="1"/>
+    <w:lsdException w:name="Table Grid" w:uiPriority="39"/>
+    <w:lsdException w:name="Table Theme" w:semiHidden="1" w:unhideWhenUsed="1"/>
+    <w:lsdException w:name="Placeholder Text" w:semiHidden="1"/>
+    <w:lsdException w:name="No Spacing" w:uiPriority="1" w:qFormat="1"/>
+    <w:lsdException w:name="Light Shading" w:uiPriority="60"/>
+    <w:lsdException w:name="Light List" w:uiPriority="61"/>
+    <w:lsdException w:name="Light Grid" w:uiPriority="62"/>
+    <w:lsdException w:name="Medium Shading 1" w:uiPriority="63"/>
+    <w:lsdException w:name="Medium Shading 2" w:uiPriority="64"/>
+    <w:lsdException w:name="Medium List 1" w:uiPriority="65"/>
+    <w:lsdException w:name="Medium List 2" w:uiPriority="66"/>
+    <w:lsdException w:name="Medium Grid 1" w:uiPriority="67"/>
+    <w:lsdException w:name="Medium Grid 2" w:uiPriority="68"/>
+    <w:lsdException w:name="Medium Grid 3" w:uiPriority="69"/>
+    <w:lsdException w:name="Dark List" w:uiPriority="70"/>
+    <w:lsdException w:name="Colorful Shading" w:uiPriority="71"/>
+    <w:lsdException w:name="Colorful List" w:uiPriority="72"/>
+    <w:lsdException w:name="Colorful Grid" w:uiPriority="73"/>
+    <w:lsdException w:name="Light Shading Accent 1" w:uiPriority="60"/>
+    <w:lsdException w:name="Light List Accent 1" w:uiPriority="61"/>
+    <w:lsdException w:name="Light Grid Accent 1" w:uiPriority="62"/>
+    <w:lsdException w:name="Medium Shading 1 Accent 1" w:uiPriority="63"/>
+    <w:lsdException w:name="Medium Shading 2 Accent 1" w:uiPriority="64"/>
+    <w:lsdException w:name="Medium List 1 Accent 1" w:uiPriority="65"/>
+    <w:lsdException w:name="Revision" w:semiHidden="1"/>
+    <w:lsdException w:name="List Paragraph" w:uiPriority="34" w:qFormat="1"/>
+    <w:lsdException w:name="Quote" w:uiPriority="29" w:qFormat="1"/>
+    <w:lsdException w:name="Intense Quote" w:uiPriority="30" w:qFormat="1"/>
+    <w:lsdException w:name="Medium List 2 Accent 1" w:uiPriority="66"/>
+    <w:lsdException w:name="Medium Grid 1 Accent 1" w:uiPriority="67"/>
+    <w:lsdException w:name="Medium Grid 2 Accent 1" w:uiPriority="68"/>
+    <w:lsdException w:name="Medium Grid 3 Accent 1" w:uiPriority="69"/>
+    <w:lsdException w:name="Dark List Accent 1" w:uiPriority="70"/>
+    <w:lsdException w:name="Colorful Shading Accent 1" w:uiPriority="71"/>
+    <w:lsdException w:name="Colorful List Accent 1" w:uiPriority="72"/>
+    <w:lsdException w:name="Colorful Grid Accent 1" w:uiPriority="73"/>
+    <w:lsdException w:name="Light Shading Accent 2" w:uiPriority="60"/>
+    <w:lsdException w:name="Light List Accent 2" w:uiPriority="61"/>
+    <w:lsdException w:name="Light Grid Accent 2" w:uiPriority="62"/>
+    <w:lsdException w:name="Medium Shading 1 Accent 2" w:uiPriority="63"/>
+    <w:lsdException w:name="Medium Shading 2 Accent 2" w:uiPriority="64"/>
+    <w:lsdException w:name="Medium List 1 Accent 2" w:uiPriority="65"/>
+    <w:lsdException w:name="Medium List 2 Accent 2" w:uiPriority="66"/>
+    <w:lsdException w:name="Medium Grid 1 Accent 2" w:uiPriority="67"/>
+    <w:lsdException w:name="Medium Grid 2 Accent 2" w:uiPriority="68"/>
+    <w:lsdException w:name="Medium Grid 3 Accent 2" w:uiPriority="69"/>
+    <w:lsdException w:name="Dark List Accent 2" w:uiPriority="70"/>
+    <w:lsdException w:name="Colorful Shading Accent 2" w:uiPriority="71"/>
+    <w:lsdException w:name="Colorful List Accent 2" w:uiPriority="72"/>
+    <w:lsdException w:name="Colorful Grid Accent 2" w:uiPriority="73"/>
+    <w:lsdException w:name="Light Shading Accent 3" w:uiPriority="60"/>
+    <w:lsdException w:name="Light List Accent 3" w:uiPriority="61"/>
+    <w:lsdException w:name="Light Grid Accent 3" w:uiPriority="62"/>
+    <w:lsdException w:name="Medium Shading 1 Accent 3" w:uiPriority="63"/>
+    <w:lsdException w:name="Medium Shading 2 Accent 3" w:uiPriority="64"/>
+    <w:lsdException w:name="Medium List 1 Accent 3" w:uiPriority="65"/>
+    <w:lsdException w:name="Medium List 2 Accent 3" w:uiPriority="66"/>
+    <w:lsdException w:name="Medium Grid 1 Accent 3" w:uiPriority="67"/>
+    <w:lsdException w:name="Medium Grid 2 Accent 3" w:uiPriority="68"/>
+    <w:lsdException w:name="Medium Grid 3 Accent 3" w:uiPriority="69"/>
+    <w:lsdException w:name="Dark List Accent 3" w:uiPriority="70"/>
+    <w:lsdException w:name="Colorful Shading Accent 3" w:uiPriority="71"/>
+    <w:lsdException w:name="Colorful List Accent 3" w:uiPriority="72"/>
+    <w:lsdException w:name="Colorful Grid Accent 3" w:uiPriority="73"/>
+    <w:lsdException w:name="Light Shading Accent 4" w:uiPriority="60"/>
+    <w:lsdException w:name="Light List Accent 4" w:uiPriority="61"/>
+    <w:lsdException w:name="Light Grid Accent 4" w:uiPriority="62"/>
+    <w:lsdException w:name="Medium Shading 1 Accent 4" w:uiPriority="63"/>
+    <w:lsdException w:name="Medium Shading 2 Accent 4" w:uiPriority="64"/>
+    <w:lsdException w:name="Medium List 1 Accent 4" w:uiPriority="65"/>
+    <w:lsdException w:name="Medium List 2 Accent 4" w:uiPriority="66"/>
+    <w:lsdException w:name="Medium Grid 1 Accent 4" w:uiPriority="67"/>
+    <w:lsdException w:name="Medium Grid 2 Accent 4" w:uiPriority="68"/>
+    <w:lsdException w:name="Medium Grid 3 Accent 4" w:uiPriority="69"/>
+    <w:lsdException w:name="Dark List Accent 4" w:uiPriority="70"/>
+    <w:lsdException w:name="Colorful Shading Accent 4" w:uiPriority="71"/>
+    <w:lsdException w:name="Colorful List Accent 4" w:uiPriority="72"/>
+    <w:lsdException w:name="Colorful Grid Accent 4" w:uiPriority="73"/>
+    <w:lsdException w:name="Light Shading Accent 5" w:uiPriority="60"/>
+    <w:lsdException w:name="Light List Accent 5" w:uiPriority="61"/>
+    <w:lsdException w:name="Light Grid Accent 5" w:uiPriority="62"/>
+    <w:lsdException w:name="Medium Shading 1 Accent 5" w:uiPriority="63"/>
+    <w:lsdException w:name="Medium Shading 2 Accent 5" w:uiPriority="64"/>
+    <w:lsdException w:name="Medium List 1 Accent 5" w:uiPriority="65"/>
+    <w:lsdException w:name="Medium List 2 Accent 5" w:uiPriority="66"/>
+    <w:lsdException w:name="Medium Grid 1 Accent 5" w:uiPriority="67"/>
+    <w:lsdException w:name="Medium Grid 2 Accent 5" w:uiPriority="68"/>
+    <w:lsdException w:name="Medium Grid 3 Accent 5" w:uiPriority="69"/>
+    <w:lsdException w:name="Dark List Accent 5" w:uiPriority="70"/>
+    <w:lsdException w:name="Colorful Shading Accent 5" w:uiPriority="71"/>
+    <w:lsdException w:name="Colorful List Accent 5" w:uiPriority="72"/>
+    <w:lsdException w:name="Colorful Grid Accent 5" w:uiPriority="73"/>
+    <w:lsdException w:name="Light Shading Accent 6" w:uiPriority="60"/>
+    <w:lsdException w:name="Light List Accent 6" w:uiPriority="61"/>
+    <w:lsdException w:name="Light Grid Accent 6" w:uiPriority="62"/>
+    <w:lsdException w:name="Medium Shading 1 Accent 6" w:uiPriority="63"/>
+    <w:lsdException w:name="Medium Shading 2 Accent 6" w:uiPriority="64"/>
+    <w:lsdException w:name="Medium List 1 Accent 6" w:uiPriority="65"/>
+    <w:lsdException w:name="Medium List 2 Accent 6" w:uiPriority="66"/>
+    <w:lsdException w:name="Medium Grid 1 Accent 6" w:uiPriority="67"/>
+    <w:lsdException w:name="Medium Grid 2 Accent 6" w:uiPriority="68"/>
+    <w:lsdException w:name="Medium Grid 3 Accent 6" w:uiPriority="69"/>
+    <w:lsdException w:name="Dark List Accent 6" w:uiPriority="70"/>
+    <w:lsdException w:name="Colorful Shading Accent 6" w:uiPriority="71"/>
+    <w:lsdException w:name="Colorful List Accent 6" w:uiPriority="72"/>
+    <w:lsdException w:name="Colorful Grid Accent 6" w:uiPriority="73"/>
+    <w:lsdException w:name="Subtle Emphasis" w:uiPriority="19" w:qFormat="1"/>
+    <w:lsdException w:name="Intense Emphasis" w:uiPriority="21" w:qFormat="1"/>
+    <w:lsdException w:name="Subtle Reference" w:uiPriority="31" w:qFormat="1"/>
+    <w:lsdException w:name="Intense Reference" w:uiPriority="32" w:qFormat="1"/>
+    <w:lsdException w:name="Book Title" w:uiPriority="33" w:qFormat="1"/>
+    <w:lsdException w:name="Bibliography" w:semiHidden="1" w:uiPriority="37" w:unhideWhenUsed="1"/>
+    <w:lsdException w:name="TOC Heading" w:semiHidden="1" w:uiPriority="39" w:unhideWhenUsed="1" w:qFormat="1"/>
+    <w:lsdException w:name="Plain Table 1" w:uiPriority="41"/>
+    <w:lsdException w:name="Plain Table 2" w:uiPriority="42"/>
+    <w:lsdException w:name="Plain Table 3" w:uiPriority="43"/>
+    <w:lsdException w:name="Plain Table 4" w:uiPriority="44"/>
+    <w:lsdException w:name="Plain Table 5" w:uiPriority="45"/>
+    <w:lsdException w:name="Grid Table Light" w:uiPriority="40"/>
+    <w:lsdException w:name="Grid Table 1 Light" w:uiPriority="46"/>
+    <w:lsdException w:name="Grid Table 2" w:uiPriority="47"/>
+    <w:lsdException w:name="Grid Table 3" w:uiPriority="48"/>
+    <w:lsdException w:name="Grid Table 4" w:uiPriority="49"/>
+    <w:lsdException w:name="Grid Table 5 Dark" w:uiPriority="50"/>
+    <w:lsdException w:name="Grid Table 6 Colorful" w:uiPriority="51"/>
+    <w:lsdException w:name="Grid Table 7 Colorful" w:uiPriority="52"/>
+    <w:lsdException w:name="Grid Table 1 Light Accent 1" w:uiPriority="46"/>
+    <w:lsdException w:name="Grid Table 2 Accent 1" w:uiPriority="47"/>
+    <w:lsdException w:name="Grid Table 3 Accent 1" w:uiPriority="48"/>
+    <w:lsdException w:name="Grid Table 4 Accent 1" w:uiPriority="49"/>
+    <w:lsdException w:name="Grid Table 5 Dark Accent 1" w:uiPriority="50"/>
+    <w:lsdException w:name="Grid Table 6 Colorful Accent 1" w:uiPriority="51"/>
+    <w:lsdException w:name="Grid Table 7 Colorful Accent 1" w:uiPriority="52"/>
+    <w:lsdException w:name="Grid Table 1 Light Accent 2" w:uiPriority="46"/>
+    <w:lsdException w:name="Grid Table 2 Accent 2" w:uiPriority="47"/>
+    <w:lsdException w:name="Grid Table 3 Accent 2" w:uiPriority="48"/>
+    <w:lsdException w:name="Grid Table 4 Accent 2" w:uiPriority="49"/>
+    <w:lsdException w:name="Grid Table 5 Dark Accent 2" w:uiPriority="50"/>
+    <w:lsdException w:name="Grid Table 6 Colorful Accent 2" w:uiPriority="51"/>
+    <w:lsdException w:name="Grid Table 7 Colorful Accent 2" w:uiPriority="52"/>
+    <w:lsdException w:name="Grid Table 1 Light Accent 3" w:uiPriority="46"/>
+    <w:lsdException w:name="Grid Table 2 Accent 3" w:uiPriority="47"/>
+    <w:lsdException w:name="Grid Table 3 Accent 3" w:uiPriority="48"/>
+    <w:lsdException w:name="Grid Table 4 Accent 3" w:uiPriority="49"/>
+    <w:lsdException w:name="Grid Table 5 Dark Accent 3" w:uiPriority="50"/>
+    <w:lsdException w:name="Grid Table 6 Colorful Accent 3" w:uiPriority="51"/>
+    <w:lsdException w:name="Grid Table 7 Colorful Accent 3" w:uiPriority="52"/>
+    <w:lsdException w:name="Grid Table 1 Light Accent 4" w:uiPriority="46"/>
+    <w:lsdException w:name="Grid Table 2 Accent 4" w:uiPriority="47"/>
+    <w:lsdException w:name="Grid Table 3 Accent 4" w:uiPriority="48"/>
+    <w:lsdException w:name="Grid Table 4 Accent 4" w:uiPriority="49"/>
+    <w:lsdException w:name="Grid Table 5 Dark Accent 4" w:uiPriority="50"/>
+    <w:lsdException w:name="Grid Table 6 Colorful Accent 4" w:uiPriority="51"/>
+    <w:lsdException w:name="Grid Table 7 Colorful Accent 4" w:uiPriority="52"/>
+    <w:lsdException w:name="Grid Table 1 Light Accent 5" w:uiPriority="46"/>
+    <w:lsdException w:name="Grid Table 2 Accent 5" w:uiPriority="47"/>
+    <w:lsdException w:name="Grid Table 3 Accent 5" w:uiPriority="48"/>
+    <w:lsdException w:name="Grid Table 4 Accent 5" w:uiPriority="49"/>
+    <w:lsdException w:name="Grid Table 5 Dark Accent 5" w:uiPriority="50"/>
+    <w:lsdException w:name="Grid Table 6 Colorful Accent 5" w:uiPriority="51"/>
+    <w:lsdException w:name="Grid Table 7 Colorful Accent 5" w:uiPriority="52"/>
+    <w:lsdException w:name="Grid Table 1 Light Accent 6" w:uiPriority="46"/>
+    <w:lsdException w:name="Grid Table 2 Accent 6" w:uiPriority="47"/>
+    <w:lsdException w:name="Grid Table 3 Accent 6" w:uiPriority="48"/>
+    <w:lsdException w:name="Grid Table 4 Accent 6" w:uiPriority="49"/>
+    <w:lsdException w:name="Grid Table 5 Dark Accent 6" w:uiPriority="50"/>
+    <w:lsdException w:name="Grid Table 6 Colorful Accent 6" w:uiPriority="51"/>
+    <w:lsdException w:name="Grid Table 7 Colorful Accent 6" w:uiPriority="52"/>
+    <w:lsdException w:name="List Table 1 Light" w:uiPriority="46"/>
+    <w:lsdException w:name="List Table 2" w:uiPriority="47"/>
+    <w:lsdException w:name="List Table 3" w:uiPriority="48"/>
+    <w:lsdException w:name="List Table 4" w:uiPriority="49"/>
+    <w:lsdException w:name="List Table 5 Dark" w:uiPriority="50"/>
+    <w:lsdException w:name="List Table 6 Colorful" w:uiPriority="51"/>
+    <w:lsdException w:name="List Table 7 Colorful" w:uiPriority="52"/>
+    <w:lsdException w:name="List Table 1 Light Accent 1" w:uiPriority="46"/>
+    <w:lsdException w:name="List Table 2 Accent 1" w:uiPriority="47"/>
+    <w:lsdException w:name="List Table 3 Accent 1" w:uiPriority="48"/>
+    <w:lsdException w:name="List Table 4 Accent 1" w:uiPriority="49"/>
+    <w:lsdException w:name="List Table 5 Dark Accent 1" w:uiPriority="50"/>
+    <w:lsdException w:name="List Table 6 Colorful Accent 1" w:uiPriority="51"/>
+    <w:lsdException w:name="List Table 7 Colorful Accent 1" w:uiPriority="52"/>
+    <w:lsdException w:name="List Table 1 Light Accent 2" w:uiPriority="46"/>
+    <w:lsdException w:name="List Table 2 Accent 2" w:uiPriority="47"/>
+    <w:lsdException w:name="List Table 3 Accent 2" w:uiPriority="48"/>
+    <w:lsdException w:name="List Table 4 Accent 2" w:uiPriority="49"/>
+    <w:lsdException w:name="List Table 5 Dark Accent 2" w:uiPriority="50"/>
+    <w:lsdException w:name="List Table 6 Colorful Accent 2" w:uiPriority="51"/>
+    <w:lsdException w:name="List Table 7 Colorful Accent 2" w:uiPriority="52"/>
+    <w:lsdException w:name="List Table 1 Light Accent 3" w:uiPriority="46"/>
+    <w:lsdException w:name="List Table 2 Accent 3" w:uiPriority="47"/>
+    <w:lsdException w:name="List Table 3 Accent 3" w:uiPriority="48"/>
+    <w:lsdException w:name="List Table 4 Accent 3" w:uiPriority="49"/>
+    <w:lsdException w:name="List Table 5 Dark Accent 3" w:uiPriority="50"/>
+    <w:lsdException w:name="List Table 6 Colorful Accent 3" w:uiPriority="51"/>
+    <w:lsdException w:name="List Table 7 Colorful Accent 3" w:uiPriority="52"/>
+    <w:lsdException w:name="List Table 1 Light Accent 4" w:uiPriority="46"/>
+    <w:lsdException w:name="List Table 2 Accent 4" w:uiPriority="47"/>
+    <w:lsdException w:name="List Table 3 Accent 4" w:uiPriority="48"/>
+    <w:lsdException w:name="List Table 4 Accent 4" w:uiPriority="49"/>
+    <w:lsdException w:name="List Table 5 Dark Accent 4" w:uiPriority="50"/>
+    <w:lsdException w:name="List Table 6 Colorful Accent 4" w:uiPriority="51"/>
+    <w:lsdException w:name="List Table 7 Colorful Accent 4" w:uiPriority="52"/>
+    <w:lsdException w:name="List Table 1 Light Accent 5" w:uiPriority="46"/>
+    <w:lsdException w:name="List Table 2 Accent 5" w:uiPriority="47"/>
+    <w:lsdException w:name="List Table 3 Accent 5" w:uiPriority="48"/>
+    <w:lsdException w:name="List Table 4 Accent 5" w:uiPriority="49"/>
+    <w:lsdException w:name="List Table 5 Dark Accent 5" w:uiPriority="50"/>
+    <w:lsdException w:name="List Table 6 Colorful Accent 5" w:uiPriority="51"/>
+    <w:lsdException w:name="List Table 7 Colorful Accent 5" w:uiPriority="52"/>
+    <w:lsdException w:name="List Table 1 Light Accent 6" w:uiPriority="46"/>
+    <w:lsdException w:name="List Table 2 Accent 6" w:uiPriority="47"/>
+    <w:lsdException w:name="List Table 3 Accent 6" w:uiPriority="48"/>
+    <w:lsdException w:name="List Table 4 Accent 6" w:uiPriority="49"/>
+    <w:lsdException w:name="List Table 5 Dark Accent 6" w:uiPriority="50"/>
+    <w:lsdException w:name="List Table 6 Colorful Accent 6" w:uiPriority="51"/>
+    <w:lsdException w:name="List Table 7 Colorful Accent 6" w:uiPriority="52"/>
+    <w:lsdException w:name="Mention" w:semiHidden="1" w:unhideWhenUsed="1"/>
+    <w:lsdException w:name="Smart Hyperlink" w:semiHidden="1" w:unhideWhenUsed="1"/>
+    <w:lsdException w:name="Hashtag" w:semiHidden="1" w:unhideWhenUsed="1"/>
+    <w:lsdException w:name="Unresolved Mention" w:semiHidden="1" w:unhideWhenUsed="1"/>
+    <w:lsdException w:name="Smart Link" w:semiHidden="1" w:unhideWhenUsed="1"/>
+  </w:latentStyles>
   <w:style w:type="paragraph" w:default="1" w:styleId="Normal">
     <w:name w:val="Normal"/>
     <w:qFormat/>
@@ -2624,7 +4256,7 @@
       <w:keepNext/>
       <w:keepLines/>
       <w:pageBreakBefore/>
-      <w:spacing w:before="0" w:after="240"/>
+      <w:spacing w:after="240"/>
       <w:outlineLvl w:val="0"/>
     </w:pPr>
     <w:rPr>
@@ -2659,19 +4291,18 @@
     <w:basedOn w:val="Normal"/>
     <w:next w:val="Normal"/>
     <w:uiPriority w:val="9"/>
+    <w:semiHidden/>
     <w:unhideWhenUsed/>
     <w:qFormat/>
     <w:pPr>
       <w:keepNext/>
       <w:keepLines/>
-      <w:spacing w:before="280" w:after="120"/>
+      <w:spacing w:before="280"/>
       <w:outlineLvl w:val="2"/>
     </w:pPr>
     <w:rPr>
       <w:b/>
       <w:bCs/>
-      <w:sz w:val="24"/>
-      <w:szCs w:val="24"/>
     </w:rPr>
   </w:style>
   <w:style w:type="paragraph" w:styleId="Heading4">
@@ -2679,6 +4310,7 @@
     <w:basedOn w:val="Normal"/>
     <w:next w:val="Normal"/>
     <w:uiPriority w:val="9"/>
+    <w:semiHidden/>
     <w:unhideWhenUsed/>
     <w:qFormat/>
     <w:pPr>
@@ -2692,9 +4324,12 @@
       <w:bCs/>
       <w:i/>
       <w:iCs/>
-      <w:sz w:val="24"/>
-      <w:szCs w:val="24"/>
     </w:rPr>
+  </w:style>
+  <w:style w:type="character" w:default="1" w:styleId="DefaultParagraphFont">
+    <w:name w:val="Default Paragraph Font"/>
+    <w:uiPriority w:val="1"/>
+    <w:unhideWhenUsed/>
   </w:style>
   <w:style w:type="table" w:default="1" w:styleId="TableNormal">
     <w:name w:val="Normal Table"/>
@@ -2711,6 +4346,12 @@
       </w:tblCellMar>
     </w:tblPr>
   </w:style>
+  <w:style w:type="numbering" w:default="1" w:styleId="NoList">
+    <w:name w:val="No List"/>
+    <w:uiPriority w:val="99"/>
+    <w:semiHidden/>
+    <w:unhideWhenUsed/>
+  </w:style>
   <w:style w:type="table" w:styleId="TableGrid">
     <w:name w:val="Table Grid"/>
     <w:basedOn w:val="TableNormal"/>
@@ -2726,5 +4367,362 @@
       </w:tblBorders>
     </w:tblPr>
   </w:style>
+  <w:style w:type="paragraph" w:styleId="NormalWeb">
+    <w:name w:val="Normal (Web)"/>
+    <w:basedOn w:val="Normal"/>
+    <w:uiPriority w:val="99"/>
+    <w:semiHidden/>
+    <w:unhideWhenUsed/>
+    <w:rsid w:val="00826DDE"/>
+  </w:style>
+  <w:style w:type="paragraph" w:styleId="ListParagraph">
+    <w:name w:val="List Paragraph"/>
+    <w:basedOn w:val="Normal"/>
+    <w:uiPriority w:val="34"/>
+    <w:qFormat/>
+    <w:rsid w:val="00826DDE"/>
+    <w:pPr>
+      <w:ind w:left="720"/>
+      <w:contextualSpacing/>
+    </w:pPr>
+  </w:style>
+  <w:style w:type="character" w:styleId="Hyperlink">
+    <w:name w:val="Hyperlink"/>
+    <w:basedOn w:val="DefaultParagraphFont"/>
+    <w:uiPriority w:val="99"/>
+    <w:unhideWhenUsed/>
+    <w:rsid w:val="00826DDE"/>
+    <w:rPr>
+      <w:color w:val="467886" w:themeColor="hyperlink"/>
+      <w:u w:val="single"/>
+    </w:rPr>
+  </w:style>
+  <w:style w:type="character" w:styleId="UnresolvedMention">
+    <w:name w:val="Unresolved Mention"/>
+    <w:basedOn w:val="DefaultParagraphFont"/>
+    <w:uiPriority w:val="99"/>
+    <w:semiHidden/>
+    <w:unhideWhenUsed/>
+    <w:rsid w:val="00826DDE"/>
+    <w:rPr>
+      <w:color w:val="605E5C"/>
+      <w:shd w:val="clear" w:color="auto" w:fill="E1DFDD"/>
+    </w:rPr>
+  </w:style>
 </w:styles>
+</file>
+
+<file path=word/theme/theme1.xml><?xml version="1.0" encoding="utf-8"?>
+<a:theme xmlns:a="http://schemas.openxmlformats.org/drawingml/2006/main" name="Office Theme">
+  <a:themeElements>
+    <a:clrScheme name="Office">
+      <a:dk1>
+        <a:sysClr val="windowText" lastClr="000000"/>
+      </a:dk1>
+      <a:lt1>
+        <a:sysClr val="window" lastClr="FFFFFF"/>
+      </a:lt1>
+      <a:dk2>
+        <a:srgbClr val="0E2841"/>
+      </a:dk2>
+      <a:lt2>
+        <a:srgbClr val="E8E8E8"/>
+      </a:lt2>
+      <a:accent1>
+        <a:srgbClr val="156082"/>
+      </a:accent1>
+      <a:accent2>
+        <a:srgbClr val="E97132"/>
+      </a:accent2>
+      <a:accent3>
+        <a:srgbClr val="196B24"/>
+      </a:accent3>
+      <a:accent4>
+        <a:srgbClr val="0F9ED5"/>
+      </a:accent4>
+      <a:accent5>
+        <a:srgbClr val="A02B93"/>
+      </a:accent5>
+      <a:accent6>
+        <a:srgbClr val="4EA72E"/>
+      </a:accent6>
+      <a:hlink>
+        <a:srgbClr val="467886"/>
+      </a:hlink>
+      <a:folHlink>
+        <a:srgbClr val="96607D"/>
+      </a:folHlink>
+    </a:clrScheme>
+    <a:fontScheme name="Office">
+      <a:majorFont>
+        <a:latin typeface="Aptos Display" panose="02110004020202020204"/>
+        <a:ea typeface=""/>
+        <a:cs typeface=""/>
+        <a:font script="Jpan" typeface="游ゴシック Light"/>
+        <a:font script="Hang" typeface="맑은 고딕"/>
+        <a:font script="Hans" typeface="等线 Light"/>
+        <a:font script="Hant" typeface="新細明體"/>
+        <a:font script="Arab" typeface="Times New Roman"/>
+        <a:font script="Hebr" typeface="Times New Roman"/>
+        <a:font script="Thai" typeface="Angsana New"/>
+        <a:font script="Ethi" typeface="Nyala"/>
+        <a:font script="Beng" typeface="Vrinda"/>
+        <a:font script="Gujr" typeface="Shruti"/>
+        <a:font script="Khmr" typeface="MoolBoran"/>
+        <a:font script="Knda" typeface="Tunga"/>
+        <a:font script="Guru" typeface="Raavi"/>
+        <a:font script="Cans" typeface="Euphemia"/>
+        <a:font script="Cher" typeface="Plantagenet Cherokee"/>
+        <a:font script="Yiii" typeface="Microsoft Yi Baiti"/>
+        <a:font script="Tibt" typeface="Microsoft Himalaya"/>
+        <a:font script="Thaa" typeface="MV Boli"/>
+        <a:font script="Deva" typeface="Mangal"/>
+        <a:font script="Telu" typeface="Gautami"/>
+        <a:font script="Taml" typeface="Latha"/>
+        <a:font script="Syrc" typeface="Estrangelo Edessa"/>
+        <a:font script="Orya" typeface="Kalinga"/>
+        <a:font script="Mlym" typeface="Kartika"/>
+        <a:font script="Laoo" typeface="DokChampa"/>
+        <a:font script="Sinh" typeface="Iskoola Pota"/>
+        <a:font script="Mong" typeface="Mongolian Baiti"/>
+        <a:font script="Viet" typeface="Times New Roman"/>
+        <a:font script="Uigh" typeface="Microsoft Uighur"/>
+        <a:font script="Geor" typeface="Sylfaen"/>
+        <a:font script="Armn" typeface="Arial"/>
+        <a:font script="Bugi" typeface="Leelawadee UI"/>
+        <a:font script="Bopo" typeface="Microsoft JhengHei"/>
+        <a:font script="Java" typeface="Javanese Text"/>
+        <a:font script="Lisu" typeface="Segoe UI"/>
+        <a:font script="Mymr" typeface="Myanmar Text"/>
+        <a:font script="Nkoo" typeface="Ebrima"/>
+        <a:font script="Olck" typeface="Nirmala UI"/>
+        <a:font script="Osma" typeface="Ebrima"/>
+        <a:font script="Phag" typeface="Phagspa"/>
+        <a:font script="Syrn" typeface="Estrangelo Edessa"/>
+        <a:font script="Syrj" typeface="Estrangelo Edessa"/>
+        <a:font script="Syre" typeface="Estrangelo Edessa"/>
+        <a:font script="Sora" typeface="Nirmala UI"/>
+        <a:font script="Tale" typeface="Microsoft Tai Le"/>
+        <a:font script="Talu" typeface="Microsoft New Tai Lue"/>
+        <a:font script="Tfng" typeface="Ebrima"/>
+      </a:majorFont>
+      <a:minorFont>
+        <a:latin typeface="Aptos" panose="02110004020202020204"/>
+        <a:ea typeface=""/>
+        <a:cs typeface=""/>
+        <a:font script="Jpan" typeface="游明朝"/>
+        <a:font script="Hang" typeface="맑은 고딕"/>
+        <a:font script="Hans" typeface="等线"/>
+        <a:font script="Hant" typeface="新細明體"/>
+        <a:font script="Arab" typeface="Arial"/>
+        <a:font script="Hebr" typeface="Arial"/>
+        <a:font script="Thai" typeface="Cordia New"/>
+        <a:font script="Ethi" typeface="Nyala"/>
+        <a:font script="Beng" typeface="Vrinda"/>
+        <a:font script="Gujr" typeface="Shruti"/>
+        <a:font script="Khmr" typeface="DaunPenh"/>
+        <a:font script="Knda" typeface="Tunga"/>
+        <a:font script="Guru" typeface="Raavi"/>
+        <a:font script="Cans" typeface="Euphemia"/>
+        <a:font script="Cher" typeface="Plantagenet Cherokee"/>
+        <a:font script="Yiii" typeface="Microsoft Yi Baiti"/>
+        <a:font script="Tibt" typeface="Microsoft Himalaya"/>
+        <a:font script="Thaa" typeface="MV Boli"/>
+        <a:font script="Deva" typeface="Mangal"/>
+        <a:font script="Telu" typeface="Gautami"/>
+        <a:font script="Taml" typeface="Latha"/>
+        <a:font script="Syrc" typeface="Estrangelo Edessa"/>
+        <a:font script="Orya" typeface="Kalinga"/>
+        <a:font script="Mlym" typeface="Kartika"/>
+        <a:font script="Laoo" typeface="DokChampa"/>
+        <a:font script="Sinh" typeface="Iskoola Pota"/>
+        <a:font script="Mong" typeface="Mongolian Baiti"/>
+        <a:font script="Viet" typeface="Arial"/>
+        <a:font script="Uigh" typeface="Microsoft Uighur"/>
+        <a:font script="Geor" typeface="Sylfaen"/>
+        <a:font script="Armn" typeface="Arial"/>
+        <a:font script="Bugi" typeface="Leelawadee UI"/>
+        <a:font script="Bopo" typeface="Microsoft JhengHei"/>
+        <a:font script="Java" typeface="Javanese Text"/>
+        <a:font script="Lisu" typeface="Segoe UI"/>
+        <a:font script="Mymr" typeface="Myanmar Text"/>
+        <a:font script="Nkoo" typeface="Ebrima"/>
+        <a:font script="Olck" typeface="Nirmala UI"/>
+        <a:font script="Osma" typeface="Ebrima"/>
+        <a:font script="Phag" typeface="Phagspa"/>
+        <a:font script="Syrn" typeface="Estrangelo Edessa"/>
+        <a:font script="Syrj" typeface="Estrangelo Edessa"/>
+        <a:font script="Syre" typeface="Estrangelo Edessa"/>
+        <a:font script="Sora" typeface="Nirmala UI"/>
+        <a:font script="Tale" typeface="Microsoft Tai Le"/>
+        <a:font script="Talu" typeface="Microsoft New Tai Lue"/>
+        <a:font script="Tfng" typeface="Ebrima"/>
+      </a:minorFont>
+    </a:fontScheme>
+    <a:fmtScheme name="Office">
+      <a:fillStyleLst>
+        <a:solidFill>
+          <a:schemeClr val="phClr"/>
+        </a:solidFill>
+        <a:gradFill rotWithShape="1">
+          <a:gsLst>
+            <a:gs pos="0">
+              <a:schemeClr val="phClr">
+                <a:lumMod val="110000"/>
+                <a:satMod val="105000"/>
+                <a:tint val="67000"/>
+              </a:schemeClr>
+            </a:gs>
+            <a:gs pos="50000">
+              <a:schemeClr val="phClr">
+                <a:lumMod val="105000"/>
+                <a:satMod val="103000"/>
+                <a:tint val="73000"/>
+              </a:schemeClr>
+            </a:gs>
+            <a:gs pos="100000">
+              <a:schemeClr val="phClr">
+                <a:lumMod val="105000"/>
+                <a:satMod val="109000"/>
+                <a:tint val="81000"/>
+              </a:schemeClr>
+            </a:gs>
+          </a:gsLst>
+          <a:lin ang="5400000" scaled="0"/>
+        </a:gradFill>
+        <a:gradFill rotWithShape="1">
+          <a:gsLst>
+            <a:gs pos="0">
+              <a:schemeClr val="phClr">
+                <a:satMod val="103000"/>
+                <a:lumMod val="102000"/>
+                <a:tint val="94000"/>
+              </a:schemeClr>
+            </a:gs>
+            <a:gs pos="50000">
+              <a:schemeClr val="phClr">
+                <a:satMod val="110000"/>
+                <a:lumMod val="100000"/>
+                <a:shade val="100000"/>
+              </a:schemeClr>
+            </a:gs>
+            <a:gs pos="100000">
+              <a:schemeClr val="phClr">
+                <a:lumMod val="99000"/>
+                <a:satMod val="120000"/>
+                <a:shade val="78000"/>
+              </a:schemeClr>
+            </a:gs>
+          </a:gsLst>
+          <a:lin ang="5400000" scaled="0"/>
+        </a:gradFill>
+      </a:fillStyleLst>
+      <a:lnStyleLst>
+        <a:ln w="12700" cap="flat" cmpd="sng" algn="ctr">
+          <a:solidFill>
+            <a:schemeClr val="phClr"/>
+          </a:solidFill>
+          <a:prstDash val="solid"/>
+          <a:miter lim="800000"/>
+        </a:ln>
+        <a:ln w="19050" cap="flat" cmpd="sng" algn="ctr">
+          <a:solidFill>
+            <a:schemeClr val="phClr"/>
+          </a:solidFill>
+          <a:prstDash val="solid"/>
+          <a:miter lim="800000"/>
+        </a:ln>
+        <a:ln w="25400" cap="flat" cmpd="sng" algn="ctr">
+          <a:solidFill>
+            <a:schemeClr val="phClr"/>
+          </a:solidFill>
+          <a:prstDash val="solid"/>
+          <a:miter lim="800000"/>
+        </a:ln>
+      </a:lnStyleLst>
+      <a:effectStyleLst>
+        <a:effectStyle>
+          <a:effectLst/>
+        </a:effectStyle>
+        <a:effectStyle>
+          <a:effectLst/>
+        </a:effectStyle>
+        <a:effectStyle>
+          <a:effectLst>
+            <a:outerShdw blurRad="57150" dist="19050" dir="5400000" algn="ctr" rotWithShape="0">
+              <a:srgbClr val="000000">
+                <a:alpha val="63000"/>
+              </a:srgbClr>
+            </a:outerShdw>
+          </a:effectLst>
+        </a:effectStyle>
+      </a:effectStyleLst>
+      <a:bgFillStyleLst>
+        <a:solidFill>
+          <a:schemeClr val="phClr"/>
+        </a:solidFill>
+        <a:solidFill>
+          <a:schemeClr val="phClr">
+            <a:tint val="95000"/>
+            <a:satMod val="170000"/>
+          </a:schemeClr>
+        </a:solidFill>
+        <a:gradFill rotWithShape="1">
+          <a:gsLst>
+            <a:gs pos="0">
+              <a:schemeClr val="phClr">
+                <a:tint val="93000"/>
+                <a:satMod val="150000"/>
+                <a:shade val="98000"/>
+                <a:lumMod val="102000"/>
+              </a:schemeClr>
+            </a:gs>
+            <a:gs pos="50000">
+              <a:schemeClr val="phClr">
+                <a:tint val="98000"/>
+                <a:satMod val="130000"/>
+                <a:shade val="90000"/>
+                <a:lumMod val="103000"/>
+              </a:schemeClr>
+            </a:gs>
+            <a:gs pos="100000">
+              <a:schemeClr val="phClr">
+                <a:shade val="63000"/>
+                <a:satMod val="120000"/>
+              </a:schemeClr>
+            </a:gs>
+          </a:gsLst>
+          <a:lin ang="5400000" scaled="0"/>
+        </a:gradFill>
+      </a:bgFillStyleLst>
+    </a:fmtScheme>
+  </a:themeElements>
+  <a:objectDefaults>
+    <a:lnDef>
+      <a:spPr/>
+      <a:bodyPr/>
+      <a:lstStyle/>
+      <a:style>
+        <a:lnRef idx="2">
+          <a:schemeClr val="accent1"/>
+        </a:lnRef>
+        <a:fillRef idx="0">
+          <a:schemeClr val="accent1"/>
+        </a:fillRef>
+        <a:effectRef idx="1">
+          <a:schemeClr val="accent1"/>
+        </a:effectRef>
+        <a:fontRef idx="minor">
+          <a:schemeClr val="tx1"/>
+        </a:fontRef>
+      </a:style>
+    </a:lnDef>
+  </a:objectDefaults>
+  <a:extraClrSchemeLst/>
+  <a:extLst>
+    <a:ext uri="{05A4C25C-085E-4340-85A3-A5531E510DB2}">
+      <thm15:themeFamily xmlns:thm15="http://schemas.microsoft.com/office/thememl/2012/main" name="Office Theme" id="{2E142A2C-CD16-42D6-873A-C26D2A0506FA}" vid="{1BDDFF52-6CD6-40A5-AB3C-68EB2F1E4D0A}"/>
+    </a:ext>
+  </a:extLst>
+</a:theme>
 </file>
</xml_diff>